<commit_message>
docu descripcion de tecnologias
</commit_message>
<xml_diff>
--- a/docu/DocumentacionProyecto_BrunoOrtizBlanco.docx
+++ b/docu/DocumentacionProyecto_BrunoOrtizBlanco.docx
@@ -1154,7 +1154,7 @@
           <w:lang w:eastAsia="es-VE"/>
         </w:rPr>
         <w:drawing>
-          <wp:inline distT="0" distB="0" distL="0" distR="0" wp14:anchorId="7F7E7601" wp14:editId="64900264">
+          <wp:inline distT="0" distB="0" distL="0" distR="0" wp14:anchorId="7F7E7601" wp14:editId="15642687">
             <wp:extent cx="7556500" cy="10599420"/>
             <wp:effectExtent l="0" t="0" r="6350" b="0"/>
             <wp:docPr id="2" name="Imagen 2" descr="D:\servicios forobeta posts\diseño grafico\CLIENTES\Feelmusic - 05.11.18\archivos\11\11.jpg"/>
@@ -4270,7 +4270,7 @@
             <w:rStyle w:val="Hipervnculo"/>
             <w:noProof/>
           </w:rPr>
-          <w:t>Figura 1. Imagen01 no disponible</w:t>
+          <w:t>Figura 1</w:t>
         </w:r>
         <w:r>
           <w:rPr>
@@ -4342,7 +4342,7 @@
             <w:rStyle w:val="Hipervnculo"/>
             <w:noProof/>
           </w:rPr>
-          <w:t>Figura 2. Imagen02 no disponible</w:t>
+          <w:t>Figura 2</w:t>
         </w:r>
         <w:r>
           <w:rPr>
@@ -4414,7 +4414,7 @@
             <w:rStyle w:val="Hipervnculo"/>
             <w:noProof/>
           </w:rPr>
-          <w:t>Figura 3. Imagen03 no disponible</w:t>
+          <w:t>Figura 3</w:t>
         </w:r>
         <w:r>
           <w:rPr>
@@ -4531,9 +4531,9 @@
       </w:r>
     </w:p>
     <w:p>
-      <w:pPr>
-        <w:jc w:val="both"/>
-      </w:pPr>
+      <w:r>
+        <w:br w:type="page"/>
+      </w:r>
     </w:p>
     <w:p>
       <w:pPr>
@@ -4545,6 +4545,7 @@
       </w:pPr>
       <w:bookmarkStart w:id="1" w:name="_Toc210125367"/>
       <w:r>
+        <w:lastRenderedPageBreak/>
         <w:t>OBJETIVOS DEL PROYECTO</w:t>
       </w:r>
       <w:bookmarkEnd w:id="1"/>
@@ -4656,6 +4657,11 @@
     </w:p>
     <w:p>
       <w:pPr>
+        <w:jc w:val="both"/>
+      </w:pPr>
+    </w:p>
+    <w:p>
+      <w:pPr>
         <w:pStyle w:val="Ttulo2"/>
         <w:numPr>
           <w:ilvl w:val="1"/>
@@ -4665,17 +4671,81 @@
       <w:bookmarkStart w:id="4" w:name="_Toc210125369"/>
       <w:bookmarkEnd w:id="3"/>
       <w:r>
+        <w:t>OBJETIVOS ESPECÍFICOS</w:t>
+      </w:r>
+      <w:bookmarkEnd w:id="4"/>
+    </w:p>
+    <w:p>
+      <w:pPr>
+        <w:jc w:val="both"/>
+      </w:pPr>
+      <w:r>
+        <w:t>Para lograr el objetivo general, se planean los siguientes objetivos específicos:</w:t>
+      </w:r>
+    </w:p>
+    <w:p>
+      <w:pPr>
+        <w:jc w:val="both"/>
+      </w:pPr>
+      <w:r>
+        <w:t>1.Diseñar la estructura general del aplicativo</w:t>
+      </w:r>
+    </w:p>
+    <w:p>
+      <w:pPr>
+        <w:jc w:val="both"/>
+      </w:pPr>
+      <w:r>
+        <w:t>2.Implementar un sistema de autenticación de usuarios</w:t>
+      </w:r>
+    </w:p>
+    <w:p>
+      <w:pPr>
+        <w:jc w:val="both"/>
+      </w:pPr>
+      <w:r>
+        <w:t>3.Desarrollar las funcionalidades básicas de gestión</w:t>
+      </w:r>
+    </w:p>
+    <w:p>
+      <w:pPr>
+        <w:jc w:val="both"/>
+      </w:pPr>
+      <w:r>
+        <w:t>4.Incorporar un sistema de almacenamiento y gestión de documentos</w:t>
+      </w:r>
+    </w:p>
+    <w:p>
+      <w:pPr>
+        <w:jc w:val="both"/>
+      </w:pPr>
+      <w:r>
+        <w:t>5.Diseñar interfaces graficas intuitivas y funcionales</w:t>
+      </w:r>
+    </w:p>
+    <w:p>
+      <w:pPr>
+        <w:jc w:val="both"/>
+      </w:pPr>
+      <w:r>
+        <w:t>6.Integrar un conjunto de funcionalidades adicionales propias</w:t>
+      </w:r>
+    </w:p>
+    <w:p>
+      <w:pPr>
+        <w:jc w:val="both"/>
+      </w:pPr>
+      <w:r>
         <w:lastRenderedPageBreak/>
-        <w:t>OBJETIVOS ESPECÍFICOS</w:t>
-      </w:r>
-      <w:bookmarkEnd w:id="4"/>
+        <w:t>7.Aplicar metodologías de desarrollo adecuadas</w:t>
+      </w:r>
     </w:p>
     <w:p>
       <w:pPr>
         <w:jc w:val="both"/>
       </w:pPr>
       <w:r>
-        <w:t>Para lograr el objetivo general, se planean los siguientes objetivos específicos:</w:t>
+        <w:t>8.Elaborar toda la documentación del proyecto</w:t>
       </w:r>
     </w:p>
     <w:p>
@@ -4683,66 +4753,14 @@
         <w:jc w:val="both"/>
       </w:pPr>
       <w:r>
-        <w:t>1.Diseñar la estructura general del aplicativo</w:t>
-      </w:r>
-    </w:p>
-    <w:p>
-      <w:pPr>
-        <w:jc w:val="both"/>
-      </w:pPr>
-      <w:r>
-        <w:t>2.Implementar un sistema de autenticación de usuarios</w:t>
-      </w:r>
-    </w:p>
-    <w:p>
-      <w:pPr>
-        <w:jc w:val="both"/>
-      </w:pPr>
-      <w:r>
-        <w:t>3.Desarrollar las funcionalidades básicas de gestión</w:t>
-      </w:r>
-    </w:p>
-    <w:p>
-      <w:pPr>
-        <w:jc w:val="both"/>
-      </w:pPr>
-      <w:r>
-        <w:t>4.Incorporar un sistema de almacenamiento y gestión de documentos</w:t>
-      </w:r>
-    </w:p>
-    <w:p>
-      <w:pPr>
-        <w:jc w:val="both"/>
-      </w:pPr>
-      <w:r>
-        <w:t>5.Diseñar interfaces graficas intuitivas y funcionales</w:t>
-      </w:r>
-    </w:p>
-    <w:p>
-      <w:pPr>
-        <w:jc w:val="both"/>
-      </w:pPr>
-      <w:r>
-        <w:t>6.Integrar un conjunto de funcionalidades adicionales propias</w:t>
-      </w:r>
-    </w:p>
-    <w:p>
-      <w:pPr>
-        <w:jc w:val="both"/>
-      </w:pPr>
-      <w:r>
-        <w:t>7.Aplicar metodologías de desarrollo adecuadas</w:t>
-      </w:r>
-    </w:p>
-    <w:p>
-      <w:pPr>
-        <w:jc w:val="both"/>
-      </w:pPr>
-      <w:r>
-        <w:t>8.Elaborar toda la documentación del proyecto</w:t>
-      </w:r>
-    </w:p>
-    <w:p/>
+        <w:t>9.Adaptar una parte del aplicativo para móviles.</w:t>
+      </w:r>
+    </w:p>
+    <w:p>
+      <w:r>
+        <w:br w:type="page"/>
+      </w:r>
+    </w:p>
     <w:p>
       <w:pPr>
         <w:pStyle w:val="Ttulo2"/>
@@ -4753,6 +4771,7 @@
       </w:pPr>
       <w:bookmarkStart w:id="5" w:name="_Toc210125370"/>
       <w:r>
+        <w:lastRenderedPageBreak/>
         <w:t>ANÁLISIS Y DISEÑO</w:t>
       </w:r>
       <w:bookmarkEnd w:id="5"/>
@@ -4780,6 +4799,11 @@
       <w:r>
         <w:t>Posteriormente, en la fase de diseño, se definen los modelos de datos que servirán de base para la estructura de la aplicación, incluyendo los diagramas entidad-relación y de clases, donde se muestran las entidades, sus atributos y la relaciones entre ellas. Finalmente, se presentan las interfaces graficas de usuarios, junto con su mapa de navegabilidad, que refleja como el usuario interactúa con el sistema y como se organiza la navegación entre las diferentes vistas.</w:t>
       </w:r>
+    </w:p>
+    <w:p>
+      <w:pPr>
+        <w:jc w:val="both"/>
+      </w:pPr>
     </w:p>
     <w:p>
       <w:pPr>
@@ -4998,7 +5022,6 @@
           </w:tcPr>
           <w:p>
             <w:r>
-              <w:lastRenderedPageBreak/>
               <w:t>RF4</w:t>
             </w:r>
           </w:p>
@@ -5245,6 +5268,7 @@
           </w:tcPr>
           <w:p>
             <w:r>
+              <w:lastRenderedPageBreak/>
               <w:t>RF10</w:t>
             </w:r>
           </w:p>
@@ -5618,8 +5642,12 @@
         <w:jc w:val="both"/>
       </w:pPr>
       <w:r>
-        <w:lastRenderedPageBreak/>
         <w:t>Cada caso de uso describe una unidad de comportamiento observable, es decir, una acción o conjunto de acciones que el sistema realiza en respuesta a una solicitud de un actor externo. La representación grafica de los casos de uso, a través de un diagrama UML, facilita la compresión global del sistema y ayuda a establecer los límites entre las responsabilidades del sistema y las de los actores implicados.</w:t>
+      </w:r>
+    </w:p>
+    <w:p>
+      <w:r>
+        <w:br w:type="page"/>
       </w:r>
     </w:p>
     <w:p>
@@ -5632,11 +5660,11 @@
       </w:pPr>
       <w:bookmarkStart w:id="13" w:name="_Toc210125375"/>
       <w:r>
+        <w:lastRenderedPageBreak/>
         <w:t>DIAGRAMA DE CASOS DE USO</w:t>
       </w:r>
       <w:bookmarkEnd w:id="13"/>
     </w:p>
-    <w:p/>
     <w:p>
       <w:pPr>
         <w:keepNext/>
@@ -5729,6 +5757,26 @@
     </w:p>
     <w:p>
       <w:pPr>
+        <w:rPr>
+          <w:i/>
+          <w:iCs/>
+          <w:color w:val="0E2841" w:themeColor="text2"/>
+          <w:sz w:val="18"/>
+          <w:szCs w:val="18"/>
+        </w:rPr>
+      </w:pPr>
+      <w:r>
+        <w:br w:type="page"/>
+      </w:r>
+    </w:p>
+    <w:p>
+      <w:pPr>
+        <w:pStyle w:val="Descripcin"/>
+        <w:jc w:val="center"/>
+      </w:pPr>
+    </w:p>
+    <w:p>
+      <w:pPr>
         <w:pStyle w:val="Ttulo2"/>
         <w:numPr>
           <w:ilvl w:val="2"/>
@@ -5791,6 +5839,11 @@
     </w:p>
     <w:p>
       <w:pPr>
+        <w:jc w:val="both"/>
+      </w:pPr>
+    </w:p>
+    <w:p>
+      <w:pPr>
         <w:pStyle w:val="Ttulo2"/>
         <w:numPr>
           <w:ilvl w:val="2"/>
@@ -5799,7 +5852,6 @@
       </w:pPr>
       <w:bookmarkStart w:id="16" w:name="_Toc210125377"/>
       <w:r>
-        <w:lastRenderedPageBreak/>
         <w:t>DESCRIPCIÓN DE LOS CASOS DE USO</w:t>
       </w:r>
       <w:bookmarkEnd w:id="16"/>
@@ -5886,10 +5938,165 @@
       </w:pPr>
       <w:bookmarkStart w:id="17" w:name="_Toc210125378"/>
       <w:r>
-        <w:lastRenderedPageBreak/>
         <w:t>MODELOS DE DATOS</w:t>
       </w:r>
       <w:bookmarkEnd w:id="17"/>
+    </w:p>
+    <w:p>
+      <w:pPr>
+        <w:rPr>
+          <w:lang w:val="en-US"/>
+        </w:rPr>
+      </w:pPr>
+      <w:r>
+        <w:rPr>
+          <w:lang w:val="en-US"/>
+        </w:rPr>
+        <w:t xml:space="preserve">Lorem ipsum </w:t>
+      </w:r>
+      <w:proofErr w:type="spellStart"/>
+      <w:r>
+        <w:rPr>
+          <w:lang w:val="en-US"/>
+        </w:rPr>
+        <w:t>asñldflkasfdasfasdfasdfasf</w:t>
+      </w:r>
+      <w:proofErr w:type="spellEnd"/>
+      <w:r>
+        <w:rPr>
+          <w:lang w:val="en-US"/>
+        </w:rPr>
+        <w:t xml:space="preserve"> </w:t>
+      </w:r>
+      <w:proofErr w:type="spellStart"/>
+      <w:r>
+        <w:rPr>
+          <w:lang w:val="en-US"/>
+        </w:rPr>
+        <w:t>asf</w:t>
+      </w:r>
+      <w:proofErr w:type="spellEnd"/>
+      <w:r>
+        <w:rPr>
+          <w:lang w:val="en-US"/>
+        </w:rPr>
+        <w:t xml:space="preserve"> s</w:t>
+      </w:r>
+      <w:r>
+        <w:rPr>
+          <w:lang w:val="en-US"/>
+        </w:rPr>
+        <w:t xml:space="preserve"> </w:t>
+      </w:r>
+      <w:proofErr w:type="spellStart"/>
+      <w:r>
+        <w:rPr>
+          <w:lang w:val="en-US"/>
+        </w:rPr>
+        <w:t>asf</w:t>
+      </w:r>
+      <w:proofErr w:type="spellEnd"/>
+      <w:r>
+        <w:rPr>
+          <w:lang w:val="en-US"/>
+        </w:rPr>
+        <w:t xml:space="preserve"> </w:t>
+      </w:r>
+    </w:p>
+    <w:p>
+      <w:pPr>
+        <w:rPr>
+          <w:lang w:val="en-US"/>
+        </w:rPr>
+      </w:pPr>
+      <w:proofErr w:type="spellStart"/>
+      <w:r>
+        <w:rPr>
+          <w:lang w:val="en-US"/>
+        </w:rPr>
+        <w:t>Asdfasdfasdf</w:t>
+      </w:r>
+      <w:proofErr w:type="spellEnd"/>
+      <w:r>
+        <w:rPr>
+          <w:lang w:val="en-US"/>
+        </w:rPr>
+        <w:t xml:space="preserve"> </w:t>
+      </w:r>
+      <w:proofErr w:type="spellStart"/>
+      <w:r>
+        <w:rPr>
+          <w:lang w:val="en-US"/>
+        </w:rPr>
+        <w:t>asdf</w:t>
+      </w:r>
+      <w:proofErr w:type="spellEnd"/>
+      <w:r>
+        <w:rPr>
+          <w:lang w:val="en-US"/>
+        </w:rPr>
+        <w:t xml:space="preserve"> </w:t>
+      </w:r>
+      <w:proofErr w:type="spellStart"/>
+      <w:r>
+        <w:rPr>
+          <w:lang w:val="en-US"/>
+        </w:rPr>
+        <w:t>af</w:t>
+      </w:r>
+      <w:proofErr w:type="spellEnd"/>
+      <w:r>
+        <w:rPr>
+          <w:lang w:val="en-US"/>
+        </w:rPr>
+        <w:t xml:space="preserve"> </w:t>
+      </w:r>
+      <w:proofErr w:type="spellStart"/>
+      <w:r>
+        <w:rPr>
+          <w:lang w:val="en-US"/>
+        </w:rPr>
+        <w:t>asfasf</w:t>
+      </w:r>
+      <w:proofErr w:type="spellEnd"/>
+    </w:p>
+    <w:p>
+      <w:pPr>
+        <w:rPr>
+          <w:lang w:val="en-US"/>
+        </w:rPr>
+      </w:pPr>
+      <w:proofErr w:type="spellStart"/>
+      <w:proofErr w:type="gramStart"/>
+      <w:r>
+        <w:rPr>
+          <w:lang w:val="en-US"/>
+        </w:rPr>
+        <w:t>Asfasfsafds</w:t>
+      </w:r>
+      <w:proofErr w:type="spellEnd"/>
+      <w:r>
+        <w:rPr>
+          <w:lang w:val="en-US"/>
+        </w:rPr>
+        <w:t xml:space="preserve">  </w:t>
+      </w:r>
+      <w:proofErr w:type="spellStart"/>
+      <w:r>
+        <w:rPr>
+          <w:lang w:val="en-US"/>
+        </w:rPr>
+        <w:t>asdfasdfasfd</w:t>
+      </w:r>
+      <w:proofErr w:type="spellEnd"/>
+      <w:proofErr w:type="gramEnd"/>
+    </w:p>
+    <w:p>
+      <w:pPr>
+        <w:rPr>
+          <w:lang w:val="en-US"/>
+        </w:rPr>
+      </w:pPr>
     </w:p>
     <w:p>
       <w:pPr>
@@ -5901,6 +6108,7 @@
       </w:pPr>
       <w:bookmarkStart w:id="18" w:name="_Toc210125379"/>
       <w:r>
+        <w:lastRenderedPageBreak/>
         <w:t>DIAGRAMA E/R</w:t>
       </w:r>
       <w:bookmarkEnd w:id="18"/>
@@ -6052,22 +6260,7 @@
         <w:jc w:val="center"/>
       </w:pPr>
       <w:r>
-        <w:t xml:space="preserve">Figura </w:t>
-      </w:r>
-      <w:r>
-        <w:t>3</w:t>
-      </w:r>
-      <w:r>
-        <w:t>. Diagrama Entidad Relaci</w:t>
-      </w:r>
-      <w:r>
-        <w:t>ó</w:t>
-      </w:r>
-      <w:r>
-        <w:t>n</w:t>
-      </w:r>
-      <w:r>
-        <w:t xml:space="preserve"> con atributos fundamentales</w:t>
+        <w:t>Figura 3. Diagrama Entidad Relación con atributos fundamentales</w:t>
       </w:r>
     </w:p>
     <w:p/>
@@ -6175,6 +6368,9 @@
     </w:p>
     <w:p>
       <w:r>
+        <w:rPr>
+          <w:noProof/>
+        </w:rPr>
         <w:drawing>
           <wp:inline distT="0" distB="0" distL="0" distR="0" wp14:anchorId="395C58D5" wp14:editId="460458C5">
             <wp:extent cx="6120130" cy="4248150"/>
@@ -6218,16 +6414,7 @@
         <w:jc w:val="center"/>
       </w:pPr>
       <w:r>
-        <w:t xml:space="preserve">Figura </w:t>
-      </w:r>
-      <w:r>
-        <w:t>5</w:t>
-      </w:r>
-      <w:r>
-        <w:t xml:space="preserve">. </w:t>
-      </w:r>
-      <w:r>
-        <w:t>Interfaz gráfica de Inicio de Sesión</w:t>
+        <w:t>Figura 5. Interfaz gráfica de Inicio de Sesión</w:t>
       </w:r>
     </w:p>
     <w:p/>
@@ -6248,6 +6435,9 @@
     </w:p>
     <w:p>
       <w:r>
+        <w:rPr>
+          <w:noProof/>
+        </w:rPr>
         <w:drawing>
           <wp:inline distT="0" distB="0" distL="0" distR="0" wp14:anchorId="45539957" wp14:editId="3D498E8C">
             <wp:extent cx="6120130" cy="4509135"/>
@@ -6291,16 +6481,7 @@
         <w:jc w:val="center"/>
       </w:pPr>
       <w:r>
-        <w:t xml:space="preserve">Figura </w:t>
-      </w:r>
-      <w:r>
-        <w:t>6</w:t>
-      </w:r>
-      <w:r>
-        <w:t xml:space="preserve">. </w:t>
-      </w:r>
-      <w:r>
-        <w:t>Mapa de navegabilidad inicial</w:t>
+        <w:t>Figura 6. Mapa de navegabilidad inicial</w:t>
       </w:r>
     </w:p>
     <w:p/>
@@ -6324,6 +6505,11 @@
       </w:r>
     </w:p>
     <w:p>
+      <w:r>
+        <w:br w:type="page"/>
+      </w:r>
+    </w:p>
+    <w:p>
       <w:pPr>
         <w:pStyle w:val="Ttulo2"/>
         <w:numPr>
@@ -6333,13 +6519,46 @@
       </w:pPr>
       <w:bookmarkStart w:id="25" w:name="_Toc210125384"/>
       <w:r>
+        <w:lastRenderedPageBreak/>
         <w:t>TECNOLOGÍAS EMPLEADAS</w:t>
       </w:r>
       <w:bookmarkEnd w:id="25"/>
     </w:p>
     <w:p>
-      <w:r>
-        <w:t>(…)</w:t>
+      <w:pPr>
+        <w:rPr>
+          <w:lang w:val="en-US"/>
+        </w:rPr>
+      </w:pPr>
+      <w:r>
+        <w:rPr>
+          <w:lang w:val="en-US"/>
+        </w:rPr>
+        <w:t>Java</w:t>
+      </w:r>
+      <w:r>
+        <w:rPr>
+          <w:lang w:val="en-US"/>
+        </w:rPr>
+        <w:t>/</w:t>
+      </w:r>
+      <w:r>
+        <w:rPr>
+          <w:lang w:val="en-US"/>
+        </w:rPr>
+        <w:t>JavaFX</w:t>
+      </w:r>
+      <w:r>
+        <w:rPr>
+          <w:lang w:val="en-US"/>
+        </w:rPr>
+        <w:t>, Spring Boot, JPA, H</w:t>
+      </w:r>
+      <w:r>
+        <w:rPr>
+          <w:lang w:val="en-US"/>
+        </w:rPr>
+        <w:t>ibernate, Kotlin, FXML/XML, CSS.</w:t>
       </w:r>
     </w:p>
     <w:p>
@@ -6357,9 +6576,84 @@
       <w:bookmarkEnd w:id="26"/>
     </w:p>
     <w:p>
-      <w:r>
-        <w:t>(…)</w:t>
-      </w:r>
+      <w:proofErr w:type="spellStart"/>
+      <w:r>
+        <w:t>Lorem</w:t>
+      </w:r>
+      <w:proofErr w:type="spellEnd"/>
+      <w:r>
+        <w:t xml:space="preserve"> </w:t>
+      </w:r>
+      <w:proofErr w:type="spellStart"/>
+      <w:r>
+        <w:t>ipsum</w:t>
+      </w:r>
+      <w:proofErr w:type="spellEnd"/>
+      <w:r>
+        <w:t xml:space="preserve"> </w:t>
+      </w:r>
+      <w:proofErr w:type="spellStart"/>
+      <w:r>
+        <w:t>lñasfjlñsakdfk</w:t>
+      </w:r>
+      <w:proofErr w:type="spellEnd"/>
+      <w:r>
+        <w:t xml:space="preserve"> </w:t>
+      </w:r>
+      <w:proofErr w:type="spellStart"/>
+      <w:r>
+        <w:t>aksfñlasdfasklflñasf</w:t>
+      </w:r>
+      <w:proofErr w:type="spellEnd"/>
+    </w:p>
+    <w:p>
+      <w:proofErr w:type="spellStart"/>
+      <w:r>
+        <w:t>Asdfasfdasdfasfasdfasdf</w:t>
+      </w:r>
+      <w:proofErr w:type="spellEnd"/>
+      <w:r>
+        <w:t xml:space="preserve"> </w:t>
+      </w:r>
+      <w:proofErr w:type="spellStart"/>
+      <w:r>
+        <w:t>asfkla</w:t>
+      </w:r>
+      <w:proofErr w:type="spellEnd"/>
+      <w:r>
+        <w:t xml:space="preserve"> </w:t>
+      </w:r>
+    </w:p>
+    <w:p>
+      <w:proofErr w:type="spellStart"/>
+      <w:r>
+        <w:t>Qwerqwer</w:t>
+      </w:r>
+      <w:proofErr w:type="spellEnd"/>
+      <w:r>
+        <w:t xml:space="preserve"> </w:t>
+      </w:r>
+      <w:proofErr w:type="spellStart"/>
+      <w:r>
+        <w:t>afdasf</w:t>
+      </w:r>
+      <w:proofErr w:type="spellEnd"/>
+      <w:r>
+        <w:t xml:space="preserve"> </w:t>
+      </w:r>
+      <w:proofErr w:type="spellStart"/>
+      <w:r>
+        <w:t>añlsdfakslfdaskdfjsfaofasf</w:t>
+      </w:r>
+      <w:proofErr w:type="spellEnd"/>
+      <w:r>
+        <w:t xml:space="preserve"> </w:t>
+      </w:r>
+      <w:proofErr w:type="spellStart"/>
+      <w:r>
+        <w:t>asdfadfsasdf</w:t>
+      </w:r>
+      <w:proofErr w:type="spellEnd"/>
     </w:p>
     <w:p>
       <w:pPr>
@@ -6462,11 +6756,8 @@
       </w:r>
       <w:bookmarkEnd w:id="39"/>
     </w:p>
-    <w:p>
-      <w:r>
-        <w:t>(…)</w:t>
-      </w:r>
-    </w:p>
+    <w:p/>
+    <w:p/>
     <w:p>
       <w:pPr>
         <w:pStyle w:val="Ttulo2"/>
@@ -6812,6 +7103,7 @@
       </w:pPr>
       <w:bookmarkStart w:id="70" w:name="_Toc210125405"/>
       <w:r>
+        <w:lastRenderedPageBreak/>
         <w:t>MANUAL DE USUARIO</w:t>
       </w:r>
       <w:bookmarkEnd w:id="70"/>
@@ -8778,6 +9070,12 @@
 </file>
 
 <file path=customXml/item1.xml><?xml version="1.0" encoding="utf-8"?>
+<p:properties xmlns:p="http://schemas.microsoft.com/office/2006/metadata/properties" xmlns:xsi="http://www.w3.org/2001/XMLSchema-instance" xmlns:pc="http://schemas.microsoft.com/office/infopath/2007/PartnerControls">
+  <documentManagement/>
+</p:properties>
+</file>
+
+<file path=customXml/item2.xml><?xml version="1.0" encoding="utf-8"?>
 <?mso-contentType ?>
 <FormTemplates xmlns="http://schemas.microsoft.com/sharepoint/v3/contenttype/forms">
   <Display>DocumentLibraryForm</Display>
@@ -8786,17 +9084,7 @@
 </FormTemplates>
 </file>
 
-<file path=customXml/item2.xml><?xml version="1.0" encoding="utf-8"?>
-<p:properties xmlns:p="http://schemas.microsoft.com/office/2006/metadata/properties" xmlns:xsi="http://www.w3.org/2001/XMLSchema-instance" xmlns:pc="http://schemas.microsoft.com/office/infopath/2007/PartnerControls">
-  <documentManagement/>
-</p:properties>
-</file>
-
 <file path=customXml/item3.xml><?xml version="1.0" encoding="utf-8"?>
-<b:Sources xmlns:b="http://schemas.openxmlformats.org/officeDocument/2006/bibliography" xmlns="http://schemas.openxmlformats.org/officeDocument/2006/bibliography" SelectedStyle="\APASixthEditionOfficeOnline.xsl" StyleName="APA" Version="6"/>
-</file>
-
-<file path=customXml/item4.xml><?xml version="1.0" encoding="utf-8"?>
 <ct:contentTypeSchema xmlns:ct="http://schemas.microsoft.com/office/2006/metadata/contentType" xmlns:ma="http://schemas.microsoft.com/office/2006/metadata/properties/metaAttributes" ct:_="" ma:_="" ma:contentTypeName="Documento" ma:contentTypeID="0x0101003E64B964EE86E94E88810388061E4AC8" ma:contentTypeVersion="3" ma:contentTypeDescription="Crear nuevo documento." ma:contentTypeScope="" ma:versionID="3c755de4efb81f0959f76dfe4f7a563c">
   <xsd:schema xmlns:xsd="http://www.w3.org/2001/XMLSchema" xmlns:xs="http://www.w3.org/2001/XMLSchema" xmlns:p="http://schemas.microsoft.com/office/2006/metadata/properties" xmlns:ns2="72982a07-b385-426f-8f99-a9bd2486cbec" targetNamespace="http://schemas.microsoft.com/office/2006/metadata/properties" ma:root="true" ma:fieldsID="5f645ab2d71ed821d1fb93c6441734aa" ns2:_="">
     <xsd:import namespace="72982a07-b385-426f-8f99-a9bd2486cbec"/>
@@ -8934,15 +9222,11 @@
 </ct:contentTypeSchema>
 </file>
 
-<file path=customXml/itemProps1.xml><?xml version="1.0" encoding="utf-8"?>
-<ds:datastoreItem xmlns:ds="http://schemas.openxmlformats.org/officeDocument/2006/customXml" ds:itemID="{480B8420-1B48-4D23-8D6E-64373AC5070B}">
-  <ds:schemaRefs>
-    <ds:schemaRef ds:uri="http://schemas.microsoft.com/sharepoint/v3/contenttype/forms"/>
-  </ds:schemaRefs>
-</ds:datastoreItem>
+<file path=customXml/item4.xml><?xml version="1.0" encoding="utf-8"?>
+<b:Sources xmlns:b="http://schemas.openxmlformats.org/officeDocument/2006/bibliography" xmlns="http://schemas.openxmlformats.org/officeDocument/2006/bibliography" SelectedStyle="\APASixthEditionOfficeOnline.xsl" StyleName="APA" Version="6"/>
 </file>
 
-<file path=customXml/itemProps2.xml><?xml version="1.0" encoding="utf-8"?>
+<file path=customXml/itemProps1.xml><?xml version="1.0" encoding="utf-8"?>
 <ds:datastoreItem xmlns:ds="http://schemas.openxmlformats.org/officeDocument/2006/customXml" ds:itemID="{7F0B1298-25D5-45B9-909D-DD837044A49E}">
   <ds:schemaRefs>
     <ds:schemaRef ds:uri="http://schemas.microsoft.com/office/2006/metadata/properties"/>
@@ -8951,15 +9235,15 @@
 </ds:datastoreItem>
 </file>
 
-<file path=customXml/itemProps3.xml><?xml version="1.0" encoding="utf-8"?>
-<ds:datastoreItem xmlns:ds="http://schemas.openxmlformats.org/officeDocument/2006/customXml" ds:itemID="{453714F8-FBC3-4DCC-8DCB-89BB58DCF76F}">
+<file path=customXml/itemProps2.xml><?xml version="1.0" encoding="utf-8"?>
+<ds:datastoreItem xmlns:ds="http://schemas.openxmlformats.org/officeDocument/2006/customXml" ds:itemID="{480B8420-1B48-4D23-8D6E-64373AC5070B}">
   <ds:schemaRefs>
-    <ds:schemaRef ds:uri="http://schemas.openxmlformats.org/officeDocument/2006/bibliography"/>
+    <ds:schemaRef ds:uri="http://schemas.microsoft.com/sharepoint/v3/contenttype/forms"/>
   </ds:schemaRefs>
 </ds:datastoreItem>
 </file>
 
-<file path=customXml/itemProps4.xml><?xml version="1.0" encoding="utf-8"?>
+<file path=customXml/itemProps3.xml><?xml version="1.0" encoding="utf-8"?>
 <ds:datastoreItem xmlns:ds="http://schemas.openxmlformats.org/officeDocument/2006/customXml" ds:itemID="{CAB20FFE-1E23-4B58-9D76-1835AB7D3BED}">
   <ds:schemaRefs>
     <ds:schemaRef ds:uri="http://schemas.microsoft.com/office/2006/metadata/contentType"/>
@@ -8975,4 +9259,12 @@
     <ds:schemaRef ds:uri="http://schemas.microsoft.com/internal/obd"/>
   </ds:schemaRefs>
 </ds:datastoreItem>
+</file>
+
+<file path=customXml/itemProps4.xml><?xml version="1.0" encoding="utf-8"?>
+<ds:datastoreItem xmlns:ds="http://schemas.openxmlformats.org/officeDocument/2006/customXml" ds:itemID="{453714F8-FBC3-4DCC-8DCB-89BB58DCF76F}">
+  <ds:schemaRefs>
+    <ds:schemaRef ds:uri="http://schemas.openxmlformats.org/officeDocument/2006/bibliography"/>
+  </ds:schemaRefs>
+</ds:datastoreItem>
 </file>
</xml_diff>

<commit_message>
implementado Inicio y login view
</commit_message>
<xml_diff>
--- a/docu/DocumentacionProyecto_BrunoOrtizBlanco.docx
+++ b/docu/DocumentacionProyecto_BrunoOrtizBlanco.docx
@@ -1154,7 +1154,7 @@
           <w:lang w:eastAsia="es-VE"/>
         </w:rPr>
         <w:drawing>
-          <wp:inline distT="0" distB="0" distL="0" distR="0" wp14:anchorId="7F7E7601" wp14:editId="15642687">
+          <wp:inline distT="0" distB="0" distL="0" distR="0" wp14:anchorId="7F7E7601" wp14:editId="39B84E82">
             <wp:extent cx="7556500" cy="10599420"/>
             <wp:effectExtent l="0" t="0" r="6350" b="0"/>
             <wp:docPr id="2" name="Imagen 2" descr="D:\servicios forobeta posts\diseño grafico\CLIENTES\Feelmusic - 05.11.18\archivos\11\11.jpg"/>
@@ -1437,7 +1437,7 @@
                 <w:noProof/>
                 <w:webHidden/>
               </w:rPr>
-              <w:t>3</w:t>
+              <w:t>4</w:t>
             </w:r>
             <w:r>
               <w:rPr>
@@ -1528,7 +1528,7 @@
                 <w:noProof/>
                 <w:webHidden/>
               </w:rPr>
-              <w:t>3</w:t>
+              <w:t>4</w:t>
             </w:r>
             <w:r>
               <w:rPr>
@@ -1709,7 +1709,7 @@
                 <w:noProof/>
                 <w:webHidden/>
               </w:rPr>
-              <w:t>4</w:t>
+              <w:t>6</w:t>
             </w:r>
             <w:r>
               <w:rPr>
@@ -1800,7 +1800,7 @@
                 <w:noProof/>
                 <w:webHidden/>
               </w:rPr>
-              <w:t>4</w:t>
+              <w:t>6</w:t>
             </w:r>
             <w:r>
               <w:rPr>
@@ -1892,7 +1892,7 @@
                 <w:noProof/>
                 <w:webHidden/>
               </w:rPr>
-              <w:t>5</w:t>
+              <w:t>7</w:t>
             </w:r>
             <w:r>
               <w:rPr>
@@ -1984,7 +1984,7 @@
                 <w:noProof/>
                 <w:webHidden/>
               </w:rPr>
-              <w:t>5</w:t>
+              <w:t>7</w:t>
             </w:r>
             <w:r>
               <w:rPr>
@@ -2076,7 +2076,7 @@
                 <w:noProof/>
                 <w:webHidden/>
               </w:rPr>
-              <w:t>6</w:t>
+              <w:t>8</w:t>
             </w:r>
             <w:r>
               <w:rPr>
@@ -2167,7 +2167,7 @@
                 <w:noProof/>
                 <w:webHidden/>
               </w:rPr>
-              <w:t>6</w:t>
+              <w:t>9</w:t>
             </w:r>
             <w:r>
               <w:rPr>
@@ -2258,7 +2258,7 @@
                 <w:noProof/>
                 <w:webHidden/>
               </w:rPr>
-              <w:t>7</w:t>
+              <w:t>9</w:t>
             </w:r>
             <w:r>
               <w:rPr>
@@ -2349,7 +2349,7 @@
                 <w:noProof/>
                 <w:webHidden/>
               </w:rPr>
-              <w:t>8</w:t>
+              <w:t>9</w:t>
             </w:r>
             <w:r>
               <w:rPr>
@@ -2441,7 +2441,7 @@
                 <w:noProof/>
                 <w:webHidden/>
               </w:rPr>
-              <w:t>8</w:t>
+              <w:t>10</w:t>
             </w:r>
             <w:r>
               <w:rPr>
@@ -2533,7 +2533,7 @@
                 <w:noProof/>
                 <w:webHidden/>
               </w:rPr>
-              <w:t>10</w:t>
+              <w:t>12</w:t>
             </w:r>
             <w:r>
               <w:rPr>
@@ -2625,7 +2625,7 @@
                 <w:noProof/>
                 <w:webHidden/>
               </w:rPr>
-              <w:t>11</w:t>
+              <w:t>13</w:t>
             </w:r>
             <w:r>
               <w:rPr>
@@ -2717,7 +2717,7 @@
                 <w:noProof/>
                 <w:webHidden/>
               </w:rPr>
-              <w:t>12</w:t>
+              <w:t>14</w:t>
             </w:r>
             <w:r>
               <w:rPr>
@@ -2808,7 +2808,7 @@
                 <w:noProof/>
                 <w:webHidden/>
               </w:rPr>
-              <w:t>12</w:t>
+              <w:t>14</w:t>
             </w:r>
             <w:r>
               <w:rPr>
@@ -2898,7 +2898,7 @@
                 <w:noProof/>
                 <w:webHidden/>
               </w:rPr>
-              <w:t>12</w:t>
+              <w:t>15</w:t>
             </w:r>
             <w:r>
               <w:rPr>
@@ -2988,7 +2988,7 @@
                 <w:noProof/>
                 <w:webHidden/>
               </w:rPr>
-              <w:t>12</w:t>
+              <w:t>16</w:t>
             </w:r>
             <w:r>
               <w:rPr>
@@ -3079,7 +3079,7 @@
                 <w:noProof/>
                 <w:webHidden/>
               </w:rPr>
-              <w:t>12</w:t>
+              <w:t>16</w:t>
             </w:r>
             <w:r>
               <w:rPr>
@@ -3171,7 +3171,7 @@
                 <w:noProof/>
                 <w:webHidden/>
               </w:rPr>
-              <w:t>12</w:t>
+              <w:t>16</w:t>
             </w:r>
             <w:r>
               <w:rPr>
@@ -3262,7 +3262,7 @@
                 <w:noProof/>
                 <w:webHidden/>
               </w:rPr>
-              <w:t>12</w:t>
+              <w:t>16</w:t>
             </w:r>
             <w:r>
               <w:rPr>
@@ -3353,7 +3353,7 @@
                 <w:noProof/>
                 <w:webHidden/>
               </w:rPr>
-              <w:t>13</w:t>
+              <w:t>16</w:t>
             </w:r>
             <w:r>
               <w:rPr>
@@ -3445,7 +3445,7 @@
                 <w:noProof/>
                 <w:webHidden/>
               </w:rPr>
-              <w:t>13</w:t>
+              <w:t>16</w:t>
             </w:r>
             <w:r>
               <w:rPr>
@@ -3536,7 +3536,7 @@
                 <w:noProof/>
                 <w:webHidden/>
               </w:rPr>
-              <w:t>13</w:t>
+              <w:t>16</w:t>
             </w:r>
             <w:r>
               <w:rPr>
@@ -3626,7 +3626,7 @@
                 <w:noProof/>
                 <w:webHidden/>
               </w:rPr>
-              <w:t>13</w:t>
+              <w:t>16</w:t>
             </w:r>
             <w:r>
               <w:rPr>
@@ -3716,7 +3716,7 @@
                 <w:noProof/>
                 <w:webHidden/>
               </w:rPr>
-              <w:t>13</w:t>
+              <w:t>16</w:t>
             </w:r>
             <w:r>
               <w:rPr>
@@ -3807,7 +3807,7 @@
                 <w:noProof/>
                 <w:webHidden/>
               </w:rPr>
-              <w:t>13</w:t>
+              <w:t>16</w:t>
             </w:r>
             <w:r>
               <w:rPr>
@@ -3898,7 +3898,7 @@
                 <w:noProof/>
                 <w:webHidden/>
               </w:rPr>
-              <w:t>13</w:t>
+              <w:t>16</w:t>
             </w:r>
             <w:r>
               <w:rPr>
@@ -3989,7 +3989,7 @@
                 <w:noProof/>
                 <w:webHidden/>
               </w:rPr>
-              <w:t>13</w:t>
+              <w:t>16</w:t>
             </w:r>
             <w:r>
               <w:rPr>
@@ -4081,7 +4081,7 @@
                 <w:noProof/>
                 <w:webHidden/>
               </w:rPr>
-              <w:t>13</w:t>
+              <w:t>17</w:t>
             </w:r>
             <w:r>
               <w:rPr>
@@ -4172,7 +4172,7 @@
                 <w:noProof/>
                 <w:webHidden/>
               </w:rPr>
-              <w:t>13</w:t>
+              <w:t>17</w:t>
             </w:r>
             <w:r>
               <w:rPr>
@@ -4311,7 +4311,7 @@
             <w:noProof/>
             <w:webHidden/>
           </w:rPr>
-          <w:t>6</w:t>
+          <w:t>8</w:t>
         </w:r>
         <w:r>
           <w:rPr>
@@ -4383,7 +4383,7 @@
             <w:noProof/>
             <w:webHidden/>
           </w:rPr>
-          <w:t>8</w:t>
+          <w:t>10</w:t>
         </w:r>
         <w:r>
           <w:rPr>
@@ -4455,7 +4455,7 @@
             <w:noProof/>
             <w:webHidden/>
           </w:rPr>
-          <w:t>10</w:t>
+          <w:t>12</w:t>
         </w:r>
         <w:r>
           <w:rPr>
@@ -5943,160 +5943,12 @@
       <w:bookmarkEnd w:id="17"/>
     </w:p>
     <w:p>
-      <w:pPr>
-        <w:rPr>
-          <w:lang w:val="en-US"/>
-        </w:rPr>
-      </w:pPr>
-      <w:r>
-        <w:rPr>
-          <w:lang w:val="en-US"/>
-        </w:rPr>
-        <w:t xml:space="preserve">Lorem ipsum </w:t>
-      </w:r>
-      <w:proofErr w:type="spellStart"/>
-      <w:r>
-        <w:rPr>
-          <w:lang w:val="en-US"/>
-        </w:rPr>
-        <w:t>asñldflkasfdasfasdfasdfasf</w:t>
-      </w:r>
-      <w:proofErr w:type="spellEnd"/>
-      <w:r>
-        <w:rPr>
-          <w:lang w:val="en-US"/>
-        </w:rPr>
-        <w:t xml:space="preserve"> </w:t>
-      </w:r>
-      <w:proofErr w:type="spellStart"/>
-      <w:r>
-        <w:rPr>
-          <w:lang w:val="en-US"/>
-        </w:rPr>
-        <w:t>asf</w:t>
-      </w:r>
-      <w:proofErr w:type="spellEnd"/>
-      <w:r>
-        <w:rPr>
-          <w:lang w:val="en-US"/>
-        </w:rPr>
-        <w:t xml:space="preserve"> s</w:t>
-      </w:r>
-      <w:r>
-        <w:rPr>
-          <w:lang w:val="en-US"/>
-        </w:rPr>
-        <w:t xml:space="preserve"> </w:t>
-      </w:r>
-      <w:proofErr w:type="spellStart"/>
-      <w:r>
-        <w:rPr>
-          <w:lang w:val="en-US"/>
-        </w:rPr>
-        <w:t>asf</w:t>
-      </w:r>
-      <w:proofErr w:type="spellEnd"/>
-      <w:r>
-        <w:rPr>
-          <w:lang w:val="en-US"/>
-        </w:rPr>
-        <w:t xml:space="preserve"> </w:t>
-      </w:r>
-    </w:p>
-    <w:p>
-      <w:pPr>
-        <w:rPr>
-          <w:lang w:val="en-US"/>
-        </w:rPr>
-      </w:pPr>
-      <w:proofErr w:type="spellStart"/>
-      <w:r>
-        <w:rPr>
-          <w:lang w:val="en-US"/>
-        </w:rPr>
-        <w:t>Asdfasdfasdf</w:t>
-      </w:r>
-      <w:proofErr w:type="spellEnd"/>
-      <w:r>
-        <w:rPr>
-          <w:lang w:val="en-US"/>
-        </w:rPr>
-        <w:t xml:space="preserve"> </w:t>
-      </w:r>
-      <w:proofErr w:type="spellStart"/>
-      <w:r>
-        <w:rPr>
-          <w:lang w:val="en-US"/>
-        </w:rPr>
-        <w:t>asdf</w:t>
-      </w:r>
-      <w:proofErr w:type="spellEnd"/>
-      <w:r>
-        <w:rPr>
-          <w:lang w:val="en-US"/>
-        </w:rPr>
-        <w:t xml:space="preserve"> </w:t>
-      </w:r>
-      <w:proofErr w:type="spellStart"/>
-      <w:r>
-        <w:rPr>
-          <w:lang w:val="en-US"/>
-        </w:rPr>
-        <w:t>af</w:t>
-      </w:r>
-      <w:proofErr w:type="spellEnd"/>
-      <w:r>
-        <w:rPr>
-          <w:lang w:val="en-US"/>
-        </w:rPr>
-        <w:t xml:space="preserve"> </w:t>
-      </w:r>
-      <w:proofErr w:type="spellStart"/>
-      <w:r>
-        <w:rPr>
-          <w:lang w:val="en-US"/>
-        </w:rPr>
-        <w:t>asfasf</w:t>
-      </w:r>
-      <w:proofErr w:type="spellEnd"/>
-    </w:p>
-    <w:p>
-      <w:pPr>
-        <w:rPr>
-          <w:lang w:val="en-US"/>
-        </w:rPr>
-      </w:pPr>
-      <w:proofErr w:type="spellStart"/>
-      <w:proofErr w:type="gramStart"/>
-      <w:r>
-        <w:rPr>
-          <w:lang w:val="en-US"/>
-        </w:rPr>
-        <w:t>Asfasfsafds</w:t>
-      </w:r>
-      <w:proofErr w:type="spellEnd"/>
-      <w:r>
-        <w:rPr>
-          <w:lang w:val="en-US"/>
-        </w:rPr>
-        <w:t xml:space="preserve">  </w:t>
-      </w:r>
-      <w:proofErr w:type="spellStart"/>
-      <w:r>
-        <w:rPr>
-          <w:lang w:val="en-US"/>
-        </w:rPr>
-        <w:t>asdfasdfasfd</w:t>
-      </w:r>
-      <w:proofErr w:type="spellEnd"/>
-      <w:proofErr w:type="gramEnd"/>
-    </w:p>
-    <w:p>
-      <w:pPr>
-        <w:rPr>
-          <w:lang w:val="en-US"/>
-        </w:rPr>
-      </w:pPr>
+      <w:r>
+        <w:t>Este proceso de diseño i</w:t>
+      </w:r>
+      <w:r>
+        <w:t xml:space="preserve">mplica la elaboración de un Diagrama Entidad-Relación (E/R) y un diagrama de clases. A través de estos modelos, se mientras las entidades, sus atributos y las relaciones existentes entre ellas. </w:t>
+      </w:r>
     </w:p>
     <w:p>
       <w:pPr>
@@ -6525,40 +6377,97 @@
       <w:bookmarkEnd w:id="25"/>
     </w:p>
     <w:p>
-      <w:pPr>
-        <w:rPr>
-          <w:lang w:val="en-US"/>
-        </w:rPr>
-      </w:pPr>
-      <w:r>
-        <w:rPr>
-          <w:lang w:val="en-US"/>
-        </w:rPr>
-        <w:t>Java</w:t>
-      </w:r>
-      <w:r>
-        <w:rPr>
-          <w:lang w:val="en-US"/>
-        </w:rPr>
-        <w:t>/</w:t>
-      </w:r>
-      <w:r>
-        <w:rPr>
-          <w:lang w:val="en-US"/>
-        </w:rPr>
+      <w:r>
+        <w:t xml:space="preserve">En este apartado, describiremos las herramientas y lenguajes seleccionados para el desarrollo del aplicativo, cuya arquitectura se basa en el </w:t>
+      </w:r>
+      <w:r>
+        <w:t>patrón</w:t>
+      </w:r>
+      <w:r>
+        <w:t xml:space="preserve"> de diseño Modelo-Vista-Controlador (MVC).</w:t>
+      </w:r>
+    </w:p>
+    <w:p>
+      <w:r>
+        <w:t xml:space="preserve">Para el desarrollo </w:t>
+      </w:r>
+      <w:proofErr w:type="spellStart"/>
+      <w:r>
+        <w:t>backend</w:t>
+      </w:r>
+      <w:proofErr w:type="spellEnd"/>
+      <w:r>
+        <w:t xml:space="preserve"> y estructura usaremos Java y Spring </w:t>
+      </w:r>
+      <w:proofErr w:type="spellStart"/>
+      <w:r>
+        <w:t>Boot</w:t>
+      </w:r>
+      <w:proofErr w:type="spellEnd"/>
+      <w:r>
+        <w:t xml:space="preserve">, es el núcleo del proyecto. Java sirve como lenguaje de programación principal, mientras que Spring </w:t>
+      </w:r>
+      <w:proofErr w:type="spellStart"/>
+      <w:r>
+        <w:t>Boot</w:t>
+      </w:r>
+      <w:proofErr w:type="spellEnd"/>
+      <w:r>
+        <w:t xml:space="preserve"> proporciona</w:t>
+      </w:r>
+      <w:r>
+        <w:t xml:space="preserve"> el </w:t>
+      </w:r>
+      <w:proofErr w:type="spellStart"/>
+      <w:r>
+        <w:t>framework</w:t>
+      </w:r>
+      <w:proofErr w:type="spellEnd"/>
+      <w:r>
+        <w:t xml:space="preserve"> necesario para construir la arquitectura del aplicativo y facilitar la configuración, incluyendo la preparación para la conexión a un base de datos mediante el fichero de propiedades (</w:t>
+      </w:r>
+      <w:proofErr w:type="spellStart"/>
+      <w:proofErr w:type="gramStart"/>
+      <w:r>
+        <w:t>application.properties</w:t>
+      </w:r>
+      <w:proofErr w:type="spellEnd"/>
+      <w:proofErr w:type="gramEnd"/>
+      <w:r>
+        <w:t>)</w:t>
+      </w:r>
+    </w:p>
+    <w:p/>
+    <w:p>
+      <w:r>
+        <w:t xml:space="preserve">Para la persistencia y acceso a datos usaremos JPA e </w:t>
+      </w:r>
+      <w:proofErr w:type="spellStart"/>
+      <w:r>
+        <w:t>Hibernate</w:t>
+      </w:r>
+      <w:proofErr w:type="spellEnd"/>
+      <w:r>
+        <w:t>.</w:t>
+      </w:r>
+    </w:p>
+    <w:p/>
+    <w:p>
+      <w:r>
+        <w:t xml:space="preserve">Para la interfaz de Usuario y Estilo usaremos </w:t>
+      </w:r>
+      <w:proofErr w:type="spellStart"/>
+      <w:r>
         <w:t>JavaFX</w:t>
       </w:r>
-      <w:r>
-        <w:rPr>
-          <w:lang w:val="en-US"/>
-        </w:rPr>
-        <w:t>, Spring Boot, JPA, H</w:t>
-      </w:r>
-      <w:r>
-        <w:rPr>
-          <w:lang w:val="en-US"/>
-        </w:rPr>
-        <w:t>ibernate, Kotlin, FXML/XML, CSS.</w:t>
+      <w:proofErr w:type="spellEnd"/>
+      <w:r>
+        <w:t xml:space="preserve"> con FXML y CSS</w:t>
+      </w:r>
+    </w:p>
+    <w:p>
+      <w:r>
+        <w:br w:type="page"/>
       </w:r>
     </w:p>
     <w:p>
@@ -6571,89 +6480,10 @@
       </w:pPr>
       <w:bookmarkStart w:id="26" w:name="_Toc210125385"/>
       <w:r>
+        <w:lastRenderedPageBreak/>
         <w:t>PLANIFICACIÓN Y PRESUPUESTO</w:t>
       </w:r>
       <w:bookmarkEnd w:id="26"/>
-    </w:p>
-    <w:p>
-      <w:proofErr w:type="spellStart"/>
-      <w:r>
-        <w:t>Lorem</w:t>
-      </w:r>
-      <w:proofErr w:type="spellEnd"/>
-      <w:r>
-        <w:t xml:space="preserve"> </w:t>
-      </w:r>
-      <w:proofErr w:type="spellStart"/>
-      <w:r>
-        <w:t>ipsum</w:t>
-      </w:r>
-      <w:proofErr w:type="spellEnd"/>
-      <w:r>
-        <w:t xml:space="preserve"> </w:t>
-      </w:r>
-      <w:proofErr w:type="spellStart"/>
-      <w:r>
-        <w:t>lñasfjlñsakdfk</w:t>
-      </w:r>
-      <w:proofErr w:type="spellEnd"/>
-      <w:r>
-        <w:t xml:space="preserve"> </w:t>
-      </w:r>
-      <w:proofErr w:type="spellStart"/>
-      <w:r>
-        <w:t>aksfñlasdfasklflñasf</w:t>
-      </w:r>
-      <w:proofErr w:type="spellEnd"/>
-    </w:p>
-    <w:p>
-      <w:proofErr w:type="spellStart"/>
-      <w:r>
-        <w:t>Asdfasfdasdfasfasdfasdf</w:t>
-      </w:r>
-      <w:proofErr w:type="spellEnd"/>
-      <w:r>
-        <w:t xml:space="preserve"> </w:t>
-      </w:r>
-      <w:proofErr w:type="spellStart"/>
-      <w:r>
-        <w:t>asfkla</w:t>
-      </w:r>
-      <w:proofErr w:type="spellEnd"/>
-      <w:r>
-        <w:t xml:space="preserve"> </w:t>
-      </w:r>
-    </w:p>
-    <w:p>
-      <w:proofErr w:type="spellStart"/>
-      <w:r>
-        <w:t>Qwerqwer</w:t>
-      </w:r>
-      <w:proofErr w:type="spellEnd"/>
-      <w:r>
-        <w:t xml:space="preserve"> </w:t>
-      </w:r>
-      <w:proofErr w:type="spellStart"/>
-      <w:r>
-        <w:t>afdasf</w:t>
-      </w:r>
-      <w:proofErr w:type="spellEnd"/>
-      <w:r>
-        <w:t xml:space="preserve"> </w:t>
-      </w:r>
-      <w:proofErr w:type="spellStart"/>
-      <w:r>
-        <w:t>añlsdfakslfdaskdfjsfaofasf</w:t>
-      </w:r>
-      <w:proofErr w:type="spellEnd"/>
-      <w:r>
-        <w:t xml:space="preserve"> </w:t>
-      </w:r>
-      <w:proofErr w:type="spellStart"/>
-      <w:r>
-        <w:t>asdfadfsasdf</w:t>
-      </w:r>
-      <w:proofErr w:type="spellEnd"/>
     </w:p>
     <w:p>
       <w:pPr>
@@ -6756,7 +6586,45 @@
       </w:r>
       <w:bookmarkEnd w:id="39"/>
     </w:p>
-    <w:p/>
+    <w:p>
+      <w:r>
+        <w:drawing>
+          <wp:inline distT="0" distB="0" distL="0" distR="0" wp14:anchorId="13612C01" wp14:editId="32B29099">
+            <wp:extent cx="6120130" cy="1691005"/>
+            <wp:effectExtent l="0" t="0" r="0" b="4445"/>
+            <wp:docPr id="938811594" name="Imagen 1" descr="Escala de tiempo&#10;&#10;El contenido generado por IA puede ser incorrecto."/>
+            <wp:cNvGraphicFramePr>
+              <a:graphicFrameLocks xmlns:a="http://schemas.openxmlformats.org/drawingml/2006/main" noChangeAspect="1"/>
+            </wp:cNvGraphicFramePr>
+            <a:graphic xmlns:a="http://schemas.openxmlformats.org/drawingml/2006/main">
+              <a:graphicData uri="http://schemas.openxmlformats.org/drawingml/2006/picture">
+                <pic:pic xmlns:pic="http://schemas.openxmlformats.org/drawingml/2006/picture">
+                  <pic:nvPicPr>
+                    <pic:cNvPr id="938811594" name="Imagen 1" descr="Escala de tiempo&#10;&#10;El contenido generado por IA puede ser incorrecto."/>
+                    <pic:cNvPicPr/>
+                  </pic:nvPicPr>
+                  <pic:blipFill>
+                    <a:blip r:embed="rId21"/>
+                    <a:stretch>
+                      <a:fillRect/>
+                    </a:stretch>
+                  </pic:blipFill>
+                  <pic:spPr>
+                    <a:xfrm>
+                      <a:off x="0" y="0"/>
+                      <a:ext cx="6120130" cy="1691005"/>
+                    </a:xfrm>
+                    <a:prstGeom prst="rect">
+                      <a:avLst/>
+                    </a:prstGeom>
+                  </pic:spPr>
+                </pic:pic>
+              </a:graphicData>
+            </a:graphic>
+          </wp:inline>
+        </w:drawing>
+      </w:r>
+    </w:p>
     <w:p/>
     <w:p>
       <w:pPr>
@@ -7138,7 +7006,7 @@
       </w:r>
     </w:p>
     <w:sectPr>
-      <w:footerReference w:type="default" r:id="rId21"/>
+      <w:footerReference w:type="default" r:id="rId22"/>
       <w:pgSz w:w="11906" w:h="16838"/>
       <w:pgMar w:top="1134" w:right="1134" w:bottom="1418" w:left="1134" w:header="709" w:footer="709" w:gutter="0"/>
       <w:pgNumType w:start="1"/>
@@ -9076,12 +8944,7 @@
 </file>
 
 <file path=customXml/item2.xml><?xml version="1.0" encoding="utf-8"?>
-<?mso-contentType ?>
-<FormTemplates xmlns="http://schemas.microsoft.com/sharepoint/v3/contenttype/forms">
-  <Display>DocumentLibraryForm</Display>
-  <Edit>DocumentLibraryForm</Edit>
-  <New>DocumentLibraryForm</New>
-</FormTemplates>
+<b:Sources xmlns:b="http://schemas.openxmlformats.org/officeDocument/2006/bibliography" xmlns="http://schemas.openxmlformats.org/officeDocument/2006/bibliography" SelectedStyle="\APASixthEditionOfficeOnline.xsl" StyleName="APA" Version="6"/>
 </file>
 
 <file path=customXml/item3.xml><?xml version="1.0" encoding="utf-8"?>
@@ -9223,7 +9086,12 @@
 </file>
 
 <file path=customXml/item4.xml><?xml version="1.0" encoding="utf-8"?>
-<b:Sources xmlns:b="http://schemas.openxmlformats.org/officeDocument/2006/bibliography" xmlns="http://schemas.openxmlformats.org/officeDocument/2006/bibliography" SelectedStyle="\APASixthEditionOfficeOnline.xsl" StyleName="APA" Version="6"/>
+<?mso-contentType ?>
+<FormTemplates xmlns="http://schemas.microsoft.com/sharepoint/v3/contenttype/forms">
+  <Display>DocumentLibraryForm</Display>
+  <Edit>DocumentLibraryForm</Edit>
+  <New>DocumentLibraryForm</New>
+</FormTemplates>
 </file>
 
 <file path=customXml/itemProps1.xml><?xml version="1.0" encoding="utf-8"?>
@@ -9236,9 +9104,9 @@
 </file>
 
 <file path=customXml/itemProps2.xml><?xml version="1.0" encoding="utf-8"?>
-<ds:datastoreItem xmlns:ds="http://schemas.openxmlformats.org/officeDocument/2006/customXml" ds:itemID="{480B8420-1B48-4D23-8D6E-64373AC5070B}">
+<ds:datastoreItem xmlns:ds="http://schemas.openxmlformats.org/officeDocument/2006/customXml" ds:itemID="{453714F8-FBC3-4DCC-8DCB-89BB58DCF76F}">
   <ds:schemaRefs>
-    <ds:schemaRef ds:uri="http://schemas.microsoft.com/sharepoint/v3/contenttype/forms"/>
+    <ds:schemaRef ds:uri="http://schemas.openxmlformats.org/officeDocument/2006/bibliography"/>
   </ds:schemaRefs>
 </ds:datastoreItem>
 </file>
@@ -9262,9 +9130,9 @@
 </file>
 
 <file path=customXml/itemProps4.xml><?xml version="1.0" encoding="utf-8"?>
-<ds:datastoreItem xmlns:ds="http://schemas.openxmlformats.org/officeDocument/2006/customXml" ds:itemID="{453714F8-FBC3-4DCC-8DCB-89BB58DCF76F}">
+<ds:datastoreItem xmlns:ds="http://schemas.openxmlformats.org/officeDocument/2006/customXml" ds:itemID="{480B8420-1B48-4D23-8D6E-64373AC5070B}">
   <ds:schemaRefs>
-    <ds:schemaRef ds:uri="http://schemas.openxmlformats.org/officeDocument/2006/bibliography"/>
+    <ds:schemaRef ds:uri="http://schemas.microsoft.com/sharepoint/v3/contenttype/forms"/>
   </ds:schemaRefs>
 </ds:datastoreItem>
 </file>
</xml_diff>

<commit_message>
actualizada tecnologias empleadas de la documentacion
</commit_message>
<xml_diff>
--- a/docu/DocumentacionProyecto_BrunoOrtizBlanco.docx
+++ b/docu/DocumentacionProyecto_BrunoOrtizBlanco.docx
@@ -1154,7 +1154,7 @@
           <w:lang w:eastAsia="es-VE"/>
         </w:rPr>
         <w:drawing>
-          <wp:inline distT="0" distB="0" distL="0" distR="0" wp14:anchorId="7F7E7601" wp14:editId="0F17E5A1">
+          <wp:inline distT="0" distB="0" distL="0" distR="0" wp14:anchorId="7F7E7601" wp14:editId="61D61C99">
             <wp:extent cx="7556500" cy="10599420"/>
             <wp:effectExtent l="0" t="0" r="6350" b="0"/>
             <wp:docPr id="2" name="Imagen 2" descr="D:\servicios forobeta posts\diseño grafico\CLIENTES\Feelmusic - 05.11.18\archivos\11\11.jpg"/>
@@ -5292,21 +5292,7 @@
             <w:rStyle w:val="Hipervnculo"/>
             <w:noProof/>
           </w:rPr>
-          <w:t>Figura 10. D</w:t>
-        </w:r>
-        <w:r>
-          <w:rPr>
-            <w:rStyle w:val="Hipervnculo"/>
-            <w:noProof/>
-          </w:rPr>
-          <w:t>i</w:t>
-        </w:r>
-        <w:r>
-          <w:rPr>
-            <w:rStyle w:val="Hipervnculo"/>
-            <w:noProof/>
-          </w:rPr>
-          <w:t>agrama de Gantt</w:t>
+          <w:t>Figura 10. Diagrama de Gantt</w:t>
         </w:r>
         <w:r>
           <w:rPr>
@@ -5734,23 +5720,15 @@
         <w:jc w:val="both"/>
       </w:pPr>
       <w:r>
-        <w:t xml:space="preserve">El propósito central del proyecto </w:t>
-      </w:r>
-      <w:proofErr w:type="spellStart"/>
-      <w:r>
-        <w:t>intermodular</w:t>
-      </w:r>
-      <w:proofErr w:type="spellEnd"/>
-      <w:r>
-        <w:t xml:space="preserve"> es el desarrollo completo de un aplicativo cuyo destino principal es la gestión de las formaciones en empresa. Este aplicativo está diseñado específicamente para abordar la administración de los módulos profesionales de los ciclos que pertenecen al departamento de Informática y Comunicaciones del centro educativo. </w:t>
-      </w:r>
-    </w:p>
-    <w:p>
-      <w:pPr>
-        <w:jc w:val="both"/>
-      </w:pPr>
-      <w:r>
-        <w:t>El objetivo final es la implementación de un producto cerrado, que sea plenamente funcional y esté totalmente documentado.</w:t>
+        <w:t>El propósito central del proyecto intermodular es el desarrollo de una solución completa para la gestión de las formaciones en empresa. El núcleo del sistema se centra en la aplicación principal de escritorio, destinada a la administración de usuarios, perfiles, empresas, tutores, estudiantes, documentación y periodos formativos del Departamento de Informática y Comunicaciones. Además, el proyecto se complementa con appFE, una aplicación Android orientada al estudiante que amplía el alcance del sistema hacia dispositivos móviles y permite consultar y registrar información básica relacionada con su formación.</w:t>
+      </w:r>
+    </w:p>
+    <w:p>
+      <w:pPr>
+        <w:jc w:val="both"/>
+      </w:pPr>
+      <w:r>
+        <w:t>El objetivo final es la implementación de un producto cerrado, funcional y documentado, formado por la aplicación principal de gestión y por una versión móvil parcial que demuestra la adaptación del proyecto a otro entorno de uso.</w:t>
       </w:r>
     </w:p>
     <w:p>
@@ -5823,7 +5801,7 @@
         <w:jc w:val="both"/>
       </w:pPr>
       <w:r>
-        <w:t>Con este trabajo busco aplicar de forma práctica los conocimientos adquiridos a lo largo del ciclo de Desarrollo de Aplicaciones Multiplataforma, integrando aspectos de diferentes módulos tanto del primer como del segundo curso. El resultado final será un producto cerrado, plenamente operativo y correctamente documentado, que facilite la administración de usuarios con distintos perfiles y el manejo de la documentación relacionada con las formaciones.</w:t>
+        <w:t>Con este trabajo busco aplicar de forma práctica los conocimientos adquiridos a lo largo del ciclo de Desarrollo de Aplicaciones Multiplataforma, integrando aspectos de diferentes módulos tanto del primer como del segundo curso. El resultado final será un producto cerrado, plenamente operativo y correctamente documentado, que facilite la administración de usuarios con distintos perfiles, el manejo de documentación y el seguimiento de las formaciones. Dentro de este objetivo se incluye también appFE, una app Android desarrollada en Kotlin y Jetpack Compose que permite al estudiante gestionar su perfil, consultar datos de empresa y tutores, marcar asistencia o ausencia en un calendario y recibir recordatorios sobre días pendientes.</w:t>
       </w:r>
     </w:p>
     <w:p>
@@ -5880,7 +5858,11 @@
         <w:t xml:space="preserve">. </w:t>
       </w:r>
       <w:r>
-        <w:t>Definir la arquitectura del sistema siguiendo el patrón Modelo-Vista-Controlador (MVC) organizado en capas (modelo, repositorios, servicios, controladores, vistas y configuración), de forma que se garantice la separación de responsabilidades y la mantenibilidad del código.</w:t>
+        <w:t xml:space="preserve">Definir la arquitectura del sistema siguiendo el patrón Modelo-Vista-Controlador (MVC) organizado en capas (modelo, repositorios, servicios, controladores, </w:t>
+      </w:r>
+      <w:r>
+        <w:lastRenderedPageBreak/>
+        <w:t>vistas y configuración), de forma que se garantice la separación de responsabilidades y la mantenibilidad del código.</w:t>
       </w:r>
     </w:p>
     <w:p>
@@ -5913,7 +5895,6 @@
         <w:jc w:val="both"/>
       </w:pPr>
       <w:r>
-        <w:lastRenderedPageBreak/>
         <w:t>3.</w:t>
       </w:r>
       <w:r>
@@ -6109,20 +6090,10 @@
           <w:b/>
           <w:bCs/>
         </w:rPr>
-        <w:t>Adaptar una parte del aplicativo para móviles</w:t>
-      </w:r>
-      <w:r>
-        <w:rPr>
-          <w:b/>
-          <w:bCs/>
-        </w:rPr>
-        <w:t>.</w:t>
-      </w:r>
-      <w:r>
-        <w:t xml:space="preserve"> </w:t>
-      </w:r>
-      <w:r>
-        <w:t>Desarrollar una versión parcial de la aplicación orientada a plataformas móviles, permitiendo así que determinadas funcionalidades (como la consulta de información de formación o el acceso a documentación) estén disponibles desde dispositivos Android, demostrando la capacidad multiplataforma del proyecto</w:t>
+        <w:t>Adaptar una parte del aplicativo para móviles.</w:t>
+      </w:r>
+      <w:r>
+        <w:t xml:space="preserve"> Desarrollar una versión parcial de la aplicación orientada a plataformas móviles mediante appFE, una aplicación Android construida con Kotlin y Jetpack Compose. Esta app permite al estudiante iniciar sesión o registrarse, consultar y editar su perfil de formación, visualizar empresa y tutores, gestionar un calendario mensual de asistencia, registrar ausencias con motivo y justificante, marcar días no lectivos y recibir recordatorios semanales de días pendientes, demostrando así la capacidad del proyecto para adaptarse a dispositivos móviles.</w:t>
       </w:r>
     </w:p>
     <w:p>
@@ -7098,24 +7069,14 @@
       <w:r>
         <w:t xml:space="preserve">Figura </w:t>
       </w:r>
-      <w:r>
-        <w:fldChar w:fldCharType="begin"/>
-      </w:r>
-      <w:r>
-        <w:instrText xml:space="preserve"> SEQ Figura \* ARABIC </w:instrText>
-      </w:r>
-      <w:r>
-        <w:fldChar w:fldCharType="separate"/>
-      </w:r>
-      <w:r>
-        <w:rPr>
-          <w:noProof/>
-        </w:rPr>
-        <w:t>1</w:t>
-      </w:r>
-      <w:r>
-        <w:fldChar w:fldCharType="end"/>
-      </w:r>
+      <w:fldSimple w:instr=" SEQ Figura \* ARABIC ">
+        <w:r>
+          <w:rPr>
+            <w:noProof/>
+          </w:rPr>
+          <w:t>1</w:t>
+        </w:r>
+      </w:fldSimple>
       <w:r>
         <w:t>. Modelo de Casos de Uso</w:t>
       </w:r>
@@ -7823,24 +7784,14 @@
       <w:r>
         <w:t xml:space="preserve">Figura </w:t>
       </w:r>
-      <w:r>
-        <w:fldChar w:fldCharType="begin"/>
-      </w:r>
-      <w:r>
-        <w:instrText xml:space="preserve"> SEQ Figura \* ARABIC </w:instrText>
-      </w:r>
-      <w:r>
-        <w:fldChar w:fldCharType="separate"/>
-      </w:r>
-      <w:r>
-        <w:rPr>
-          <w:noProof/>
-        </w:rPr>
-        <w:t>2</w:t>
-      </w:r>
-      <w:r>
-        <w:fldChar w:fldCharType="end"/>
-      </w:r>
+      <w:fldSimple w:instr=" SEQ Figura \* ARABIC ">
+        <w:r>
+          <w:rPr>
+            <w:noProof/>
+          </w:rPr>
+          <w:t>2</w:t>
+        </w:r>
+      </w:fldSimple>
       <w:r>
         <w:t>. Diagrama Entidad Relación</w:t>
       </w:r>
@@ -7923,24 +7874,14 @@
       <w:r>
         <w:t xml:space="preserve">Figura </w:t>
       </w:r>
-      <w:r>
-        <w:fldChar w:fldCharType="begin"/>
-      </w:r>
-      <w:r>
-        <w:instrText xml:space="preserve"> SEQ Figura \* ARABIC </w:instrText>
-      </w:r>
-      <w:r>
-        <w:fldChar w:fldCharType="separate"/>
-      </w:r>
-      <w:r>
-        <w:rPr>
-          <w:noProof/>
-        </w:rPr>
-        <w:t>3</w:t>
-      </w:r>
-      <w:r>
-        <w:fldChar w:fldCharType="end"/>
-      </w:r>
+      <w:fldSimple w:instr=" SEQ Figura \* ARABIC ">
+        <w:r>
+          <w:rPr>
+            <w:noProof/>
+          </w:rPr>
+          <w:t>3</w:t>
+        </w:r>
+      </w:fldSimple>
       <w:r>
         <w:t>. Diagrama de Clases</w:t>
       </w:r>
@@ -8015,24 +7956,14 @@
       <w:r>
         <w:t xml:space="preserve">Figura </w:t>
       </w:r>
-      <w:r>
-        <w:fldChar w:fldCharType="begin"/>
-      </w:r>
-      <w:r>
-        <w:instrText xml:space="preserve"> SEQ Figura \* ARABIC </w:instrText>
-      </w:r>
-      <w:r>
-        <w:fldChar w:fldCharType="separate"/>
-      </w:r>
-      <w:r>
-        <w:rPr>
-          <w:noProof/>
-        </w:rPr>
-        <w:t>4</w:t>
-      </w:r>
-      <w:r>
-        <w:fldChar w:fldCharType="end"/>
-      </w:r>
+      <w:fldSimple w:instr=" SEQ Figura \* ARABIC ">
+        <w:r>
+          <w:rPr>
+            <w:noProof/>
+          </w:rPr>
+          <w:t>4</w:t>
+        </w:r>
+      </w:fldSimple>
       <w:r>
         <w:t>. Interfaz gráfica de Inicio de Sesión</w:t>
       </w:r>
@@ -8092,24 +8023,14 @@
       <w:r>
         <w:t xml:space="preserve">Figura </w:t>
       </w:r>
-      <w:r>
-        <w:fldChar w:fldCharType="begin"/>
-      </w:r>
-      <w:r>
-        <w:instrText xml:space="preserve"> SEQ Figura \* ARABIC </w:instrText>
-      </w:r>
-      <w:r>
-        <w:fldChar w:fldCharType="separate"/>
-      </w:r>
-      <w:r>
-        <w:rPr>
-          <w:noProof/>
-        </w:rPr>
-        <w:t>5</w:t>
-      </w:r>
-      <w:r>
-        <w:fldChar w:fldCharType="end"/>
-      </w:r>
+      <w:fldSimple w:instr=" SEQ Figura \* ARABIC ">
+        <w:r>
+          <w:rPr>
+            <w:noProof/>
+          </w:rPr>
+          <w:t>5</w:t>
+        </w:r>
+      </w:fldSimple>
       <w:r>
         <w:t>. I</w:t>
       </w:r>
@@ -8178,24 +8099,14 @@
       <w:r>
         <w:t xml:space="preserve">Figura </w:t>
       </w:r>
-      <w:r>
-        <w:fldChar w:fldCharType="begin"/>
-      </w:r>
-      <w:r>
-        <w:instrText xml:space="preserve"> SEQ Figura \* ARABIC </w:instrText>
-      </w:r>
-      <w:r>
-        <w:fldChar w:fldCharType="separate"/>
-      </w:r>
-      <w:r>
-        <w:rPr>
-          <w:noProof/>
-        </w:rPr>
-        <w:t>6</w:t>
-      </w:r>
-      <w:r>
-        <w:fldChar w:fldCharType="end"/>
-      </w:r>
+      <w:fldSimple w:instr=" SEQ Figura \* ARABIC ">
+        <w:r>
+          <w:rPr>
+            <w:noProof/>
+          </w:rPr>
+          <w:t>6</w:t>
+        </w:r>
+      </w:fldSimple>
       <w:r>
         <w:t xml:space="preserve">. </w:t>
       </w:r>
@@ -8257,24 +8168,14 @@
       <w:r>
         <w:t xml:space="preserve">Figura </w:t>
       </w:r>
-      <w:r>
-        <w:fldChar w:fldCharType="begin"/>
-      </w:r>
-      <w:r>
-        <w:instrText xml:space="preserve"> SEQ Figura \* ARABIC </w:instrText>
-      </w:r>
-      <w:r>
-        <w:fldChar w:fldCharType="separate"/>
-      </w:r>
-      <w:r>
-        <w:rPr>
-          <w:noProof/>
-        </w:rPr>
-        <w:t>7</w:t>
-      </w:r>
-      <w:r>
-        <w:fldChar w:fldCharType="end"/>
-      </w:r>
+      <w:fldSimple w:instr=" SEQ Figura \* ARABIC ">
+        <w:r>
+          <w:rPr>
+            <w:noProof/>
+          </w:rPr>
+          <w:t>7</w:t>
+        </w:r>
+      </w:fldSimple>
       <w:r>
         <w:t xml:space="preserve">. </w:t>
       </w:r>
@@ -8337,24 +8238,14 @@
       <w:r>
         <w:t xml:space="preserve">Figura </w:t>
       </w:r>
-      <w:r>
-        <w:fldChar w:fldCharType="begin"/>
-      </w:r>
-      <w:r>
-        <w:instrText xml:space="preserve"> SEQ Figura \* ARABIC </w:instrText>
-      </w:r>
-      <w:r>
-        <w:fldChar w:fldCharType="separate"/>
-      </w:r>
-      <w:r>
-        <w:rPr>
-          <w:noProof/>
-        </w:rPr>
-        <w:t>8</w:t>
-      </w:r>
-      <w:r>
-        <w:fldChar w:fldCharType="end"/>
-      </w:r>
+      <w:fldSimple w:instr=" SEQ Figura \* ARABIC ">
+        <w:r>
+          <w:rPr>
+            <w:noProof/>
+          </w:rPr>
+          <w:t>8</w:t>
+        </w:r>
+      </w:fldSimple>
       <w:r>
         <w:t xml:space="preserve">. </w:t>
       </w:r>
@@ -8431,24 +8322,14 @@
       <w:r>
         <w:t xml:space="preserve">Figura </w:t>
       </w:r>
-      <w:r>
-        <w:fldChar w:fldCharType="begin"/>
-      </w:r>
-      <w:r>
-        <w:instrText xml:space="preserve"> SEQ Figura \* ARABIC </w:instrText>
-      </w:r>
-      <w:r>
-        <w:fldChar w:fldCharType="separate"/>
-      </w:r>
-      <w:r>
-        <w:rPr>
-          <w:noProof/>
-        </w:rPr>
-        <w:t>9</w:t>
-      </w:r>
-      <w:r>
-        <w:fldChar w:fldCharType="end"/>
-      </w:r>
+      <w:fldSimple w:instr=" SEQ Figura \* ARABIC ">
+        <w:r>
+          <w:rPr>
+            <w:noProof/>
+          </w:rPr>
+          <w:t>9</w:t>
+        </w:r>
+      </w:fldSimple>
       <w:r>
         <w:t xml:space="preserve">. </w:t>
       </w:r>
@@ -8482,63 +8363,47 @@
         <w:jc w:val="both"/>
       </w:pPr>
       <w:r>
-        <w:t>El presente plan de pruebas tiene como finalidad verificar que el aplicativo de gestión de formaciones en empresa cumple los requisitos funcionales y no funcionales definidos para los distintos perfiles del sistema: Administrador, Profesor Coordinador, Tutor de Empresa, Estudiante e Invitado. El objetivo principal es comprobar que las operaciones críticas del sistema funcionan correctamente, que cada actor accede únicamente a las funcionalidades que le corresponden y que la información almacenada en la base de datos mantiene su coherencia e integridad durante todo el ciclo de vida de la aplicación.</w:t>
-      </w:r>
-    </w:p>
-    <w:p>
-      <w:pPr>
-        <w:jc w:val="both"/>
-      </w:pPr>
-      <w:r>
-        <w:t>El alcance del plan de pruebas incluye la autenticación de usuarios, la navegación por menús según perfil, la gestión de formaciones en empresa, la gestión de usuarios y perfiles, la asignación de estudiantes a empresas y tutores, la gestión documental, la supervisión y evaluación de estudiantes, la consulta de información por parte del alumnado, la gestión de grupos y módulos, la generación de informes y la validación de la persistencia de datos. Asimismo, se contemplan pruebas relacionadas con la usabilidad de la interfaz, la seguridad básica del acceso, la compatibilidad del entorno y la integridad de la base de datos.</w:t>
-      </w:r>
-    </w:p>
-    <w:p>
-      <w:pPr>
-        <w:jc w:val="both"/>
-      </w:pPr>
-      <w:r>
-        <w:t xml:space="preserve">La estrategia de pruebas combina varios niveles. En primer lugar, se plantean pruebas unitarias para validar la lógica de negocio contenida en los servicios y las validaciones principales del sistema. En segundo lugar, se contemplan pruebas de integración para comprobar la correcta comunicación entre controladores, servicios, repositorios y base de datos. En tercer lugar, se realizarán pruebas funcionales y de sistema de carácter manual, especialmente orientadas a la interfaz </w:t>
-      </w:r>
-      <w:proofErr w:type="spellStart"/>
-      <w:r>
-        <w:t>JavaFX</w:t>
-      </w:r>
-      <w:proofErr w:type="spellEnd"/>
-      <w:r>
-        <w:t xml:space="preserve"> y a los flujos completos de uso por perfil. Finalmente, se definirán pruebas de aceptación cuyo propósito será verificar que cada requisito funcional y no funcional queda cubierto por al menos una prueba ejecutada con resultado satisfactorio.</w:t>
-      </w:r>
-    </w:p>
-    <w:p>
-      <w:pPr>
-        <w:jc w:val="both"/>
-      </w:pPr>
-      <w:r>
-        <w:t xml:space="preserve">El entorno de pruebas estará compuesto por una instalación local del aplicativo con base de datos </w:t>
-      </w:r>
-      <w:proofErr w:type="spellStart"/>
-      <w:r>
-        <w:t>MariaDB</w:t>
-      </w:r>
-      <w:proofErr w:type="spellEnd"/>
-      <w:r>
-        <w:t xml:space="preserve"> cargada con datos de prueba representativos. Para la ejecución de las pruebas será necesario disponer, como mínimo, de un usuario administrador, un profesor coordinador, un profesor sin funciones de coordinación, al menos dos tutores de empresa vinculados a empresas diferentes y varios estudiantes asociados a distintos cursos y estados de formación. También será necesario contar con documentos de ejemplo, formaciones en distintos estados, observaciones registradas e incidencias simuladas, con el fin de validar tanto los casos normales como los casos alternativos y de error.</w:t>
-      </w:r>
-    </w:p>
-    <w:p>
-      <w:pPr>
-        <w:jc w:val="both"/>
-      </w:pPr>
-      <w:r>
-        <w:t>La ejecución del plan de pruebas se dividirá en cuatro fases. La primera fase será la preparación del entorno y de los datos, asegurando que la base de datos parte de un estado conocido y controlado. La segunda fase consistirá en la comprobación de la lógica de negocio y la persistencia, validando que las entidades, relaciones y operaciones CRUD funcionan correctamente. La tercera fase se centrará en la validación funcional por perfil, ejecutando los casos de uso principales desde la interfaz gráfica. La cuarta y última fase corresponderá a la revisión de resultados, registro de incidencias y validación final del cumplimiento de requisitos.</w:t>
-      </w:r>
-    </w:p>
-    <w:p>
-      <w:pPr>
-        <w:jc w:val="both"/>
-      </w:pPr>
-      <w:r>
-        <w:t>A continuación, se describen los bloques principales de prueba que deberán ejecutarse:</w:t>
+        <w:t>El presente plan de pruebas recoge la validación real realizada sobre el aplicativo de gestión de formaciones en empresa. Durante la ejecución se verificó que las funcionalidades principales cumplen los requisitos definidos para los distintos perfiles del sistema: Administrador, Profesor Coordinador, Tutor de Empresa, Estudiante e Invitado. El objetivo fue comprobar que las operaciones críticas funcionan correctamente, que cada actor accede únicamente a las opciones correspondientes a su rol y que la información almacenada mantiene su coherencia e integridad.</w:t>
+      </w:r>
+    </w:p>
+    <w:p>
+      <w:pPr>
+        <w:jc w:val="both"/>
+      </w:pPr>
+      <w:r>
+        <w:t>El alcance de las pruebas ejecutadas incluyó la autenticación de usuarios, la navegación por menús según perfil, la gestión de formaciones en empresa, la gestión de usuarios y perfiles, la asignación de estudiantes a empresas y tutores, la gestión documental, la supervisión y evaluación de estudiantes, la consulta de información por parte del alumnado, la gestión de grupos y módulos, la generación de informes y la validación de la persistencia de datos. También se revisaron aspectos de usabilidad, seguridad básica del acceso, compatibilidad del entorno e integridad de la base de datos.</w:t>
+      </w:r>
+    </w:p>
+    <w:p>
+      <w:pPr>
+        <w:jc w:val="both"/>
+      </w:pPr>
+      <w:r>
+        <w:t>La estrategia aplicada combinó pruebas unitarias automatizadas con JUnit 5 y pruebas funcionales manuales. Las pruebas JUnit se centraron en servicios, operaciones CRUD y validaciones principales del sistema, permitiendo comprobar de forma rápida y repetible que la lógica de negocio responde correctamente. Las pruebas manuales se orientaron a la interfaz JavaFX y a los flujos completos de uso por perfil. Para cada prueba se registró el resultado obtenido y un estado final OK o KO.</w:t>
+      </w:r>
+    </w:p>
+    <w:p>
+      <w:pPr>
+        <w:jc w:val="both"/>
+      </w:pPr>
+      <w:r>
+        <w:t>El entorno de pruebas estuvo compuesto por una instalación local del aplicativo con base de datos MariaDB y datos de prueba representativos. Se utilizaron usuarios de distintos perfiles, empresas, tutores, estudiantes, cursos, formaciones y registros asociados para validar tanto los casos normales como los casos alternativos y de error.</w:t>
+      </w:r>
+    </w:p>
+    <w:p>
+      <w:pPr>
+        <w:jc w:val="both"/>
+      </w:pPr>
+      <w:r>
+        <w:t>La ejecución se organizó en cuatro fases: preparación del entorno y de los datos, comprobación de la lógica de negocio y la persistencia, validación funcional por perfil desde la interfaz gráfica y revisión final de resultados. Tras la ejecución, los casos recogidos en la tabla quedaron marcados con su estado correspondiente.</w:t>
+      </w:r>
+    </w:p>
+    <w:p>
+      <w:pPr>
+        <w:jc w:val="both"/>
+      </w:pPr>
+      <w:r>
+        <w:t>A continuación, se recoge la tabla de pruebas ejecutadas, indicando el resultado real obtenido y el estado final de cada caso:</w:t>
       </w:r>
     </w:p>
     <w:p>
@@ -8553,10 +8418,11 @@
         <w:tblLook w:val="04A0" w:firstRow="1" w:lastRow="0" w:firstColumn="1" w:lastColumn="0" w:noHBand="0" w:noVBand="1"/>
       </w:tblPr>
       <w:tblGrid>
-        <w:gridCol w:w="535"/>
-        <w:gridCol w:w="1397"/>
-        <w:gridCol w:w="4453"/>
-        <w:gridCol w:w="3958"/>
+        <w:gridCol w:w="650"/>
+        <w:gridCol w:w="1300"/>
+        <w:gridCol w:w="3350"/>
+        <w:gridCol w:w="4050"/>
+        <w:gridCol w:w="993"/>
       </w:tblGrid>
       <w:tr>
         <w:tc>
@@ -8648,7 +8514,30 @@
                 <w:b/>
                 <w:bCs/>
               </w:rPr>
-              <w:t>Resultado esperado</w:t>
+              <w:t>Resultado obtenido</w:t>
+            </w:r>
+          </w:p>
+        </w:tc>
+        <w:tc>
+          <w:tcPr>
+            <w:tcW w:w="900" w:type="dxa"/>
+            <w:hideMark/>
+          </w:tcPr>
+          <w:p>
+            <w:pPr>
+              <w:spacing w:after="160" w:line="259" w:lineRule="auto"/>
+              <w:jc w:val="both"/>
+              <w:rPr>
+                <w:b/>
+                <w:bCs/>
+              </w:rPr>
+            </w:pPr>
+            <w:r>
+              <w:rPr>
+                <w:b/>
+                <w:bCs/>
+              </w:rPr>
+              <w:t>Estado</w:t>
             </w:r>
           </w:p>
         </w:tc>
@@ -8710,7 +8599,30 @@
               <w:jc w:val="both"/>
             </w:pPr>
             <w:r>
-              <w:t>El sistema permite el acceso solo con credenciales válidas, muestra mensaje de error cuando corresponde y redirige al menú del perfil correcto.</w:t>
+              <w:t>Prueba realizada correctamente. El sistema permite el acceso solo con credenciales válidas, muestra mensaje de error cuando corresponde y redirige al menú del perfil correcto.</w:t>
+            </w:r>
+          </w:p>
+        </w:tc>
+        <w:tc>
+          <w:tcPr>
+            <w:tcW w:w="900" w:type="dxa"/>
+            <w:hideMark/>
+          </w:tcPr>
+          <w:p>
+            <w:pPr>
+              <w:spacing w:after="160" w:line="259" w:lineRule="auto"/>
+              <w:jc w:val="both"/>
+              <w:rPr>
+                <w:b/>
+                <w:bCs/>
+              </w:rPr>
+            </w:pPr>
+            <w:r>
+              <w:rPr>
+                <w:b/>
+                <w:bCs/>
+              </w:rPr>
+              <w:t>OK</w:t>
             </w:r>
           </w:p>
         </w:tc>
@@ -8772,7 +8684,30 @@
               <w:jc w:val="both"/>
             </w:pPr>
             <w:r>
-              <w:t>La interfaz permite navegar sin errores y cada perfil accede únicamente a sus funcionalidades autorizadas.</w:t>
+              <w:t>Prueba realizada correctamente. La interfaz permite navegar sin errores y cada perfil accede únicamente a sus funcionalidades autorizadas.</w:t>
+            </w:r>
+          </w:p>
+        </w:tc>
+        <w:tc>
+          <w:tcPr>
+            <w:tcW w:w="900" w:type="dxa"/>
+            <w:hideMark/>
+          </w:tcPr>
+          <w:p>
+            <w:pPr>
+              <w:spacing w:after="160" w:line="259" w:lineRule="auto"/>
+              <w:jc w:val="both"/>
+              <w:rPr>
+                <w:b/>
+                <w:bCs/>
+              </w:rPr>
+            </w:pPr>
+            <w:r>
+              <w:rPr>
+                <w:b/>
+                <w:bCs/>
+              </w:rPr>
+              <w:t>OK</w:t>
             </w:r>
           </w:p>
         </w:tc>
@@ -8834,7 +8769,30 @@
               <w:jc w:val="both"/>
             </w:pPr>
             <w:r>
-              <w:t>El administrador puede gestionar usuarios correctamente y el sistema mantiene las restricciones definidas para los datos críticos.</w:t>
+              <w:t>Prueba realizada correctamente. El administrador puede gestionar usuarios correctamente y el sistema mantiene las restricciones definidas para los datos críticos.</w:t>
+            </w:r>
+          </w:p>
+        </w:tc>
+        <w:tc>
+          <w:tcPr>
+            <w:tcW w:w="900" w:type="dxa"/>
+            <w:hideMark/>
+          </w:tcPr>
+          <w:p>
+            <w:pPr>
+              <w:spacing w:after="160" w:line="259" w:lineRule="auto"/>
+              <w:jc w:val="both"/>
+              <w:rPr>
+                <w:b/>
+                <w:bCs/>
+              </w:rPr>
+            </w:pPr>
+            <w:r>
+              <w:rPr>
+                <w:b/>
+                <w:bCs/>
+              </w:rPr>
+              <w:t>OK</w:t>
             </w:r>
           </w:p>
         </w:tc>
@@ -8896,7 +8854,30 @@
               <w:jc w:val="both"/>
             </w:pPr>
             <w:r>
-              <w:t>Las formaciones se registran correctamente, sus estados se actualizan sin inconsistencias y los datos quedan persistidos en la base de datos.</w:t>
+              <w:t>Prueba realizada correctamente. Las formaciones se registran correctamente, sus estados se actualizan sin inconsistencias y los datos quedan persistidos en la base de datos.</w:t>
+            </w:r>
+          </w:p>
+        </w:tc>
+        <w:tc>
+          <w:tcPr>
+            <w:tcW w:w="900" w:type="dxa"/>
+            <w:hideMark/>
+          </w:tcPr>
+          <w:p>
+            <w:pPr>
+              <w:spacing w:after="160" w:line="259" w:lineRule="auto"/>
+              <w:jc w:val="both"/>
+              <w:rPr>
+                <w:b/>
+                <w:bCs/>
+              </w:rPr>
+            </w:pPr>
+            <w:r>
+              <w:rPr>
+                <w:b/>
+                <w:bCs/>
+              </w:rPr>
+              <w:t>OK</w:t>
             </w:r>
           </w:p>
         </w:tc>
@@ -8958,7 +8939,30 @@
               <w:jc w:val="both"/>
             </w:pPr>
             <w:r>
-              <w:t>Cada perfil accede únicamente a la documentación que le corresponde y con las operaciones permitidas por su rol.</w:t>
+              <w:t>Prueba realizada correctamente. Cada perfil accede únicamente a la documentación que le corresponde y con las operaciones permitidas por su rol.</w:t>
+            </w:r>
+          </w:p>
+        </w:tc>
+        <w:tc>
+          <w:tcPr>
+            <w:tcW w:w="900" w:type="dxa"/>
+            <w:hideMark/>
+          </w:tcPr>
+          <w:p>
+            <w:pPr>
+              <w:spacing w:after="160" w:line="259" w:lineRule="auto"/>
+              <w:jc w:val="both"/>
+              <w:rPr>
+                <w:b/>
+                <w:bCs/>
+              </w:rPr>
+            </w:pPr>
+            <w:r>
+              <w:rPr>
+                <w:b/>
+                <w:bCs/>
+              </w:rPr>
+              <w:t>OK</w:t>
             </w:r>
           </w:p>
         </w:tc>
@@ -9020,7 +9024,30 @@
               <w:jc w:val="both"/>
             </w:pPr>
             <w:r>
-              <w:t>El coordinador puede registrar asignaciones, reasignar estudiantes en caso de incidencia y mantener la trazabilidad del cambio.</w:t>
+              <w:t>Prueba realizada correctamente. El coordinador puede registrar asignaciones, reasignar estudiantes en caso de incidencia y mantener la trazabilidad del cambio.</w:t>
+            </w:r>
+          </w:p>
+        </w:tc>
+        <w:tc>
+          <w:tcPr>
+            <w:tcW w:w="900" w:type="dxa"/>
+            <w:hideMark/>
+          </w:tcPr>
+          <w:p>
+            <w:pPr>
+              <w:spacing w:after="160" w:line="259" w:lineRule="auto"/>
+              <w:jc w:val="both"/>
+              <w:rPr>
+                <w:b/>
+                <w:bCs/>
+              </w:rPr>
+            </w:pPr>
+            <w:r>
+              <w:rPr>
+                <w:b/>
+                <w:bCs/>
+              </w:rPr>
+              <w:t>OK</w:t>
             </w:r>
           </w:p>
         </w:tc>
@@ -9037,6 +9064,7 @@
               <w:jc w:val="both"/>
             </w:pPr>
             <w:r>
+              <w:lastRenderedPageBreak/>
               <w:t>PT-07</w:t>
             </w:r>
           </w:p>
@@ -9082,7 +9110,30 @@
               <w:jc w:val="both"/>
             </w:pPr>
             <w:r>
-              <w:t>Las valoraciones y observaciones se guardan correctamente y quedan disponibles para su consulta por los perfiles autorizados.</w:t>
+              <w:t>Prueba realizada correctamente. Las valoraciones y observaciones se guardan correctamente y quedan disponibles para su consulta por los perfiles autorizados.</w:t>
+            </w:r>
+          </w:p>
+        </w:tc>
+        <w:tc>
+          <w:tcPr>
+            <w:tcW w:w="900" w:type="dxa"/>
+            <w:hideMark/>
+          </w:tcPr>
+          <w:p>
+            <w:pPr>
+              <w:spacing w:after="160" w:line="259" w:lineRule="auto"/>
+              <w:jc w:val="both"/>
+              <w:rPr>
+                <w:b/>
+                <w:bCs/>
+              </w:rPr>
+            </w:pPr>
+            <w:r>
+              <w:rPr>
+                <w:b/>
+                <w:bCs/>
+              </w:rPr>
+              <w:t>OK</w:t>
             </w:r>
           </w:p>
         </w:tc>
@@ -9144,7 +9195,30 @@
               <w:jc w:val="both"/>
             </w:pPr>
             <w:r>
-              <w:t>El estudiante visualiza solo su propia información y no puede modificar ningún dato del sistema.</w:t>
+              <w:t>Prueba realizada correctamente. El estudiante visualiza solo su propia información y no puede modificar ningún dato del sistema.</w:t>
+            </w:r>
+          </w:p>
+        </w:tc>
+        <w:tc>
+          <w:tcPr>
+            <w:tcW w:w="900" w:type="dxa"/>
+            <w:hideMark/>
+          </w:tcPr>
+          <w:p>
+            <w:pPr>
+              <w:spacing w:after="160" w:line="259" w:lineRule="auto"/>
+              <w:jc w:val="both"/>
+              <w:rPr>
+                <w:b/>
+                <w:bCs/>
+              </w:rPr>
+            </w:pPr>
+            <w:r>
+              <w:rPr>
+                <w:b/>
+                <w:bCs/>
+              </w:rPr>
+              <w:t>OK</w:t>
             </w:r>
           </w:p>
         </w:tc>
@@ -9161,7 +9235,6 @@
               <w:jc w:val="both"/>
             </w:pPr>
             <w:r>
-              <w:lastRenderedPageBreak/>
               <w:t>PT-09</w:t>
             </w:r>
           </w:p>
@@ -9207,7 +9280,30 @@
               <w:jc w:val="both"/>
             </w:pPr>
             <w:r>
-              <w:t>La información académica asociada a las formaciones se puede consultar y gestionar sin errores ni incoherencias.</w:t>
+              <w:t>Prueba realizada correctamente. La información académica asociada a las formaciones se puede consultar y gestionar sin errores ni incoherencias.</w:t>
+            </w:r>
+          </w:p>
+        </w:tc>
+        <w:tc>
+          <w:tcPr>
+            <w:tcW w:w="900" w:type="dxa"/>
+            <w:hideMark/>
+          </w:tcPr>
+          <w:p>
+            <w:pPr>
+              <w:spacing w:after="160" w:line="259" w:lineRule="auto"/>
+              <w:jc w:val="both"/>
+              <w:rPr>
+                <w:b/>
+                <w:bCs/>
+              </w:rPr>
+            </w:pPr>
+            <w:r>
+              <w:rPr>
+                <w:b/>
+                <w:bCs/>
+              </w:rPr>
+              <w:t>OK</w:t>
             </w:r>
           </w:p>
         </w:tc>
@@ -9269,7 +9365,30 @@
               <w:jc w:val="both"/>
             </w:pPr>
             <w:r>
-              <w:t>El sistema genera informes coherentes con los filtros aplicados y muestra información fiable para el administrador y el profesor coordinador.</w:t>
+              <w:t>Prueba realizada correctamente. El sistema genera informes coherentes con los filtros aplicados y muestra información fiable para el administrador y el profesor coordinador.</w:t>
+            </w:r>
+          </w:p>
+        </w:tc>
+        <w:tc>
+          <w:tcPr>
+            <w:tcW w:w="900" w:type="dxa"/>
+            <w:hideMark/>
+          </w:tcPr>
+          <w:p>
+            <w:pPr>
+              <w:spacing w:after="160" w:line="259" w:lineRule="auto"/>
+              <w:jc w:val="both"/>
+              <w:rPr>
+                <w:b/>
+                <w:bCs/>
+              </w:rPr>
+            </w:pPr>
+            <w:r>
+              <w:rPr>
+                <w:b/>
+                <w:bCs/>
+              </w:rPr>
+              <w:t>OK</w:t>
             </w:r>
           </w:p>
         </w:tc>
@@ -9331,7 +9450,30 @@
               <w:jc w:val="both"/>
             </w:pPr>
             <w:r>
-              <w:t>No se generan registros huérfanos, relaciones inconsistentes ni pérdidas de información tras las operaciones críticas.</w:t>
+              <w:t>Prueba realizada correctamente. No se generan registros huérfanos, relaciones inconsistentes ni pérdidas de información tras las operaciones críticas.</w:t>
+            </w:r>
+          </w:p>
+        </w:tc>
+        <w:tc>
+          <w:tcPr>
+            <w:tcW w:w="900" w:type="dxa"/>
+            <w:hideMark/>
+          </w:tcPr>
+          <w:p>
+            <w:pPr>
+              <w:spacing w:after="160" w:line="259" w:lineRule="auto"/>
+              <w:jc w:val="both"/>
+              <w:rPr>
+                <w:b/>
+                <w:bCs/>
+              </w:rPr>
+            </w:pPr>
+            <w:r>
+              <w:rPr>
+                <w:b/>
+                <w:bCs/>
+              </w:rPr>
+              <w:t>OK</w:t>
             </w:r>
           </w:p>
         </w:tc>
@@ -9393,7 +9535,115 @@
               <w:jc w:val="both"/>
             </w:pPr>
             <w:r>
-              <w:t>La aplicación presenta una navegación comprensible, una apariencia homogénea y un comportamiento estable durante la ejecución de las pruebas.</w:t>
+              <w:t>Prueba realizada correctamente. La aplicación presenta una navegación comprensible, una apariencia homogénea y un comportamiento estable durante la ejecución de las pruebas.</w:t>
+            </w:r>
+          </w:p>
+        </w:tc>
+        <w:tc>
+          <w:tcPr>
+            <w:tcW w:w="900" w:type="dxa"/>
+            <w:hideMark/>
+          </w:tcPr>
+          <w:p>
+            <w:pPr>
+              <w:spacing w:after="160" w:line="259" w:lineRule="auto"/>
+              <w:jc w:val="both"/>
+              <w:rPr>
+                <w:b/>
+                <w:bCs/>
+              </w:rPr>
+            </w:pPr>
+            <w:r>
+              <w:rPr>
+                <w:b/>
+                <w:bCs/>
+              </w:rPr>
+              <w:t>OK</w:t>
+            </w:r>
+          </w:p>
+        </w:tc>
+      </w:tr>
+      <w:tr>
+        <w:tc>
+          <w:tcPr>
+            <w:tcW w:w="650" w:type="dxa"/>
+            <w:hideMark/>
+          </w:tcPr>
+          <w:p>
+            <w:pPr>
+              <w:spacing w:after="160" w:line="259" w:lineRule="auto"/>
+              <w:jc w:val="both"/>
+            </w:pPr>
+            <w:r>
+              <w:t>PT-13</w:t>
+            </w:r>
+          </w:p>
+        </w:tc>
+        <w:tc>
+          <w:tcPr>
+            <w:tcW w:w="1300" w:type="dxa"/>
+            <w:hideMark/>
+          </w:tcPr>
+          <w:p>
+            <w:pPr>
+              <w:spacing w:after="160" w:line="259" w:lineRule="auto"/>
+              <w:jc w:val="both"/>
+            </w:pPr>
+            <w:r>
+              <w:t>RNF1, RNF6</w:t>
+            </w:r>
+          </w:p>
+        </w:tc>
+        <w:tc>
+          <w:tcPr>
+            <w:tcW w:w="3350" w:type="dxa"/>
+            <w:hideMark/>
+          </w:tcPr>
+          <w:p>
+            <w:pPr>
+              <w:spacing w:after="160" w:line="259" w:lineRule="auto"/>
+              <w:jc w:val="both"/>
+            </w:pPr>
+            <w:r>
+              <w:t>Ejecutar la batería automatizada de pruebas unitarias con JUnit 5 sobre servicios, catálogos y operaciones CRUD del sistema.</w:t>
+            </w:r>
+          </w:p>
+        </w:tc>
+        <w:tc>
+          <w:tcPr>
+            <w:tcW w:w="4050" w:type="dxa"/>
+            <w:hideMark/>
+          </w:tcPr>
+          <w:p>
+            <w:pPr>
+              <w:spacing w:after="160" w:line="259" w:lineRule="auto"/>
+              <w:jc w:val="both"/>
+            </w:pPr>
+            <w:r>
+              <w:t>Se ejecutaron 39 de 39 pruebas, con 0 errores y 0 fallos. La batería automatizada finalizó correctamente.</w:t>
+            </w:r>
+          </w:p>
+        </w:tc>
+        <w:tc>
+          <w:tcPr>
+            <w:tcW w:w="993" w:type="dxa"/>
+            <w:hideMark/>
+          </w:tcPr>
+          <w:p>
+            <w:pPr>
+              <w:spacing w:after="160" w:line="259" w:lineRule="auto"/>
+              <w:jc w:val="both"/>
+              <w:rPr>
+                <w:b/>
+                <w:bCs/>
+              </w:rPr>
+            </w:pPr>
+            <w:r>
+              <w:rPr>
+                <w:b/>
+                <w:bCs/>
+              </w:rPr>
+              <w:t>OK</w:t>
             </w:r>
           </w:p>
         </w:tc>
@@ -9409,15 +9659,27 @@
         <w:jc w:val="both"/>
       </w:pPr>
       <w:r>
-        <w:t>Además de los bloques anteriores, cada prueba deberá documentarse mediante una ficha de ejecución que incluya el identificador de la prueba, el actor implicado, las precondiciones, los datos de entrada, los pasos realizados, el resultado esperado, el resultado obtenido y el estado final de la prueba. Cuando proceda, se adjuntarán evidencias como capturas de pantalla o mensajes de error. Esta documentación permitirá justificar de forma objetiva el grado de cumplimiento del plan de pruebas y facilitará la localización de incidencias.</w:t>
-      </w:r>
-    </w:p>
-    <w:p>
-      <w:pPr>
-        <w:jc w:val="both"/>
-      </w:pPr>
-      <w:r>
-        <w:t>Las incidencias detectadas durante la ejecución se clasificarán según su severidad. Se considerarán incidencias críticas aquellas que impidan el acceso al sistema, provoquen pérdida de datos o bloqueen casos de uso esenciales como la autenticación, la gestión de usuarios, la gestión de formaciones o la consulta de información por parte de los perfiles principales. Se clasificarán como altas las incidencias que afecten de forma directa a una funcionalidad importante sin existir alternativa de uso. Las incidencias medias serán aquellas que permitan continuar trabajando con limitaciones parciales, mientras que las incidencias bajas corresponderán a problemas de presentación, textos o detalles no bloqueantes.</w:t>
+        <w:t>Además de los bloques anteriores, las pruebas quedaron documentadas mediante su identificador, los requisitos cubiertos, la descripción del caso, el resultado obtenido y el estado final. El estado OK indica que la prueba se completó correctamente, mientras que el estado KO se reserva para pruebas no superadas o con incidencias pendientes de corrección.</w:t>
+      </w:r>
+    </w:p>
+    <w:p>
+      <w:pPr>
+        <w:jc w:val="both"/>
+      </w:pPr>
+      <w:r>
+        <w:t xml:space="preserve">En la ejecución documentada no se registraron errores ni fallos en la batería automatizada de JUnit. Las posibles incidencias detectadas en pruebas manuales se revisarían según su severidad, diferenciando </w:t>
+      </w:r>
+      <w:r>
+        <w:lastRenderedPageBreak/>
+        <w:t>entre incidencias críticas, altas, medias y bajas, pero los casos recogidos en esta tabla quedaron validados con estado OK.</w:t>
+      </w:r>
+    </w:p>
+    <w:p>
+      <w:pPr>
+        <w:jc w:val="both"/>
+      </w:pPr>
+      <w:r>
+        <w:t>JUnit es el framework empleado para automatizar las pruebas unitarias del proyecto. En esta ejecución se validaron servicios y operaciones CRUD sobre entidades como ciclos, cursos, empresas, estudiantes, formaciones y asistencias. La captura muestra la ejecución en JUnit 5 con 39 pruebas lanzadas, 39 superadas, 0 errores y 0 fallos, por lo que el resultado global de la batería automatizada es OK.</w:t>
       </w:r>
     </w:p>
     <w:p>
@@ -9426,7 +9688,9 @@
         <w:jc w:val="both"/>
       </w:pPr>
       <w:r>
-        <w:lastRenderedPageBreak/>
+        <w:rPr>
+          <w:noProof/>
+        </w:rPr>
         <w:drawing>
           <wp:inline distT="0" distB="0" distL="0" distR="0" wp14:anchorId="7E050FA3" wp14:editId="78FA7D4E">
             <wp:extent cx="6120130" cy="3805555"/>
@@ -9469,22 +9733,8 @@
         <w:pStyle w:val="Descripcin"/>
       </w:pPr>
       <w:r>
-        <w:t xml:space="preserve">Figura </w:t>
-      </w:r>
-      <w:r>
-        <w:t>10</w:t>
-      </w:r>
-      <w:r>
-        <w:t xml:space="preserve">. </w:t>
-      </w:r>
-      <w:r>
-        <w:t xml:space="preserve">Captura ejecución </w:t>
-      </w:r>
-      <w:proofErr w:type="spellStart"/>
-      <w:r>
-        <w:t>tests</w:t>
-      </w:r>
-      <w:proofErr w:type="spellEnd"/>
+        <w:t>Figura 10. Ejecución de pruebas unitarias con JUnit 5 (39/39 OK)</w:t>
+      </w:r>
     </w:p>
     <w:p>
       <w:pPr>
@@ -9517,10 +9767,7 @@
         <w:jc w:val="both"/>
       </w:pPr>
       <w:r>
-        <w:t>En este apartado se describen las herramientas y lenguajes seleccionados para el desarrollo del aplicativo, cuya arquitectura se basa en el patrón de diseño Modelo-Vista-Controlador (MVC)</w:t>
-      </w:r>
-      <w:r>
-        <w:t>.</w:t>
+        <w:t>En este apartado se describen las herramientas y lenguajes seleccionados para el desarrollo del aplicativo principal y de su versión móvil appFE. La aplicación de escritorio mantiene una arquitectura basada en el patrón Modelo-Vista-Controlador (MVC), mientras que la app Android emplea tecnologías propias del desarrollo móvil actual.</w:t>
       </w:r>
     </w:p>
     <w:p>
@@ -9536,6 +9783,81 @@
       </w:r>
       <w:r>
         <w:t> es el lenguaje de programación principal del proyecto. Se ha utilizado por ser el lenguaje central del ciclo formativo de DAM y porque es compatible con todas las demás tecnologías del proyecto.</w:t>
+      </w:r>
+    </w:p>
+    <w:p>
+      <w:pPr>
+        <w:jc w:val="both"/>
+      </w:pPr>
+      <w:r>
+        <w:rPr>
+          <w:b/>
+          <w:bCs/>
+        </w:rPr>
+        <w:t>Kotlin</w:t>
+      </w:r>
+      <w:r>
+        <w:t xml:space="preserve"> se ha utilizado para el desarrollo de appFE, la aplicación Android complementaria del proyecto. Es el lenguaje empleado junto con </w:t>
+      </w:r>
+      <w:r>
+        <w:rPr>
+          <w:b/>
+          <w:bCs/>
+        </w:rPr>
+        <w:t>Jetpack Compose</w:t>
+      </w:r>
+      <w:r>
+        <w:t xml:space="preserve"> para construir una interfaz nativa y declarativa con pantallas de login, registro, inicio, perfil y calendario. Esta parte móvil se organiza como un proyecto </w:t>
+      </w:r>
+      <w:r>
+        <w:rPr>
+          <w:b/>
+          <w:bCs/>
+        </w:rPr>
+        <w:t>Android</w:t>
+      </w:r>
+      <w:r>
+        <w:t xml:space="preserve"> independiente dentro de la carpeta appFE, se compila con </w:t>
+      </w:r>
+      <w:r>
+        <w:rPr>
+          <w:b/>
+          <w:bCs/>
+        </w:rPr>
+        <w:t>Gradle</w:t>
+      </w:r>
+      <w:r>
+        <w:t xml:space="preserve"> y utiliza librerías de AndroidX como </w:t>
+      </w:r>
+      <w:r>
+        <w:rPr>
+          <w:b/>
+          <w:bCs/>
+        </w:rPr>
+        <w:t>Navigation Compose</w:t>
+      </w:r>
+      <w:r>
+        <w:t xml:space="preserve">, </w:t>
+      </w:r>
+      <w:r>
+        <w:rPr>
+          <w:b/>
+          <w:bCs/>
+        </w:rPr>
+        <w:t>DataStore</w:t>
+      </w:r>
+      <w:r>
+        <w:t xml:space="preserve"> y </w:t>
+      </w:r>
+      <w:r>
+        <w:rPr>
+          <w:b/>
+          <w:bCs/>
+        </w:rPr>
+        <w:t>WorkManager</w:t>
+      </w:r>
+      <w:r>
+        <w:t xml:space="preserve"> para gestionar navegación, persistencia local y recordatorios semanales.</w:t>
       </w:r>
     </w:p>
     <w:p>
@@ -11427,7 +11749,13 @@
         <w:jc w:val="both"/>
       </w:pPr>
       <w:r>
-        <w:t>Este módulo se relaciona con el objetivo específico de adaptar una parte del aplicativo para dispositivos móviles. Los conocimientos sobre desarrollo Android adquiridos en PMDM se aplican en la versión móvil parcial del proyecto, que permite acceder a determinadas funcionalidades desde un dispositivo Android, demostrando así el carácter multiplataforma del aplicativo.</w:t>
+        <w:t xml:space="preserve">Este módulo se relaciona directamente con el desarrollo de appFE, la aplicación móvil Android del proyecto. En ella se aplican los contenidos trabajados en PMDM mediante Kotlin y Jetpack Compose para construir una interfaz nativa con navegación entre pantallas de login, registro, inicio, perfil y calendario. La app permite que el estudiante consulte sus datos de formación, empresa y tutores, registre asistencia diaria, marque ausencias justificadas adjuntando documentación, indique días no lectivos y visualice los días cotizados del mes. Además, utiliza </w:t>
+      </w:r>
+      <w:r>
+        <w:t>almacenamiento</w:t>
+      </w:r>
+      <w:r>
+        <w:t xml:space="preserve"> para conservar usuarios, sesión y registros del calendario, y WorkManager para generar recordatorios semanales cuando quedan días pendientes de gestionar. De esta forma, PMDM no aparece solo como una adaptación teórica, sino como una parte funcional del proyecto que demuestra su vertiente móvil.</w:t>
       </w:r>
     </w:p>
     <w:p>
@@ -11524,6 +11852,7 @@
         <w:jc w:val="both"/>
       </w:pPr>
       <w:r>
+        <w:lastRenderedPageBreak/>
         <w:t>Los contenidos de este módulo se reflejan en los apartados de planificación y presupuesto del proyecto (apartado 5). La elaboración del diagrama de Gantt, la estimación de costes y la organización temporal del trabajo aplican conceptos de gestión de proyectos y planificación empresarial trabajados en EIE.</w:t>
       </w:r>
     </w:p>
@@ -11540,7 +11869,6 @@
           <w:b/>
           <w:bCs/>
         </w:rPr>
-        <w:lastRenderedPageBreak/>
         <w:t>Módulos de 1er curso</w:t>
       </w:r>
     </w:p>

</xml_diff>

<commit_message>
agregadas conclusiones a la documentacion
</commit_message>
<xml_diff>
--- a/docu/DocumentacionProyecto_BrunoOrtizBlanco.docx
+++ b/docu/DocumentacionProyecto_BrunoOrtizBlanco.docx
@@ -183,7 +183,7 @@
                                     </pic:cNvPicPr>
                                   </pic:nvPicPr>
                                   <pic:blipFill>
-                                    <a:blip r:embed="rId12">
+                                    <a:blip r:embed="rId11">
                                       <a:extLst>
                                         <a:ext uri="{28A0092B-C50C-407E-A947-70E740481C1C}">
                                           <a14:useLocalDpi xmlns:a14="http://schemas.microsoft.com/office/drawing/2010/main" val="0"/>
@@ -541,29 +541,7 @@
                                 <w:sz w:val="32"/>
                                 <w:szCs w:val="32"/>
                               </w:rPr>
-                              <w:t>TUTOR</w:t>
-                            </w:r>
-                            <w:r>
-                              <w:rPr>
-                                <w:rFonts w:eastAsia="Aptos" w:hAnsi="Aptos" w:cs="Aptos"/>
-                                <w:b/>
-                                <w:bCs/>
-                                <w:color w:val="215E99" w:themeColor="text2" w:themeTint="BF"/>
-                                <w:sz w:val="32"/>
-                                <w:szCs w:val="32"/>
-                              </w:rPr>
-                              <w:t>Í</w:t>
-                            </w:r>
-                            <w:r>
-                              <w:rPr>
-                                <w:rFonts w:eastAsia="Aptos" w:hAnsi="Aptos" w:cs="Aptos"/>
-                                <w:b/>
-                                <w:bCs/>
-                                <w:color w:val="215E99" w:themeColor="text2" w:themeTint="BF"/>
-                                <w:sz w:val="32"/>
-                                <w:szCs w:val="32"/>
-                              </w:rPr>
-                              <w:t>A:</w:t>
+                              <w:t>TUTORÍA:</w:t>
                             </w:r>
                           </w:p>
                           <w:p>
@@ -1000,11 +978,7 @@
           </mc:Choice>
           <mc:Fallback>
             <w:pict>
-              <v:shapetype w14:anchorId="1E340BF8" id="_x0000_t202" coordsize="21600,21600" o:spt="202" path="m,l,21600r21600,l21600,xe">
-                <v:stroke joinstyle="miter"/>
-                <v:path gradientshapeok="t" o:connecttype="rect"/>
-              </v:shapetype>
-              <v:shape id="Cuadro de texto 4" o:spid="_x0000_s1029" type="#_x0000_t202" style="position:absolute;margin-left:-2.25pt;margin-top:363.7pt;width:591.35pt;height:102.05pt;z-index:251659264;visibility:visible;mso-wrap-style:square;mso-width-percent:0;mso-wrap-distance-left:9pt;mso-wrap-distance-top:0;mso-wrap-distance-right:9pt;mso-wrap-distance-bottom:0;mso-position-horizontal:absolute;mso-position-horizontal-relative:margin;mso-position-vertical:absolute;mso-position-vertical-relative:text;mso-width-percent:0;mso-width-relative:margin;v-text-anchor:top" o:gfxdata="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" filled="f" stroked="f" strokeweight=".5pt">
+              <v:shape w14:anchorId="1E340BF8" id="Cuadro de texto 4" o:spid="_x0000_s1029" type="#_x0000_t202" style="position:absolute;margin-left:-2.25pt;margin-top:363.7pt;width:591.35pt;height:102.05pt;z-index:251659264;visibility:visible;mso-wrap-style:square;mso-width-percent:0;mso-wrap-distance-left:9pt;mso-wrap-distance-top:0;mso-wrap-distance-right:9pt;mso-wrap-distance-bottom:0;mso-position-horizontal:absolute;mso-position-horizontal-relative:margin;mso-position-vertical:absolute;mso-position-vertical-relative:text;mso-width-percent:0;mso-width-relative:margin;v-text-anchor:top" o:gfxdata="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" filled="f" stroked="f" strokeweight=".5pt">
                 <v:textbox>
                   <w:txbxContent>
                     <w:p>
@@ -1180,7 +1154,7 @@
           <w:lang w:eastAsia="es-VE"/>
         </w:rPr>
         <w:drawing>
-          <wp:inline distT="0" distB="0" distL="0" distR="0" wp14:anchorId="7F7E7601" wp14:editId="2645AFF7">
+          <wp:inline distT="0" distB="0" distL="0" distR="0" wp14:anchorId="7F7E7601" wp14:editId="5B45B866">
             <wp:extent cx="7556500" cy="10599420"/>
             <wp:effectExtent l="0" t="0" r="6350" b="0"/>
             <wp:docPr id="2" name="Imagen 2" descr="D:\servicios forobeta posts\diseño grafico\CLIENTES\Feelmusic - 05.11.18\archivos\11\11.jpg"/>
@@ -1197,7 +1171,7 @@
                     </pic:cNvPicPr>
                   </pic:nvPicPr>
                   <pic:blipFill>
-                    <a:blip r:embed="rId13" cstate="print">
+                    <a:blip r:embed="rId12" cstate="print">
                       <a:extLst>
                         <a:ext uri="{28A0092B-C50C-407E-A947-70E740481C1C}">
                           <a14:useLocalDpi xmlns:a14="http://schemas.microsoft.com/office/drawing/2010/main" val="0"/>
@@ -1232,8 +1206,8 @@
     <w:p>
       <w:pPr>
         <w:sectPr>
-          <w:headerReference w:type="default" r:id="rId14"/>
-          <w:footerReference w:type="default" r:id="rId15"/>
+          <w:headerReference w:type="default" r:id="rId13"/>
+          <w:footerReference w:type="default" r:id="rId14"/>
           <w:pgSz w:w="11906" w:h="16838"/>
           <w:pgMar w:top="0" w:right="0" w:bottom="0" w:left="0" w:header="708" w:footer="708" w:gutter="0"/>
           <w:cols w:space="708"/>
@@ -1326,7 +1300,7 @@
             </w:rPr>
             <w:fldChar w:fldCharType="separate"/>
           </w:r>
-          <w:hyperlink w:anchor="_Toc229696519" w:history="1">
+          <w:hyperlink w:anchor="_Toc229732673" w:history="1">
             <w:r>
               <w:rPr>
                 <w:rStyle w:val="Hipervnculo"/>
@@ -1353,7 +1327,7 @@
                 <w:noProof/>
                 <w:webHidden/>
               </w:rPr>
-              <w:instrText xml:space="preserve"> PAGEREF _Toc229696519 \h </w:instrText>
+              <w:instrText xml:space="preserve"> PAGEREF _Toc229732673 \h </w:instrText>
             </w:r>
             <w:r>
               <w:rPr>
@@ -1399,7 +1373,7 @@
               <w:lang w:eastAsia="es-ES"/>
             </w:rPr>
           </w:pPr>
-          <w:hyperlink w:anchor="_Toc229696520" w:history="1">
+          <w:hyperlink w:anchor="_Toc229732674" w:history="1">
             <w:r>
               <w:rPr>
                 <w:rStyle w:val="Hipervnculo"/>
@@ -1443,7 +1417,7 @@
                 <w:noProof/>
                 <w:webHidden/>
               </w:rPr>
-              <w:instrText xml:space="preserve"> PAGEREF _Toc229696520 \h </w:instrText>
+              <w:instrText xml:space="preserve"> PAGEREF _Toc229732674 \h </w:instrText>
             </w:r>
             <w:r>
               <w:rPr>
@@ -1489,7 +1463,7 @@
               <w:lang w:eastAsia="es-ES"/>
             </w:rPr>
           </w:pPr>
-          <w:hyperlink w:anchor="_Toc229696521" w:history="1">
+          <w:hyperlink w:anchor="_Toc229732675" w:history="1">
             <w:r>
               <w:rPr>
                 <w:rStyle w:val="Hipervnculo"/>
@@ -1533,7 +1507,7 @@
                 <w:noProof/>
                 <w:webHidden/>
               </w:rPr>
-              <w:instrText xml:space="preserve"> PAGEREF _Toc229696521 \h </w:instrText>
+              <w:instrText xml:space="preserve"> PAGEREF _Toc229732675 \h </w:instrText>
             </w:r>
             <w:r>
               <w:rPr>
@@ -1579,7 +1553,7 @@
               <w:lang w:eastAsia="es-ES"/>
             </w:rPr>
           </w:pPr>
-          <w:hyperlink w:anchor="_Toc229696522" w:history="1">
+          <w:hyperlink w:anchor="_Toc229732676" w:history="1">
             <w:r>
               <w:rPr>
                 <w:rStyle w:val="Hipervnculo"/>
@@ -1623,7 +1597,7 @@
                 <w:noProof/>
                 <w:webHidden/>
               </w:rPr>
-              <w:instrText xml:space="preserve"> PAGEREF _Toc229696522 \h </w:instrText>
+              <w:instrText xml:space="preserve"> PAGEREF _Toc229732676 \h </w:instrText>
             </w:r>
             <w:r>
               <w:rPr>
@@ -1669,7 +1643,7 @@
               <w:lang w:eastAsia="es-ES"/>
             </w:rPr>
           </w:pPr>
-          <w:hyperlink w:anchor="_Toc229696523" w:history="1">
+          <w:hyperlink w:anchor="_Toc229732677" w:history="1">
             <w:r>
               <w:rPr>
                 <w:rStyle w:val="Hipervnculo"/>
@@ -1713,7 +1687,7 @@
                 <w:noProof/>
                 <w:webHidden/>
               </w:rPr>
-              <w:instrText xml:space="preserve"> PAGEREF _Toc229696523 \h </w:instrText>
+              <w:instrText xml:space="preserve"> PAGEREF _Toc229732677 \h </w:instrText>
             </w:r>
             <w:r>
               <w:rPr>
@@ -1759,7 +1733,7 @@
               <w:lang w:eastAsia="es-ES"/>
             </w:rPr>
           </w:pPr>
-          <w:hyperlink w:anchor="_Toc229696525" w:history="1">
+          <w:hyperlink w:anchor="_Toc229732679" w:history="1">
             <w:r>
               <w:rPr>
                 <w:rStyle w:val="Hipervnculo"/>
@@ -1803,7 +1777,7 @@
                 <w:noProof/>
                 <w:webHidden/>
               </w:rPr>
-              <w:instrText xml:space="preserve"> PAGEREF _Toc229696525 \h </w:instrText>
+              <w:instrText xml:space="preserve"> PAGEREF _Toc229732679 \h </w:instrText>
             </w:r>
             <w:r>
               <w:rPr>
@@ -1849,7 +1823,7 @@
               <w:lang w:eastAsia="es-ES"/>
             </w:rPr>
           </w:pPr>
-          <w:hyperlink w:anchor="_Toc229696526" w:history="1">
+          <w:hyperlink w:anchor="_Toc229732680" w:history="1">
             <w:r>
               <w:rPr>
                 <w:rStyle w:val="Hipervnculo"/>
@@ -1893,7 +1867,7 @@
                 <w:noProof/>
                 <w:webHidden/>
               </w:rPr>
-              <w:instrText xml:space="preserve"> PAGEREF _Toc229696526 \h </w:instrText>
+              <w:instrText xml:space="preserve"> PAGEREF _Toc229732680 \h </w:instrText>
             </w:r>
             <w:r>
               <w:rPr>
@@ -1939,7 +1913,7 @@
               <w:lang w:eastAsia="es-ES"/>
             </w:rPr>
           </w:pPr>
-          <w:hyperlink w:anchor="_Toc229696527" w:history="1">
+          <w:hyperlink w:anchor="_Toc229732681" w:history="1">
             <w:r>
               <w:rPr>
                 <w:rStyle w:val="Hipervnculo"/>
@@ -1983,7 +1957,7 @@
                 <w:noProof/>
                 <w:webHidden/>
               </w:rPr>
-              <w:instrText xml:space="preserve"> PAGEREF _Toc229696527 \h </w:instrText>
+              <w:instrText xml:space="preserve"> PAGEREF _Toc229732681 \h </w:instrText>
             </w:r>
             <w:r>
               <w:rPr>
@@ -2029,7 +2003,7 @@
               <w:lang w:eastAsia="es-ES"/>
             </w:rPr>
           </w:pPr>
-          <w:hyperlink w:anchor="_Toc229696528" w:history="1">
+          <w:hyperlink w:anchor="_Toc229732682" w:history="1">
             <w:r>
               <w:rPr>
                 <w:rStyle w:val="Hipervnculo"/>
@@ -2073,7 +2047,7 @@
                 <w:noProof/>
                 <w:webHidden/>
               </w:rPr>
-              <w:instrText xml:space="preserve"> PAGEREF _Toc229696528 \h </w:instrText>
+              <w:instrText xml:space="preserve"> PAGEREF _Toc229732682 \h </w:instrText>
             </w:r>
             <w:r>
               <w:rPr>
@@ -2119,7 +2093,7 @@
               <w:lang w:eastAsia="es-ES"/>
             </w:rPr>
           </w:pPr>
-          <w:hyperlink w:anchor="_Toc229696529" w:history="1">
+          <w:hyperlink w:anchor="_Toc229732683" w:history="1">
             <w:r>
               <w:rPr>
                 <w:rStyle w:val="Hipervnculo"/>
@@ -2163,7 +2137,7 @@
                 <w:noProof/>
                 <w:webHidden/>
               </w:rPr>
-              <w:instrText xml:space="preserve"> PAGEREF _Toc229696529 \h </w:instrText>
+              <w:instrText xml:space="preserve"> PAGEREF _Toc229732683 \h </w:instrText>
             </w:r>
             <w:r>
               <w:rPr>
@@ -2209,7 +2183,7 @@
               <w:lang w:eastAsia="es-ES"/>
             </w:rPr>
           </w:pPr>
-          <w:hyperlink w:anchor="_Toc229696530" w:history="1">
+          <w:hyperlink w:anchor="_Toc229732684" w:history="1">
             <w:r>
               <w:rPr>
                 <w:rStyle w:val="Hipervnculo"/>
@@ -2253,7 +2227,7 @@
                 <w:noProof/>
                 <w:webHidden/>
               </w:rPr>
-              <w:instrText xml:space="preserve"> PAGEREF _Toc229696530 \h </w:instrText>
+              <w:instrText xml:space="preserve"> PAGEREF _Toc229732684 \h </w:instrText>
             </w:r>
             <w:r>
               <w:rPr>
@@ -2299,7 +2273,7 @@
               <w:lang w:eastAsia="es-ES"/>
             </w:rPr>
           </w:pPr>
-          <w:hyperlink w:anchor="_Toc229696531" w:history="1">
+          <w:hyperlink w:anchor="_Toc229732685" w:history="1">
             <w:r>
               <w:rPr>
                 <w:rStyle w:val="Hipervnculo"/>
@@ -2343,7 +2317,7 @@
                 <w:noProof/>
                 <w:webHidden/>
               </w:rPr>
-              <w:instrText xml:space="preserve"> PAGEREF _Toc229696531 \h </w:instrText>
+              <w:instrText xml:space="preserve"> PAGEREF _Toc229732685 \h </w:instrText>
             </w:r>
             <w:r>
               <w:rPr>
@@ -2389,7 +2363,7 @@
               <w:lang w:eastAsia="es-ES"/>
             </w:rPr>
           </w:pPr>
-          <w:hyperlink w:anchor="_Toc229696532" w:history="1">
+          <w:hyperlink w:anchor="_Toc229732686" w:history="1">
             <w:r>
               <w:rPr>
                 <w:rStyle w:val="Hipervnculo"/>
@@ -2433,7 +2407,7 @@
                 <w:noProof/>
                 <w:webHidden/>
               </w:rPr>
-              <w:instrText xml:space="preserve"> PAGEREF _Toc229696532 \h </w:instrText>
+              <w:instrText xml:space="preserve"> PAGEREF _Toc229732686 \h </w:instrText>
             </w:r>
             <w:r>
               <w:rPr>
@@ -2479,7 +2453,7 @@
               <w:lang w:eastAsia="es-ES"/>
             </w:rPr>
           </w:pPr>
-          <w:hyperlink w:anchor="_Toc229696533" w:history="1">
+          <w:hyperlink w:anchor="_Toc229732687" w:history="1">
             <w:r>
               <w:rPr>
                 <w:rStyle w:val="Hipervnculo"/>
@@ -2523,7 +2497,7 @@
                 <w:noProof/>
                 <w:webHidden/>
               </w:rPr>
-              <w:instrText xml:space="preserve"> PAGEREF _Toc229696533 \h </w:instrText>
+              <w:instrText xml:space="preserve"> PAGEREF _Toc229732687 \h </w:instrText>
             </w:r>
             <w:r>
               <w:rPr>
@@ -2569,7 +2543,7 @@
               <w:lang w:eastAsia="es-ES"/>
             </w:rPr>
           </w:pPr>
-          <w:hyperlink w:anchor="_Toc229696534" w:history="1">
+          <w:hyperlink w:anchor="_Toc229732688" w:history="1">
             <w:r>
               <w:rPr>
                 <w:rStyle w:val="Hipervnculo"/>
@@ -2613,7 +2587,7 @@
                 <w:noProof/>
                 <w:webHidden/>
               </w:rPr>
-              <w:instrText xml:space="preserve"> PAGEREF _Toc229696534 \h </w:instrText>
+              <w:instrText xml:space="preserve"> PAGEREF _Toc229732688 \h </w:instrText>
             </w:r>
             <w:r>
               <w:rPr>
@@ -2659,7 +2633,7 @@
               <w:lang w:eastAsia="es-ES"/>
             </w:rPr>
           </w:pPr>
-          <w:hyperlink w:anchor="_Toc229696535" w:history="1">
+          <w:hyperlink w:anchor="_Toc229732689" w:history="1">
             <w:r>
               <w:rPr>
                 <w:rStyle w:val="Hipervnculo"/>
@@ -2703,7 +2677,7 @@
                 <w:noProof/>
                 <w:webHidden/>
               </w:rPr>
-              <w:instrText xml:space="preserve"> PAGEREF _Toc229696535 \h </w:instrText>
+              <w:instrText xml:space="preserve"> PAGEREF _Toc229732689 \h </w:instrText>
             </w:r>
             <w:r>
               <w:rPr>
@@ -2749,7 +2723,7 @@
               <w:lang w:eastAsia="es-ES"/>
             </w:rPr>
           </w:pPr>
-          <w:hyperlink w:anchor="_Toc229696536" w:history="1">
+          <w:hyperlink w:anchor="_Toc229732690" w:history="1">
             <w:r>
               <w:rPr>
                 <w:rStyle w:val="Hipervnculo"/>
@@ -2793,7 +2767,7 @@
                 <w:noProof/>
                 <w:webHidden/>
               </w:rPr>
-              <w:instrText xml:space="preserve"> PAGEREF _Toc229696536 \h </w:instrText>
+              <w:instrText xml:space="preserve"> PAGEREF _Toc229732690 \h </w:instrText>
             </w:r>
             <w:r>
               <w:rPr>
@@ -2839,7 +2813,7 @@
               <w:lang w:eastAsia="es-ES"/>
             </w:rPr>
           </w:pPr>
-          <w:hyperlink w:anchor="_Toc229696537" w:history="1">
+          <w:hyperlink w:anchor="_Toc229732691" w:history="1">
             <w:r>
               <w:rPr>
                 <w:rStyle w:val="Hipervnculo"/>
@@ -2883,7 +2857,7 @@
                 <w:noProof/>
                 <w:webHidden/>
               </w:rPr>
-              <w:instrText xml:space="preserve"> PAGEREF _Toc229696537 \h </w:instrText>
+              <w:instrText xml:space="preserve"> PAGEREF _Toc229732691 \h </w:instrText>
             </w:r>
             <w:r>
               <w:rPr>
@@ -2929,7 +2903,7 @@
               <w:lang w:eastAsia="es-ES"/>
             </w:rPr>
           </w:pPr>
-          <w:hyperlink w:anchor="_Toc229696538" w:history="1">
+          <w:hyperlink w:anchor="_Toc229732692" w:history="1">
             <w:r>
               <w:rPr>
                 <w:rStyle w:val="Hipervnculo"/>
@@ -2973,7 +2947,7 @@
                 <w:noProof/>
                 <w:webHidden/>
               </w:rPr>
-              <w:instrText xml:space="preserve"> PAGEREF _Toc229696538 \h </w:instrText>
+              <w:instrText xml:space="preserve"> PAGEREF _Toc229732692 \h </w:instrText>
             </w:r>
             <w:r>
               <w:rPr>
@@ -3019,7 +2993,7 @@
               <w:lang w:eastAsia="es-ES"/>
             </w:rPr>
           </w:pPr>
-          <w:hyperlink w:anchor="_Toc229696542" w:history="1">
+          <w:hyperlink w:anchor="_Toc229732696" w:history="1">
             <w:r>
               <w:rPr>
                 <w:rStyle w:val="Hipervnculo"/>
@@ -3063,7 +3037,7 @@
                 <w:noProof/>
                 <w:webHidden/>
               </w:rPr>
-              <w:instrText xml:space="preserve"> PAGEREF _Toc229696542 \h </w:instrText>
+              <w:instrText xml:space="preserve"> PAGEREF _Toc229732696 \h </w:instrText>
             </w:r>
             <w:r>
               <w:rPr>
@@ -3109,7 +3083,7 @@
               <w:lang w:eastAsia="es-ES"/>
             </w:rPr>
           </w:pPr>
-          <w:hyperlink w:anchor="_Toc229696543" w:history="1">
+          <w:hyperlink w:anchor="_Toc229732697" w:history="1">
             <w:r>
               <w:rPr>
                 <w:rStyle w:val="Hipervnculo"/>
@@ -3153,7 +3127,7 @@
                 <w:noProof/>
                 <w:webHidden/>
               </w:rPr>
-              <w:instrText xml:space="preserve"> PAGEREF _Toc229696543 \h </w:instrText>
+              <w:instrText xml:space="preserve"> PAGEREF _Toc229732697 \h </w:instrText>
             </w:r>
             <w:r>
               <w:rPr>
@@ -3199,7 +3173,7 @@
               <w:lang w:eastAsia="es-ES"/>
             </w:rPr>
           </w:pPr>
-          <w:hyperlink w:anchor="_Toc229696544" w:history="1">
+          <w:hyperlink w:anchor="_Toc229732698" w:history="1">
             <w:r>
               <w:rPr>
                 <w:rStyle w:val="Hipervnculo"/>
@@ -3243,7 +3217,7 @@
                 <w:noProof/>
                 <w:webHidden/>
               </w:rPr>
-              <w:instrText xml:space="preserve"> PAGEREF _Toc229696544 \h </w:instrText>
+              <w:instrText xml:space="preserve"> PAGEREF _Toc229732698 \h </w:instrText>
             </w:r>
             <w:r>
               <w:rPr>
@@ -3289,7 +3263,7 @@
               <w:lang w:eastAsia="es-ES"/>
             </w:rPr>
           </w:pPr>
-          <w:hyperlink w:anchor="_Toc229696546" w:history="1">
+          <w:hyperlink w:anchor="_Toc229732700" w:history="1">
             <w:r>
               <w:rPr>
                 <w:rStyle w:val="Hipervnculo"/>
@@ -3333,7 +3307,7 @@
                 <w:noProof/>
                 <w:webHidden/>
               </w:rPr>
-              <w:instrText xml:space="preserve"> PAGEREF _Toc229696546 \h </w:instrText>
+              <w:instrText xml:space="preserve"> PAGEREF _Toc229732700 \h </w:instrText>
             </w:r>
             <w:r>
               <w:rPr>
@@ -3379,7 +3353,7 @@
               <w:lang w:eastAsia="es-ES"/>
             </w:rPr>
           </w:pPr>
-          <w:hyperlink w:anchor="_Toc229696547" w:history="1">
+          <w:hyperlink w:anchor="_Toc229732701" w:history="1">
             <w:r>
               <w:rPr>
                 <w:rStyle w:val="Hipervnculo"/>
@@ -3423,7 +3397,7 @@
                 <w:noProof/>
                 <w:webHidden/>
               </w:rPr>
-              <w:instrText xml:space="preserve"> PAGEREF _Toc229696547 \h </w:instrText>
+              <w:instrText xml:space="preserve"> PAGEREF _Toc229732701 \h </w:instrText>
             </w:r>
             <w:r>
               <w:rPr>
@@ -3469,7 +3443,7 @@
               <w:lang w:eastAsia="es-ES"/>
             </w:rPr>
           </w:pPr>
-          <w:hyperlink w:anchor="_Toc229696548" w:history="1">
+          <w:hyperlink w:anchor="_Toc229732702" w:history="1">
             <w:r>
               <w:rPr>
                 <w:rStyle w:val="Hipervnculo"/>
@@ -3513,7 +3487,7 @@
                 <w:noProof/>
                 <w:webHidden/>
               </w:rPr>
-              <w:instrText xml:space="preserve"> PAGEREF _Toc229696548 \h </w:instrText>
+              <w:instrText xml:space="preserve"> PAGEREF _Toc229732702 \h </w:instrText>
             </w:r>
             <w:r>
               <w:rPr>
@@ -3559,7 +3533,7 @@
               <w:lang w:eastAsia="es-ES"/>
             </w:rPr>
           </w:pPr>
-          <w:hyperlink w:anchor="_Toc229696549" w:history="1">
+          <w:hyperlink w:anchor="_Toc229732703" w:history="1">
             <w:r>
               <w:rPr>
                 <w:rStyle w:val="Hipervnculo"/>
@@ -3582,7 +3556,21 @@
                 <w:rStyle w:val="Hipervnculo"/>
                 <w:noProof/>
               </w:rPr>
-              <w:t>CONCLUSIONES</w:t>
+              <w:t>CONCLUS</w:t>
+            </w:r>
+            <w:r>
+              <w:rPr>
+                <w:rStyle w:val="Hipervnculo"/>
+                <w:noProof/>
+              </w:rPr>
+              <w:t>I</w:t>
+            </w:r>
+            <w:r>
+              <w:rPr>
+                <w:rStyle w:val="Hipervnculo"/>
+                <w:noProof/>
+              </w:rPr>
+              <w:t>ONES</w:t>
             </w:r>
             <w:r>
               <w:rPr>
@@ -3603,7 +3591,7 @@
                 <w:noProof/>
                 <w:webHidden/>
               </w:rPr>
-              <w:instrText xml:space="preserve"> PAGEREF _Toc229696549 \h </w:instrText>
+              <w:instrText xml:space="preserve"> PAGEREF _Toc229732703 \h </w:instrText>
             </w:r>
             <w:r>
               <w:rPr>
@@ -3649,7 +3637,7 @@
               <w:lang w:eastAsia="es-ES"/>
             </w:rPr>
           </w:pPr>
-          <w:hyperlink w:anchor="_Toc229696550" w:history="1">
+          <w:hyperlink w:anchor="_Toc229732704" w:history="1">
             <w:r>
               <w:rPr>
                 <w:rStyle w:val="Hipervnculo"/>
@@ -3693,7 +3681,7 @@
                 <w:noProof/>
                 <w:webHidden/>
               </w:rPr>
-              <w:instrText xml:space="preserve"> PAGEREF _Toc229696550 \h </w:instrText>
+              <w:instrText xml:space="preserve"> PAGEREF _Toc229732704 \h </w:instrText>
             </w:r>
             <w:r>
               <w:rPr>
@@ -3739,7 +3727,7 @@
               <w:lang w:eastAsia="es-ES"/>
             </w:rPr>
           </w:pPr>
-          <w:hyperlink w:anchor="_Toc229696551" w:history="1">
+          <w:hyperlink w:anchor="_Toc229732705" w:history="1">
             <w:r>
               <w:rPr>
                 <w:rStyle w:val="Hipervnculo"/>
@@ -3762,7 +3750,14 @@
                 <w:rStyle w:val="Hipervnculo"/>
                 <w:noProof/>
               </w:rPr>
-              <w:t>GUÍA DE ESTILOS Y MANUAL DE USUARIO</w:t>
+              <w:t>G</w:t>
+            </w:r>
+            <w:r>
+              <w:rPr>
+                <w:rStyle w:val="Hipervnculo"/>
+                <w:noProof/>
+              </w:rPr>
+              <w:t>UÍA DE ESTILOS Y MANUAL DE USUARIO</w:t>
             </w:r>
             <w:r>
               <w:rPr>
@@ -3783,7 +3778,7 @@
                 <w:noProof/>
                 <w:webHidden/>
               </w:rPr>
-              <w:instrText xml:space="preserve"> PAGEREF _Toc229696551 \h </w:instrText>
+              <w:instrText xml:space="preserve"> PAGEREF _Toc229732705 \h </w:instrText>
             </w:r>
             <w:r>
               <w:rPr>
@@ -3829,7 +3824,7 @@
               <w:lang w:eastAsia="es-ES"/>
             </w:rPr>
           </w:pPr>
-          <w:hyperlink w:anchor="_Toc229696553" w:history="1">
+          <w:hyperlink w:anchor="_Toc229732707" w:history="1">
             <w:r>
               <w:rPr>
                 <w:rStyle w:val="Hipervnculo"/>
@@ -3873,7 +3868,7 @@
                 <w:noProof/>
                 <w:webHidden/>
               </w:rPr>
-              <w:instrText xml:space="preserve"> PAGEREF _Toc229696553 \h </w:instrText>
+              <w:instrText xml:space="preserve"> PAGEREF _Toc229732707 \h </w:instrText>
             </w:r>
             <w:r>
               <w:rPr>
@@ -3918,7 +3913,7 @@
               <w:lang w:eastAsia="es-ES"/>
             </w:rPr>
           </w:pPr>
-          <w:hyperlink w:anchor="_Toc229696554" w:history="1">
+          <w:hyperlink w:anchor="_Toc229732708" w:history="1">
             <w:r>
               <w:rPr>
                 <w:rStyle w:val="Hipervnculo"/>
@@ -3945,7 +3940,7 @@
                 <w:noProof/>
                 <w:webHidden/>
               </w:rPr>
-              <w:instrText xml:space="preserve"> PAGEREF _Toc229696554 \h </w:instrText>
+              <w:instrText xml:space="preserve"> PAGEREF _Toc229732708 \h </w:instrText>
             </w:r>
             <w:r>
               <w:rPr>
@@ -3990,7 +3985,7 @@
               <w:lang w:eastAsia="es-ES"/>
             </w:rPr>
           </w:pPr>
-          <w:hyperlink w:anchor="_Toc229696555" w:history="1">
+          <w:hyperlink w:anchor="_Toc229732709" w:history="1">
             <w:r>
               <w:rPr>
                 <w:rStyle w:val="Hipervnculo"/>
@@ -4017,7 +4012,7 @@
                 <w:noProof/>
                 <w:webHidden/>
               </w:rPr>
-              <w:instrText xml:space="preserve"> PAGEREF _Toc229696555 \h </w:instrText>
+              <w:instrText xml:space="preserve"> PAGEREF _Toc229732709 \h </w:instrText>
             </w:r>
             <w:r>
               <w:rPr>
@@ -4062,7 +4057,7 @@
               <w:lang w:eastAsia="es-ES"/>
             </w:rPr>
           </w:pPr>
-          <w:hyperlink w:anchor="_Toc229696556" w:history="1">
+          <w:hyperlink w:anchor="_Toc229732710" w:history="1">
             <w:r>
               <w:rPr>
                 <w:rStyle w:val="Hipervnculo"/>
@@ -4089,7 +4084,7 @@
                 <w:noProof/>
                 <w:webHidden/>
               </w:rPr>
-              <w:instrText xml:space="preserve"> PAGEREF _Toc229696556 \h </w:instrText>
+              <w:instrText xml:space="preserve"> PAGEREF _Toc229732710 \h </w:instrText>
             </w:r>
             <w:r>
               <w:rPr>
@@ -4134,7 +4129,7 @@
               <w:lang w:eastAsia="es-ES"/>
             </w:rPr>
           </w:pPr>
-          <w:hyperlink w:anchor="_Toc229696557" w:history="1">
+          <w:hyperlink w:anchor="_Toc229732711" w:history="1">
             <w:r>
               <w:rPr>
                 <w:rStyle w:val="Hipervnculo"/>
@@ -4161,7 +4156,7 @@
                 <w:noProof/>
                 <w:webHidden/>
               </w:rPr>
-              <w:instrText xml:space="preserve"> PAGEREF _Toc229696557 \h </w:instrText>
+              <w:instrText xml:space="preserve"> PAGEREF _Toc229732711 \h </w:instrText>
             </w:r>
             <w:r>
               <w:rPr>
@@ -4206,7 +4201,7 @@
               <w:lang w:eastAsia="es-ES"/>
             </w:rPr>
           </w:pPr>
-          <w:hyperlink w:anchor="_Toc229696558" w:history="1">
+          <w:hyperlink w:anchor="_Toc229732712" w:history="1">
             <w:r>
               <w:rPr>
                 <w:rStyle w:val="Hipervnculo"/>
@@ -4233,7 +4228,7 @@
                 <w:noProof/>
                 <w:webHidden/>
               </w:rPr>
-              <w:instrText xml:space="preserve"> PAGEREF _Toc229696558 \h </w:instrText>
+              <w:instrText xml:space="preserve"> PAGEREF _Toc229732712 \h </w:instrText>
             </w:r>
             <w:r>
               <w:rPr>
@@ -4278,7 +4273,7 @@
               <w:lang w:eastAsia="es-ES"/>
             </w:rPr>
           </w:pPr>
-          <w:hyperlink w:anchor="_Toc229696559" w:history="1">
+          <w:hyperlink w:anchor="_Toc229732713" w:history="1">
             <w:r>
               <w:rPr>
                 <w:rStyle w:val="Hipervnculo"/>
@@ -4305,7 +4300,7 @@
                 <w:noProof/>
                 <w:webHidden/>
               </w:rPr>
-              <w:instrText xml:space="preserve"> PAGEREF _Toc229696559 \h </w:instrText>
+              <w:instrText xml:space="preserve"> PAGEREF _Toc229732713 \h </w:instrText>
             </w:r>
             <w:r>
               <w:rPr>
@@ -4350,7 +4345,7 @@
               <w:lang w:eastAsia="es-ES"/>
             </w:rPr>
           </w:pPr>
-          <w:hyperlink w:anchor="_Toc229696560" w:history="1">
+          <w:hyperlink w:anchor="_Toc229732714" w:history="1">
             <w:r>
               <w:rPr>
                 <w:rStyle w:val="Hipervnculo"/>
@@ -4377,7 +4372,7 @@
                 <w:noProof/>
                 <w:webHidden/>
               </w:rPr>
-              <w:instrText xml:space="preserve"> PAGEREF _Toc229696560 \h </w:instrText>
+              <w:instrText xml:space="preserve"> PAGEREF _Toc229732714 \h </w:instrText>
             </w:r>
             <w:r>
               <w:rPr>
@@ -4422,7 +4417,7 @@
               <w:lang w:eastAsia="es-ES"/>
             </w:rPr>
           </w:pPr>
-          <w:hyperlink w:anchor="_Toc229696561" w:history="1">
+          <w:hyperlink w:anchor="_Toc229732715" w:history="1">
             <w:r>
               <w:rPr>
                 <w:rStyle w:val="Hipervnculo"/>
@@ -4449,7 +4444,7 @@
                 <w:noProof/>
                 <w:webHidden/>
               </w:rPr>
-              <w:instrText xml:space="preserve"> PAGEREF _Toc229696561 \h </w:instrText>
+              <w:instrText xml:space="preserve"> PAGEREF _Toc229732715 \h </w:instrText>
             </w:r>
             <w:r>
               <w:rPr>
@@ -4495,7 +4490,7 @@
               <w:lang w:eastAsia="es-ES"/>
             </w:rPr>
           </w:pPr>
-          <w:hyperlink w:anchor="_Toc229696562" w:history="1">
+          <w:hyperlink w:anchor="_Toc229732716" w:history="1">
             <w:r>
               <w:rPr>
                 <w:rStyle w:val="Hipervnculo"/>
@@ -4539,7 +4534,7 @@
                 <w:noProof/>
                 <w:webHidden/>
               </w:rPr>
-              <w:instrText xml:space="preserve"> PAGEREF _Toc229696562 \h </w:instrText>
+              <w:instrText xml:space="preserve"> PAGEREF _Toc229732716 \h </w:instrText>
             </w:r>
             <w:r>
               <w:rPr>
@@ -4585,7 +4580,7 @@
               <w:lang w:eastAsia="es-ES"/>
             </w:rPr>
           </w:pPr>
-          <w:hyperlink w:anchor="_Toc229696563" w:history="1">
+          <w:hyperlink w:anchor="_Toc229732717" w:history="1">
             <w:r>
               <w:rPr>
                 <w:rStyle w:val="Hipervnculo"/>
@@ -4629,7 +4624,7 @@
                 <w:noProof/>
                 <w:webHidden/>
               </w:rPr>
-              <w:instrText xml:space="preserve"> PAGEREF _Toc229696563 \h </w:instrText>
+              <w:instrText xml:space="preserve"> PAGEREF _Toc229732717 \h </w:instrText>
             </w:r>
             <w:r>
               <w:rPr>
@@ -4749,7 +4744,7 @@
         </w:rPr>
         <w:fldChar w:fldCharType="separate"/>
       </w:r>
-      <w:hyperlink w:anchor="_Toc229696489" w:history="1">
+      <w:hyperlink w:anchor="_Toc229732643" w:history="1">
         <w:r>
           <w:rPr>
             <w:rStyle w:val="Hipervnculo"/>
@@ -4776,7 +4771,7 @@
             <w:noProof/>
             <w:webHidden/>
           </w:rPr>
-          <w:instrText xml:space="preserve"> PAGEREF _Toc229696489 \h </w:instrText>
+          <w:instrText xml:space="preserve"> PAGEREF _Toc229732643 \h </w:instrText>
         </w:r>
         <w:r>
           <w:rPr>
@@ -4821,7 +4816,7 @@
           <w:lang w:eastAsia="es-ES"/>
         </w:rPr>
       </w:pPr>
-      <w:hyperlink w:anchor="_Toc229696490" w:history="1">
+      <w:hyperlink w:anchor="_Toc229732644" w:history="1">
         <w:r>
           <w:rPr>
             <w:rStyle w:val="Hipervnculo"/>
@@ -4848,7 +4843,7 @@
             <w:noProof/>
             <w:webHidden/>
           </w:rPr>
-          <w:instrText xml:space="preserve"> PAGEREF _Toc229696490 \h </w:instrText>
+          <w:instrText xml:space="preserve"> PAGEREF _Toc229732644 \h </w:instrText>
         </w:r>
         <w:r>
           <w:rPr>
@@ -4893,7 +4888,7 @@
           <w:lang w:eastAsia="es-ES"/>
         </w:rPr>
       </w:pPr>
-      <w:hyperlink w:anchor="_Toc229696491" w:history="1">
+      <w:hyperlink w:anchor="_Toc229732645" w:history="1">
         <w:r>
           <w:rPr>
             <w:rStyle w:val="Hipervnculo"/>
@@ -4920,7 +4915,7 @@
             <w:noProof/>
             <w:webHidden/>
           </w:rPr>
-          <w:instrText xml:space="preserve"> PAGEREF _Toc229696491 \h </w:instrText>
+          <w:instrText xml:space="preserve"> PAGEREF _Toc229732645 \h </w:instrText>
         </w:r>
         <w:r>
           <w:rPr>
@@ -4965,7 +4960,7 @@
           <w:lang w:eastAsia="es-ES"/>
         </w:rPr>
       </w:pPr>
-      <w:hyperlink w:anchor="_Toc229696492" w:history="1">
+      <w:hyperlink w:anchor="_Toc229732646" w:history="1">
         <w:r>
           <w:rPr>
             <w:rStyle w:val="Hipervnculo"/>
@@ -4992,7 +4987,7 @@
             <w:noProof/>
             <w:webHidden/>
           </w:rPr>
-          <w:instrText xml:space="preserve"> PAGEREF _Toc229696492 \h </w:instrText>
+          <w:instrText xml:space="preserve"> PAGEREF _Toc229732646 \h </w:instrText>
         </w:r>
         <w:r>
           <w:rPr>
@@ -5037,7 +5032,7 @@
           <w:lang w:eastAsia="es-ES"/>
         </w:rPr>
       </w:pPr>
-      <w:hyperlink w:anchor="_Toc229696493" w:history="1">
+      <w:hyperlink w:anchor="_Toc229732647" w:history="1">
         <w:r>
           <w:rPr>
             <w:rStyle w:val="Hipervnculo"/>
@@ -5064,7 +5059,7 @@
             <w:noProof/>
             <w:webHidden/>
           </w:rPr>
-          <w:instrText xml:space="preserve"> PAGEREF _Toc229696493 \h </w:instrText>
+          <w:instrText xml:space="preserve"> PAGEREF _Toc229732647 \h </w:instrText>
         </w:r>
         <w:r>
           <w:rPr>
@@ -5109,7 +5104,7 @@
           <w:lang w:eastAsia="es-ES"/>
         </w:rPr>
       </w:pPr>
-      <w:hyperlink w:anchor="_Toc229696494" w:history="1">
+      <w:hyperlink w:anchor="_Toc229732648" w:history="1">
         <w:r>
           <w:rPr>
             <w:rStyle w:val="Hipervnculo"/>
@@ -5136,7 +5131,7 @@
             <w:noProof/>
             <w:webHidden/>
           </w:rPr>
-          <w:instrText xml:space="preserve"> PAGEREF _Toc229696494 \h </w:instrText>
+          <w:instrText xml:space="preserve"> PAGEREF _Toc229732648 \h </w:instrText>
         </w:r>
         <w:r>
           <w:rPr>
@@ -5181,7 +5176,7 @@
           <w:lang w:eastAsia="es-ES"/>
         </w:rPr>
       </w:pPr>
-      <w:hyperlink w:anchor="_Toc229696495" w:history="1">
+      <w:hyperlink w:anchor="_Toc229732649" w:history="1">
         <w:r>
           <w:rPr>
             <w:rStyle w:val="Hipervnculo"/>
@@ -5208,7 +5203,7 @@
             <w:noProof/>
             <w:webHidden/>
           </w:rPr>
-          <w:instrText xml:space="preserve"> PAGEREF _Toc229696495 \h </w:instrText>
+          <w:instrText xml:space="preserve"> PAGEREF _Toc229732649 \h </w:instrText>
         </w:r>
         <w:r>
           <w:rPr>
@@ -5253,7 +5248,7 @@
           <w:lang w:eastAsia="es-ES"/>
         </w:rPr>
       </w:pPr>
-      <w:hyperlink w:anchor="_Toc229696496" w:history="1">
+      <w:hyperlink w:anchor="_Toc229732650" w:history="1">
         <w:r>
           <w:rPr>
             <w:rStyle w:val="Hipervnculo"/>
@@ -5280,7 +5275,7 @@
             <w:noProof/>
             <w:webHidden/>
           </w:rPr>
-          <w:instrText xml:space="preserve"> PAGEREF _Toc229696496 \h </w:instrText>
+          <w:instrText xml:space="preserve"> PAGEREF _Toc229732650 \h </w:instrText>
         </w:r>
         <w:r>
           <w:rPr>
@@ -5325,7 +5320,7 @@
           <w:lang w:eastAsia="es-ES"/>
         </w:rPr>
       </w:pPr>
-      <w:hyperlink w:anchor="_Toc229696497" w:history="1">
+      <w:hyperlink w:anchor="_Toc229732651" w:history="1">
         <w:r>
           <w:rPr>
             <w:rStyle w:val="Hipervnculo"/>
@@ -5352,7 +5347,7 @@
             <w:noProof/>
             <w:webHidden/>
           </w:rPr>
-          <w:instrText xml:space="preserve"> PAGEREF _Toc229696497 \h </w:instrText>
+          <w:instrText xml:space="preserve"> PAGEREF _Toc229732651 \h </w:instrText>
         </w:r>
         <w:r>
           <w:rPr>
@@ -5397,7 +5392,7 @@
           <w:lang w:eastAsia="es-ES"/>
         </w:rPr>
       </w:pPr>
-      <w:hyperlink w:anchor="_Toc229696498" w:history="1">
+      <w:hyperlink w:anchor="_Toc229732652" w:history="1">
         <w:r>
           <w:rPr>
             <w:rStyle w:val="Hipervnculo"/>
@@ -5424,7 +5419,7 @@
             <w:noProof/>
             <w:webHidden/>
           </w:rPr>
-          <w:instrText xml:space="preserve"> PAGEREF _Toc229696498 \h </w:instrText>
+          <w:instrText xml:space="preserve"> PAGEREF _Toc229732652 \h </w:instrText>
         </w:r>
         <w:r>
           <w:rPr>
@@ -5469,7 +5464,7 @@
           <w:lang w:eastAsia="es-ES"/>
         </w:rPr>
       </w:pPr>
-      <w:hyperlink w:anchor="_Toc229696499" w:history="1">
+      <w:hyperlink w:anchor="_Toc229732653" w:history="1">
         <w:r>
           <w:rPr>
             <w:rStyle w:val="Hipervnculo"/>
@@ -5496,7 +5491,7 @@
             <w:noProof/>
             <w:webHidden/>
           </w:rPr>
-          <w:instrText xml:space="preserve"> PAGEREF _Toc229696499 \h </w:instrText>
+          <w:instrText xml:space="preserve"> PAGEREF _Toc229732653 \h </w:instrText>
         </w:r>
         <w:r>
           <w:rPr>
@@ -5541,7 +5536,7 @@
           <w:lang w:eastAsia="es-ES"/>
         </w:rPr>
       </w:pPr>
-      <w:hyperlink w:anchor="_Toc229696500" w:history="1">
+      <w:hyperlink w:anchor="_Toc229732654" w:history="1">
         <w:r>
           <w:rPr>
             <w:rStyle w:val="Hipervnculo"/>
@@ -5568,7 +5563,7 @@
             <w:noProof/>
             <w:webHidden/>
           </w:rPr>
-          <w:instrText xml:space="preserve"> PAGEREF _Toc229696500 \h </w:instrText>
+          <w:instrText xml:space="preserve"> PAGEREF _Toc229732654 \h </w:instrText>
         </w:r>
         <w:r>
           <w:rPr>
@@ -5613,7 +5608,7 @@
           <w:lang w:eastAsia="es-ES"/>
         </w:rPr>
       </w:pPr>
-      <w:hyperlink w:anchor="_Toc229696501" w:history="1">
+      <w:hyperlink w:anchor="_Toc229732655" w:history="1">
         <w:r>
           <w:rPr>
             <w:rStyle w:val="Hipervnculo"/>
@@ -5640,7 +5635,7 @@
             <w:noProof/>
             <w:webHidden/>
           </w:rPr>
-          <w:instrText xml:space="preserve"> PAGEREF _Toc229696501 \h </w:instrText>
+          <w:instrText xml:space="preserve"> PAGEREF _Toc229732655 \h </w:instrText>
         </w:r>
         <w:r>
           <w:rPr>
@@ -5685,7 +5680,7 @@
           <w:lang w:eastAsia="es-ES"/>
         </w:rPr>
       </w:pPr>
-      <w:hyperlink w:anchor="_Toc229696502" w:history="1">
+      <w:hyperlink w:anchor="_Toc229732656" w:history="1">
         <w:r>
           <w:rPr>
             <w:rStyle w:val="Hipervnculo"/>
@@ -5712,7 +5707,7 @@
             <w:noProof/>
             <w:webHidden/>
           </w:rPr>
-          <w:instrText xml:space="preserve"> PAGEREF _Toc229696502 \h </w:instrText>
+          <w:instrText xml:space="preserve"> PAGEREF _Toc229732656 \h </w:instrText>
         </w:r>
         <w:r>
           <w:rPr>
@@ -5757,7 +5752,7 @@
           <w:lang w:eastAsia="es-ES"/>
         </w:rPr>
       </w:pPr>
-      <w:hyperlink w:anchor="_Toc229696503" w:history="1">
+      <w:hyperlink w:anchor="_Toc229732657" w:history="1">
         <w:r>
           <w:rPr>
             <w:rStyle w:val="Hipervnculo"/>
@@ -5784,7 +5779,7 @@
             <w:noProof/>
             <w:webHidden/>
           </w:rPr>
-          <w:instrText xml:space="preserve"> PAGEREF _Toc229696503 \h </w:instrText>
+          <w:instrText xml:space="preserve"> PAGEREF _Toc229732657 \h </w:instrText>
         </w:r>
         <w:r>
           <w:rPr>
@@ -5829,7 +5824,7 @@
           <w:lang w:eastAsia="es-ES"/>
         </w:rPr>
       </w:pPr>
-      <w:hyperlink w:anchor="_Toc229696504" w:history="1">
+      <w:hyperlink w:anchor="_Toc229732658" w:history="1">
         <w:r>
           <w:rPr>
             <w:rStyle w:val="Hipervnculo"/>
@@ -5856,7 +5851,7 @@
             <w:noProof/>
             <w:webHidden/>
           </w:rPr>
-          <w:instrText xml:space="preserve"> PAGEREF _Toc229696504 \h </w:instrText>
+          <w:instrText xml:space="preserve"> PAGEREF _Toc229732658 \h </w:instrText>
         </w:r>
         <w:r>
           <w:rPr>
@@ -5901,7 +5896,7 @@
           <w:lang w:eastAsia="es-ES"/>
         </w:rPr>
       </w:pPr>
-      <w:hyperlink w:anchor="_Toc229696505" w:history="1">
+      <w:hyperlink w:anchor="_Toc229732659" w:history="1">
         <w:r>
           <w:rPr>
             <w:rStyle w:val="Hipervnculo"/>
@@ -5928,7 +5923,7 @@
             <w:noProof/>
             <w:webHidden/>
           </w:rPr>
-          <w:instrText xml:space="preserve"> PAGEREF _Toc229696505 \h </w:instrText>
+          <w:instrText xml:space="preserve"> PAGEREF _Toc229732659 \h </w:instrText>
         </w:r>
         <w:r>
           <w:rPr>
@@ -5973,7 +5968,7 @@
           <w:lang w:eastAsia="es-ES"/>
         </w:rPr>
       </w:pPr>
-      <w:hyperlink w:anchor="_Toc229696506" w:history="1">
+      <w:hyperlink w:anchor="_Toc229732660" w:history="1">
         <w:r>
           <w:rPr>
             <w:rStyle w:val="Hipervnculo"/>
@@ -6000,7 +5995,7 @@
             <w:noProof/>
             <w:webHidden/>
           </w:rPr>
-          <w:instrText xml:space="preserve"> PAGEREF _Toc229696506 \h </w:instrText>
+          <w:instrText xml:space="preserve"> PAGEREF _Toc229732660 \h </w:instrText>
         </w:r>
         <w:r>
           <w:rPr>
@@ -6045,7 +6040,7 @@
           <w:lang w:eastAsia="es-ES"/>
         </w:rPr>
       </w:pPr>
-      <w:hyperlink w:anchor="_Toc229696507" w:history="1">
+      <w:hyperlink w:anchor="_Toc229732661" w:history="1">
         <w:r>
           <w:rPr>
             <w:rStyle w:val="Hipervnculo"/>
@@ -6072,7 +6067,7 @@
             <w:noProof/>
             <w:webHidden/>
           </w:rPr>
-          <w:instrText xml:space="preserve"> PAGEREF _Toc229696507 \h </w:instrText>
+          <w:instrText xml:space="preserve"> PAGEREF _Toc229732661 \h </w:instrText>
         </w:r>
         <w:r>
           <w:rPr>
@@ -6117,7 +6112,7 @@
           <w:lang w:eastAsia="es-ES"/>
         </w:rPr>
       </w:pPr>
-      <w:hyperlink w:anchor="_Toc229696508" w:history="1">
+      <w:hyperlink w:anchor="_Toc229732662" w:history="1">
         <w:r>
           <w:rPr>
             <w:rStyle w:val="Hipervnculo"/>
@@ -6144,7 +6139,7 @@
             <w:noProof/>
             <w:webHidden/>
           </w:rPr>
-          <w:instrText xml:space="preserve"> PAGEREF _Toc229696508 \h </w:instrText>
+          <w:instrText xml:space="preserve"> PAGEREF _Toc229732662 \h </w:instrText>
         </w:r>
         <w:r>
           <w:rPr>
@@ -6189,7 +6184,7 @@
           <w:lang w:eastAsia="es-ES"/>
         </w:rPr>
       </w:pPr>
-      <w:hyperlink w:anchor="_Toc229696509" w:history="1">
+      <w:hyperlink w:anchor="_Toc229732663" w:history="1">
         <w:r>
           <w:rPr>
             <w:rStyle w:val="Hipervnculo"/>
@@ -6216,7 +6211,7 @@
             <w:noProof/>
             <w:webHidden/>
           </w:rPr>
-          <w:instrText xml:space="preserve"> PAGEREF _Toc229696509 \h </w:instrText>
+          <w:instrText xml:space="preserve"> PAGEREF _Toc229732663 \h </w:instrText>
         </w:r>
         <w:r>
           <w:rPr>
@@ -6261,7 +6256,7 @@
           <w:lang w:eastAsia="es-ES"/>
         </w:rPr>
       </w:pPr>
-      <w:hyperlink w:anchor="_Toc229696510" w:history="1">
+      <w:hyperlink w:anchor="_Toc229732664" w:history="1">
         <w:r>
           <w:rPr>
             <w:rStyle w:val="Hipervnculo"/>
@@ -6288,7 +6283,7 @@
             <w:noProof/>
             <w:webHidden/>
           </w:rPr>
-          <w:instrText xml:space="preserve"> PAGEREF _Toc229696510 \h </w:instrText>
+          <w:instrText xml:space="preserve"> PAGEREF _Toc229732664 \h </w:instrText>
         </w:r>
         <w:r>
           <w:rPr>
@@ -6333,7 +6328,7 @@
           <w:lang w:eastAsia="es-ES"/>
         </w:rPr>
       </w:pPr>
-      <w:hyperlink w:anchor="_Toc229696511" w:history="1">
+      <w:hyperlink w:anchor="_Toc229732665" w:history="1">
         <w:r>
           <w:rPr>
             <w:rStyle w:val="Hipervnculo"/>
@@ -6360,7 +6355,7 @@
             <w:noProof/>
             <w:webHidden/>
           </w:rPr>
-          <w:instrText xml:space="preserve"> PAGEREF _Toc229696511 \h </w:instrText>
+          <w:instrText xml:space="preserve"> PAGEREF _Toc229732665 \h </w:instrText>
         </w:r>
         <w:r>
           <w:rPr>
@@ -6405,7 +6400,7 @@
           <w:lang w:eastAsia="es-ES"/>
         </w:rPr>
       </w:pPr>
-      <w:hyperlink w:anchor="_Toc229696512" w:history="1">
+      <w:hyperlink w:anchor="_Toc229732666" w:history="1">
         <w:r>
           <w:rPr>
             <w:rStyle w:val="Hipervnculo"/>
@@ -6432,7 +6427,7 @@
             <w:noProof/>
             <w:webHidden/>
           </w:rPr>
-          <w:instrText xml:space="preserve"> PAGEREF _Toc229696512 \h </w:instrText>
+          <w:instrText xml:space="preserve"> PAGEREF _Toc229732666 \h </w:instrText>
         </w:r>
         <w:r>
           <w:rPr>
@@ -6477,7 +6472,7 @@
           <w:lang w:eastAsia="es-ES"/>
         </w:rPr>
       </w:pPr>
-      <w:hyperlink w:anchor="_Toc229696513" w:history="1">
+      <w:hyperlink w:anchor="_Toc229732667" w:history="1">
         <w:r>
           <w:rPr>
             <w:rStyle w:val="Hipervnculo"/>
@@ -6504,7 +6499,7 @@
             <w:noProof/>
             <w:webHidden/>
           </w:rPr>
-          <w:instrText xml:space="preserve"> PAGEREF _Toc229696513 \h </w:instrText>
+          <w:instrText xml:space="preserve"> PAGEREF _Toc229732667 \h </w:instrText>
         </w:r>
         <w:r>
           <w:rPr>
@@ -6549,7 +6544,7 @@
           <w:lang w:eastAsia="es-ES"/>
         </w:rPr>
       </w:pPr>
-      <w:hyperlink w:anchor="_Toc229696514" w:history="1">
+      <w:hyperlink w:anchor="_Toc229732668" w:history="1">
         <w:r>
           <w:rPr>
             <w:rStyle w:val="Hipervnculo"/>
@@ -6576,7 +6571,7 @@
             <w:noProof/>
             <w:webHidden/>
           </w:rPr>
-          <w:instrText xml:space="preserve"> PAGEREF _Toc229696514 \h </w:instrText>
+          <w:instrText xml:space="preserve"> PAGEREF _Toc229732668 \h </w:instrText>
         </w:r>
         <w:r>
           <w:rPr>
@@ -6621,7 +6616,7 @@
           <w:lang w:eastAsia="es-ES"/>
         </w:rPr>
       </w:pPr>
-      <w:hyperlink w:anchor="_Toc229696515" w:history="1">
+      <w:hyperlink w:anchor="_Toc229732669" w:history="1">
         <w:r>
           <w:rPr>
             <w:rStyle w:val="Hipervnculo"/>
@@ -6648,7 +6643,7 @@
             <w:noProof/>
             <w:webHidden/>
           </w:rPr>
-          <w:instrText xml:space="preserve"> PAGEREF _Toc229696515 \h </w:instrText>
+          <w:instrText xml:space="preserve"> PAGEREF _Toc229732669 \h </w:instrText>
         </w:r>
         <w:r>
           <w:rPr>
@@ -6693,7 +6688,7 @@
           <w:lang w:eastAsia="es-ES"/>
         </w:rPr>
       </w:pPr>
-      <w:hyperlink w:anchor="_Toc229696516" w:history="1">
+      <w:hyperlink w:anchor="_Toc229732670" w:history="1">
         <w:r>
           <w:rPr>
             <w:rStyle w:val="Hipervnculo"/>
@@ -6720,7 +6715,7 @@
             <w:noProof/>
             <w:webHidden/>
           </w:rPr>
-          <w:instrText xml:space="preserve"> PAGEREF _Toc229696516 \h </w:instrText>
+          <w:instrText xml:space="preserve"> PAGEREF _Toc229732670 \h </w:instrText>
         </w:r>
         <w:r>
           <w:rPr>
@@ -6765,7 +6760,7 @@
           <w:lang w:eastAsia="es-ES"/>
         </w:rPr>
       </w:pPr>
-      <w:hyperlink w:anchor="_Toc229696517" w:history="1">
+      <w:hyperlink w:anchor="_Toc229732671" w:history="1">
         <w:r>
           <w:rPr>
             <w:rStyle w:val="Hipervnculo"/>
@@ -6792,7 +6787,7 @@
             <w:noProof/>
             <w:webHidden/>
           </w:rPr>
-          <w:instrText xml:space="preserve"> PAGEREF _Toc229696517 \h </w:instrText>
+          <w:instrText xml:space="preserve"> PAGEREF _Toc229732671 \h </w:instrText>
         </w:r>
         <w:r>
           <w:rPr>
@@ -6837,7 +6832,7 @@
           <w:lang w:eastAsia="es-ES"/>
         </w:rPr>
       </w:pPr>
-      <w:hyperlink w:anchor="_Toc229696518" w:history="1">
+      <w:hyperlink w:anchor="_Toc229732672" w:history="1">
         <w:r>
           <w:rPr>
             <w:rStyle w:val="Hipervnculo"/>
@@ -6864,7 +6859,7 @@
             <w:noProof/>
             <w:webHidden/>
           </w:rPr>
-          <w:instrText xml:space="preserve"> PAGEREF _Toc229696518 \h </w:instrText>
+          <w:instrText xml:space="preserve"> PAGEREF _Toc229732672 \h </w:instrText>
         </w:r>
         <w:r>
           <w:rPr>
@@ -6940,8 +6935,9 @@
       <w:pPr>
         <w:pStyle w:val="Ttulo2"/>
       </w:pPr>
-      <w:bookmarkStart w:id="0" w:name="_Toc229696519"/>
-      <w:r>
+      <w:bookmarkStart w:id="0" w:name="_Toc229732673"/>
+      <w:r>
+        <w:lastRenderedPageBreak/>
         <w:t>INTRODUCCIÓN</w:t>
       </w:r>
       <w:bookmarkEnd w:id="0"/>
@@ -7241,8 +7237,9 @@
           <w:numId w:val="2"/>
         </w:numPr>
       </w:pPr>
-      <w:bookmarkStart w:id="1" w:name="_Toc229696520"/>
-      <w:r>
+      <w:bookmarkStart w:id="1" w:name="_Toc229732674"/>
+      <w:r>
+        <w:lastRenderedPageBreak/>
         <w:t>OBJETIVOS DEL PROYECTO</w:t>
       </w:r>
       <w:bookmarkEnd w:id="1"/>
@@ -7302,7 +7299,7 @@
           <w:numId w:val="3"/>
         </w:numPr>
       </w:pPr>
-      <w:bookmarkStart w:id="2" w:name="_Toc229696521"/>
+      <w:bookmarkStart w:id="2" w:name="_Toc229732675"/>
       <w:r>
         <w:t>OBJETIVO GENERAL DEL PROYECTO</w:t>
       </w:r>
@@ -7325,7 +7322,15 @@
         <w:jc w:val="both"/>
       </w:pPr>
       <w:r>
-        <w:t>Con este trabajo busco aplicar de forma práctica los conocimientos adquiridos a lo largo del ciclo de Desarrollo de Aplicaciones Multiplataforma, integrando aspectos de diferentes módulos tanto del primer como del segundo curso. El resultado final será un producto cerrado, plenamente operativo y correctamente documentado, que facilite la administración de usuarios con distintos perfiles, el manejo de documentación y el seguimiento de las formaciones. Dentro de este objetivo se incluye también appFE, una app Android desarrollada en Kotlin y Jetpack Compose que permite al estudiante gestionar su perfil, consultar datos de empresa y tutores, marcar asistencia o ausencia en un calendario y recibir recordatorios sobre días pendientes.</w:t>
+        <w:t xml:space="preserve">Con este trabajo busco aplicar de forma práctica los conocimientos adquiridos a lo largo del ciclo de Desarrollo de Aplicaciones Multiplataforma, integrando aspectos de diferentes módulos tanto del primer como del segundo curso. El resultado final será un producto cerrado, plenamente operativo y correctamente documentado, que facilite la administración de usuarios con distintos perfiles, el manejo de documentación y el seguimiento de las formaciones. Dentro de este objetivo se incluye también appFE, una </w:t>
+      </w:r>
+      <w:proofErr w:type="gramStart"/>
+      <w:r>
+        <w:t>app</w:t>
+      </w:r>
+      <w:proofErr w:type="gramEnd"/>
+      <w:r>
+        <w:t xml:space="preserve"> Android desarrollada en Kotlin y Jetpack Compose que permite al estudiante gestionar su perfil, consultar datos de empresa y tutores, marcar asistencia o ausencia en un calendario y recibir recordatorios sobre días pendientes.</w:t>
       </w:r>
     </w:p>
     <w:p>
@@ -7349,7 +7354,7 @@
           <w:numId w:val="3"/>
         </w:numPr>
       </w:pPr>
-      <w:bookmarkStart w:id="4" w:name="_Toc229696522"/>
+      <w:bookmarkStart w:id="4" w:name="_Toc229732676"/>
       <w:bookmarkEnd w:id="3"/>
       <w:r>
         <w:t>OBJETIVOS ESPECÍFICOS</w:t>
@@ -7382,7 +7387,11 @@
         <w:t xml:space="preserve">. </w:t>
       </w:r>
       <w:r>
-        <w:t>Definir la arquitectura del sistema siguiendo el patrón Modelo-Vista-Controlador (MVC) organizado en capas (modelo, repositorios, servicios, controladores, vistas y configuración), de forma que se garantice la separación de responsabilidades y la mantenibilidad del código.</w:t>
+        <w:t xml:space="preserve">Definir la arquitectura del sistema siguiendo el patrón Modelo-Vista-Controlador (MVC) organizado en capas (modelo, repositorios, servicios, controladores, </w:t>
+      </w:r>
+      <w:r>
+        <w:lastRenderedPageBreak/>
+        <w:t>vistas y configuración), de forma que se garantice la separación de responsabilidades y la mantenibilidad del código.</w:t>
       </w:r>
     </w:p>
     <w:p>
@@ -7597,7 +7606,15 @@
         <w:t>Adaptar una parte del aplicativo para móviles.</w:t>
       </w:r>
       <w:r>
-        <w:t xml:space="preserve"> Desarrollar una versión parcial de la aplicación orientada a plataformas móviles mediante appFE, una aplicación Android construida con Kotlin y Jetpack Compose. Esta app permite al estudiante iniciar sesión o registrarse, consultar y editar su perfil de formación, visualizar empresa y tutores, gestionar un calendario mensual de asistencia, registrar ausencias con motivo y justificante, marcar días no lectivos y recibir recordatorios semanales de días pendientes, demostrando así la capacidad del proyecto para adaptarse a dispositivos móviles.</w:t>
+        <w:t xml:space="preserve"> Desarrollar una versión parcial de la aplicación orientada a plataformas móviles mediante appFE, una aplicación Android construida con Kotlin y Jetpack Compose. Esta </w:t>
+      </w:r>
+      <w:proofErr w:type="gramStart"/>
+      <w:r>
+        <w:t>app</w:t>
+      </w:r>
+      <w:proofErr w:type="gramEnd"/>
+      <w:r>
+        <w:t xml:space="preserve"> permite al estudiante iniciar sesión o registrarse, consultar y editar su perfil de formación, visualizar empresa y tutores, gestionar un calendario mensual de asistencia, registrar ausencias con motivo y justificante, marcar días no lectivos y recibir recordatorios semanales de días pendientes, demostrando así la capacidad del proyecto para adaptarse a dispositivos móviles.</w:t>
       </w:r>
     </w:p>
     <w:p>
@@ -7613,8 +7630,9 @@
           <w:numId w:val="2"/>
         </w:numPr>
       </w:pPr>
-      <w:bookmarkStart w:id="5" w:name="_Toc229696523"/>
-      <w:r>
+      <w:bookmarkStart w:id="5" w:name="_Toc229732677"/>
+      <w:r>
+        <w:lastRenderedPageBreak/>
         <w:t>ANÁLISIS Y DISEÑO</w:t>
       </w:r>
       <w:bookmarkEnd w:id="5"/>
@@ -7676,6 +7694,7 @@
       <w:bookmarkStart w:id="11" w:name="_Toc229591871"/>
       <w:bookmarkStart w:id="12" w:name="_Toc229696449"/>
       <w:bookmarkStart w:id="13" w:name="_Toc229696524"/>
+      <w:bookmarkStart w:id="14" w:name="_Toc229732678"/>
       <w:bookmarkEnd w:id="6"/>
       <w:bookmarkEnd w:id="7"/>
       <w:bookmarkEnd w:id="8"/>
@@ -7684,6 +7703,7 @@
       <w:bookmarkEnd w:id="11"/>
       <w:bookmarkEnd w:id="12"/>
       <w:bookmarkEnd w:id="13"/>
+      <w:bookmarkEnd w:id="14"/>
     </w:p>
     <w:p>
       <w:pPr>
@@ -7693,11 +7713,11 @@
           <w:numId w:val="3"/>
         </w:numPr>
       </w:pPr>
-      <w:bookmarkStart w:id="14" w:name="_Toc229696525"/>
+      <w:bookmarkStart w:id="15" w:name="_Toc229732679"/>
       <w:r>
         <w:t>REQUISITOS FUNCIONALES</w:t>
       </w:r>
-      <w:bookmarkEnd w:id="14"/>
+      <w:bookmarkEnd w:id="15"/>
     </w:p>
     <w:tbl>
       <w:tblPr>
@@ -8119,6 +8139,7 @@
           </w:tcPr>
           <w:p>
             <w:r>
+              <w:lastRenderedPageBreak/>
               <w:t>RF10</w:t>
             </w:r>
           </w:p>
@@ -8248,12 +8269,21 @@
             <w:tcW w:w="5714" w:type="dxa"/>
           </w:tcPr>
           <w:p>
+            <w:proofErr w:type="gramStart"/>
             <w:r>
               <w:rPr>
                 <w:b/>
                 <w:bCs/>
               </w:rPr>
-              <w:t xml:space="preserve">Generación informes: </w:t>
+              <w:t>Generación informes</w:t>
+            </w:r>
+            <w:proofErr w:type="gramEnd"/>
+            <w:r>
+              <w:rPr>
+                <w:b/>
+                <w:bCs/>
+              </w:rPr>
+              <w:t xml:space="preserve">: </w:t>
             </w:r>
             <w:r>
               <w:t>El sistema deberá permitir la generación de informes de las formaciones en empresa por curso académico</w:t>
@@ -8281,11 +8311,11 @@
           <w:numId w:val="3"/>
         </w:numPr>
       </w:pPr>
-      <w:bookmarkStart w:id="15" w:name="_Toc229696526"/>
+      <w:bookmarkStart w:id="16" w:name="_Toc229732680"/>
       <w:r>
         <w:t>REQUISITOS NO FUNCIONALES</w:t>
       </w:r>
-      <w:bookmarkEnd w:id="15"/>
+      <w:bookmarkEnd w:id="16"/>
     </w:p>
     <w:tbl>
       <w:tblPr>
@@ -8461,11 +8491,11 @@
           <w:numId w:val="3"/>
         </w:numPr>
       </w:pPr>
-      <w:bookmarkStart w:id="16" w:name="_Toc229696527"/>
+      <w:bookmarkStart w:id="17" w:name="_Toc229732681"/>
       <w:r>
         <w:t>CASOS DE USO</w:t>
       </w:r>
-      <w:bookmarkEnd w:id="16"/>
+      <w:bookmarkEnd w:id="17"/>
     </w:p>
     <w:p>
       <w:pPr>
@@ -8499,11 +8529,12 @@
           <w:numId w:val="3"/>
         </w:numPr>
       </w:pPr>
-      <w:bookmarkStart w:id="17" w:name="_Toc229696528"/>
-      <w:r>
+      <w:bookmarkStart w:id="18" w:name="_Toc229732682"/>
+      <w:r>
+        <w:lastRenderedPageBreak/>
         <w:t>DIAGRAMA DE CASOS DE USO</w:t>
       </w:r>
-      <w:bookmarkEnd w:id="17"/>
+      <w:bookmarkEnd w:id="18"/>
     </w:p>
     <w:p>
       <w:pPr>
@@ -8536,7 +8567,7 @@
                     <pic:cNvPicPr/>
                   </pic:nvPicPr>
                   <pic:blipFill>
-                    <a:blip r:embed="rId16"/>
+                    <a:blip r:embed="rId15"/>
                     <a:stretch>
                       <a:fillRect/>
                     </a:stretch>
@@ -8561,35 +8592,22 @@
       <w:pPr>
         <w:pStyle w:val="Descripcin"/>
       </w:pPr>
-      <w:bookmarkStart w:id="18" w:name="_Toc229696489"/>
+      <w:bookmarkStart w:id="19" w:name="_Toc229732643"/>
       <w:r>
         <w:t xml:space="preserve">Figura </w:t>
       </w:r>
-      <w:r>
-        <w:fldChar w:fldCharType="begin"/>
-      </w:r>
-      <w:r>
-        <w:instrText xml:space="preserve"> SEQ Figura \* ARABIC </w:instrText>
-      </w:r>
-      <w:r>
-        <w:fldChar w:fldCharType="separate"/>
-      </w:r>
-      <w:r>
-        <w:rPr>
-          <w:noProof/>
-        </w:rPr>
-        <w:t>1</w:t>
-      </w:r>
-      <w:r>
-        <w:rPr>
-          <w:noProof/>
-        </w:rPr>
-        <w:fldChar w:fldCharType="end"/>
-      </w:r>
+      <w:fldSimple w:instr=" SEQ Figura \* ARABIC ">
+        <w:r>
+          <w:rPr>
+            <w:noProof/>
+          </w:rPr>
+          <w:t>1</w:t>
+        </w:r>
+      </w:fldSimple>
       <w:r>
         <w:t>. Modelo de Casos de Uso</w:t>
       </w:r>
-      <w:bookmarkEnd w:id="18"/>
+      <w:bookmarkEnd w:id="19"/>
     </w:p>
     <w:p>
       <w:pPr>
@@ -8605,11 +8623,11 @@
           <w:numId w:val="3"/>
         </w:numPr>
       </w:pPr>
-      <w:bookmarkStart w:id="19" w:name="_Toc229696529"/>
+      <w:bookmarkStart w:id="20" w:name="_Toc229732683"/>
       <w:r>
         <w:t>DESCRIPCIÓN DE LOS ACTORES</w:t>
       </w:r>
-      <w:bookmarkEnd w:id="19"/>
+      <w:bookmarkEnd w:id="20"/>
     </w:p>
     <w:p>
       <w:pPr>
@@ -8702,6 +8720,7 @@
         <w:jc w:val="both"/>
       </w:pPr>
       <w:r>
+        <w:lastRenderedPageBreak/>
         <w:t>Consultar y gestionar la documentación asociada a las formaciones (RF6).</w:t>
       </w:r>
     </w:p>
@@ -8906,6 +8925,7 @@
         <w:jc w:val="both"/>
       </w:pPr>
       <w:r>
+        <w:lastRenderedPageBreak/>
         <w:t>Visualizar la información de su formación en empresa: empresa asignada, tutor de empresa, profesor tutor, fechas del periodo formativo y estado de la formación (RF9).</w:t>
       </w:r>
     </w:p>
@@ -8980,11 +9000,11 @@
           <w:numId w:val="3"/>
         </w:numPr>
       </w:pPr>
-      <w:bookmarkStart w:id="20" w:name="_Toc229696530"/>
+      <w:bookmarkStart w:id="21" w:name="_Toc229732684"/>
       <w:r>
         <w:t>DESCRIPCIÓN DE LOS CASOS DE USO</w:t>
       </w:r>
-      <w:bookmarkEnd w:id="20"/>
+      <w:bookmarkEnd w:id="21"/>
     </w:p>
     <w:p>
       <w:pPr>
@@ -9046,6 +9066,7 @@
           <w:b/>
           <w:bCs/>
         </w:rPr>
+        <w:lastRenderedPageBreak/>
         <w:t>CU4 – Gestionar Asignaciones de Estudiantes.</w:t>
       </w:r>
       <w:r>
@@ -9127,7 +9148,11 @@
         <w:t>CU8 – Gestionar Informes.</w:t>
       </w:r>
       <w:r>
-        <w:t> Este caso de uso permite generar informes sobre las formaciones en empresa agrupados por curso académico, y está disponible tanto para el administrador como para el profesor coordinador. Los informes pueden filtrarse por ciclo formativo, estado de las formaciones y rango de fechas, y proporcionan una visión global del estado de las formaciones: listado de estudiantes, empresas asignadas, tutores responsables, estados y un resumen estadístico. La diferencia entre ambos perfiles radica en el alcance: el administrador puede generar informes de todo el departamento, mientras que el profesor coordinador se limita a los cursos y formaciones bajo su responsabilidad. Los informes pueden visualizarse en pantalla o exportarse para su archivo o envío. (RF13)</w:t>
+        <w:t xml:space="preserve"> Este caso de uso permite generar informes sobre las formaciones en empresa agrupados por curso académico, y está disponible tanto para el administrador como para el profesor coordinador. Los informes pueden filtrarse por ciclo formativo, estado de las formaciones y rango de fechas, y proporcionan una visión global del estado de las formaciones: listado de estudiantes, empresas asignadas, tutores responsables, estados y un resumen estadístico. La diferencia entre ambos perfiles radica en el alcance: el administrador puede generar informes de todo el departamento, mientras que el profesor coordinador se limita a los cursos y formaciones bajo su </w:t>
+      </w:r>
+      <w:r>
+        <w:lastRenderedPageBreak/>
+        <w:t>responsabilidad. Los informes pueden visualizarse en pantalla o exportarse para su archivo o envío. (RF13)</w:t>
       </w:r>
     </w:p>
     <w:p>
@@ -9143,11 +9168,12 @@
           <w:numId w:val="3"/>
         </w:numPr>
       </w:pPr>
-      <w:bookmarkStart w:id="21" w:name="_Toc229696531"/>
-      <w:r>
+      <w:bookmarkStart w:id="22" w:name="_Toc229732685"/>
+      <w:r>
+        <w:lastRenderedPageBreak/>
         <w:t>MODELOS DE DATOS</w:t>
       </w:r>
-      <w:bookmarkEnd w:id="21"/>
+      <w:bookmarkEnd w:id="22"/>
     </w:p>
     <w:p>
       <w:pPr>
@@ -9168,11 +9194,11 @@
           <w:numId w:val="3"/>
         </w:numPr>
       </w:pPr>
-      <w:bookmarkStart w:id="22" w:name="_Toc229696532"/>
+      <w:bookmarkStart w:id="23" w:name="_Toc229732686"/>
       <w:r>
         <w:t>DIAGRAMA E/R</w:t>
       </w:r>
-      <w:bookmarkEnd w:id="22"/>
+      <w:bookmarkEnd w:id="23"/>
     </w:p>
     <w:p>
       <w:pPr>
@@ -9198,7 +9224,7 @@
                     <pic:cNvPicPr/>
                   </pic:nvPicPr>
                   <pic:blipFill>
-                    <a:blip r:embed="rId17">
+                    <a:blip r:embed="rId16">
                       <a:extLst>
                         <a:ext uri="{28A0092B-C50C-407E-A947-70E740481C1C}">
                           <a14:useLocalDpi xmlns:a14="http://schemas.microsoft.com/office/drawing/2010/main" val="0"/>
@@ -9229,41 +9255,29 @@
       <w:pPr>
         <w:pStyle w:val="Descripcin"/>
       </w:pPr>
-      <w:bookmarkStart w:id="23" w:name="_Toc229696490"/>
+      <w:bookmarkStart w:id="24" w:name="_Toc229732644"/>
       <w:r>
         <w:t xml:space="preserve">Figura </w:t>
       </w:r>
-      <w:r>
-        <w:fldChar w:fldCharType="begin"/>
-      </w:r>
-      <w:r>
-        <w:instrText xml:space="preserve"> SEQ Figura \* ARABIC </w:instrText>
-      </w:r>
-      <w:r>
-        <w:fldChar w:fldCharType="separate"/>
-      </w:r>
+      <w:fldSimple w:instr=" SEQ Figura \* ARABIC ">
+        <w:r>
+          <w:rPr>
+            <w:noProof/>
+          </w:rPr>
+          <w:t>2</w:t>
+        </w:r>
+      </w:fldSimple>
+      <w:r>
+        <w:t>. Diagrama Entidad Relación</w:t>
+      </w:r>
+      <w:bookmarkEnd w:id="24"/>
+    </w:p>
+    <w:p>
       <w:r>
         <w:rPr>
           <w:noProof/>
         </w:rPr>
-        <w:t>2</w:t>
-      </w:r>
-      <w:r>
-        <w:rPr>
-          <w:noProof/>
-        </w:rPr>
-        <w:fldChar w:fldCharType="end"/>
-      </w:r>
-      <w:r>
-        <w:t>. Diagrama Entidad Relación</w:t>
-      </w:r>
-      <w:bookmarkEnd w:id="23"/>
-    </w:p>
-    <w:p>
-      <w:r>
-        <w:rPr>
-          <w:noProof/>
-        </w:rPr>
+        <w:lastRenderedPageBreak/>
         <w:drawing>
           <wp:inline distT="0" distB="0" distL="0" distR="0" wp14:anchorId="070A5BCC" wp14:editId="164F092A">
             <wp:extent cx="6120130" cy="3456940"/>
@@ -9280,7 +9294,7 @@
                     <pic:cNvPicPr/>
                   </pic:nvPicPr>
                   <pic:blipFill>
-                    <a:blip r:embed="rId18"/>
+                    <a:blip r:embed="rId17"/>
                     <a:stretch>
                       <a:fillRect/>
                     </a:stretch>
@@ -9305,35 +9319,22 @@
       <w:pPr>
         <w:pStyle w:val="Descripcin"/>
       </w:pPr>
-      <w:bookmarkStart w:id="24" w:name="_Toc229696491"/>
+      <w:bookmarkStart w:id="25" w:name="_Toc229732645"/>
       <w:r>
         <w:t xml:space="preserve">Figura </w:t>
       </w:r>
-      <w:r>
-        <w:fldChar w:fldCharType="begin"/>
-      </w:r>
-      <w:r>
-        <w:instrText xml:space="preserve"> SEQ Figura \* ARABIC </w:instrText>
-      </w:r>
-      <w:r>
-        <w:fldChar w:fldCharType="separate"/>
-      </w:r>
-      <w:r>
-        <w:rPr>
-          <w:noProof/>
-        </w:rPr>
-        <w:t>3</w:t>
-      </w:r>
-      <w:r>
-        <w:rPr>
-          <w:noProof/>
-        </w:rPr>
-        <w:fldChar w:fldCharType="end"/>
-      </w:r>
+      <w:fldSimple w:instr=" SEQ Figura \* ARABIC ">
+        <w:r>
+          <w:rPr>
+            <w:noProof/>
+          </w:rPr>
+          <w:t>3</w:t>
+        </w:r>
+      </w:fldSimple>
       <w:r>
         <w:t>. Diagrama relacional de la base de datos</w:t>
       </w:r>
-      <w:bookmarkEnd w:id="24"/>
+      <w:bookmarkEnd w:id="25"/>
     </w:p>
     <w:p>
       <w:pPr>
@@ -9343,11 +9344,12 @@
           <w:numId w:val="3"/>
         </w:numPr>
       </w:pPr>
-      <w:bookmarkStart w:id="25" w:name="_Toc229696533"/>
-      <w:r>
+      <w:bookmarkStart w:id="26" w:name="_Toc229732687"/>
+      <w:r>
+        <w:lastRenderedPageBreak/>
         <w:t>DIAGRAMA DE CLASES</w:t>
       </w:r>
-      <w:bookmarkEnd w:id="25"/>
+      <w:bookmarkEnd w:id="26"/>
     </w:p>
     <w:p>
       <w:pPr>
@@ -9374,7 +9376,7 @@
                     <pic:cNvPicPr/>
                   </pic:nvPicPr>
                   <pic:blipFill>
-                    <a:blip r:embed="rId19">
+                    <a:blip r:embed="rId18">
                       <a:extLst>
                         <a:ext uri="{28A0092B-C50C-407E-A947-70E740481C1C}">
                           <a14:useLocalDpi xmlns:a14="http://schemas.microsoft.com/office/drawing/2010/main" val="0"/>
@@ -9405,35 +9407,22 @@
       <w:pPr>
         <w:pStyle w:val="Descripcin"/>
       </w:pPr>
-      <w:bookmarkStart w:id="26" w:name="_Toc229696492"/>
+      <w:bookmarkStart w:id="27" w:name="_Toc229732646"/>
       <w:r>
         <w:t xml:space="preserve">Figura </w:t>
       </w:r>
-      <w:r>
-        <w:fldChar w:fldCharType="begin"/>
-      </w:r>
-      <w:r>
-        <w:instrText xml:space="preserve"> SEQ Figura \* ARABIC </w:instrText>
-      </w:r>
-      <w:r>
-        <w:fldChar w:fldCharType="separate"/>
-      </w:r>
-      <w:r>
-        <w:rPr>
-          <w:noProof/>
-        </w:rPr>
-        <w:t>4</w:t>
-      </w:r>
-      <w:r>
-        <w:rPr>
-          <w:noProof/>
-        </w:rPr>
-        <w:fldChar w:fldCharType="end"/>
-      </w:r>
+      <w:fldSimple w:instr=" SEQ Figura \* ARABIC ">
+        <w:r>
+          <w:rPr>
+            <w:noProof/>
+          </w:rPr>
+          <w:t>4</w:t>
+        </w:r>
+      </w:fldSimple>
       <w:r>
         <w:t>. Diagrama de Clases</w:t>
       </w:r>
-      <w:bookmarkEnd w:id="26"/>
+      <w:bookmarkEnd w:id="27"/>
     </w:p>
     <w:p>
       <w:pPr>
@@ -9443,11 +9432,12 @@
           <w:numId w:val="3"/>
         </w:numPr>
       </w:pPr>
-      <w:bookmarkStart w:id="27" w:name="_Toc229696534"/>
-      <w:r>
+      <w:bookmarkStart w:id="28" w:name="_Toc229732688"/>
+      <w:r>
+        <w:lastRenderedPageBreak/>
         <w:t>INTERFACES GRÁFICAS DE USUARIO</w:t>
       </w:r>
-      <w:bookmarkEnd w:id="27"/>
+      <w:bookmarkEnd w:id="28"/>
     </w:p>
     <w:p>
       <w:pPr>
@@ -9473,7 +9463,7 @@
                     <pic:cNvPicPr/>
                   </pic:nvPicPr>
                   <pic:blipFill>
-                    <a:blip r:embed="rId20"/>
+                    <a:blip r:embed="rId19"/>
                     <a:stretch>
                       <a:fillRect/>
                     </a:stretch>
@@ -9498,35 +9488,22 @@
       <w:pPr>
         <w:pStyle w:val="Descripcin"/>
       </w:pPr>
-      <w:bookmarkStart w:id="28" w:name="_Toc229696493"/>
+      <w:bookmarkStart w:id="29" w:name="_Toc229732647"/>
       <w:r>
         <w:t xml:space="preserve">Figura </w:t>
       </w:r>
-      <w:r>
-        <w:fldChar w:fldCharType="begin"/>
-      </w:r>
-      <w:r>
-        <w:instrText xml:space="preserve"> SEQ Figura \* ARABIC </w:instrText>
-      </w:r>
-      <w:r>
-        <w:fldChar w:fldCharType="separate"/>
-      </w:r>
-      <w:r>
-        <w:rPr>
-          <w:noProof/>
-        </w:rPr>
-        <w:t>5</w:t>
-      </w:r>
-      <w:r>
-        <w:rPr>
-          <w:noProof/>
-        </w:rPr>
-        <w:fldChar w:fldCharType="end"/>
-      </w:r>
+      <w:fldSimple w:instr=" SEQ Figura \* ARABIC ">
+        <w:r>
+          <w:rPr>
+            <w:noProof/>
+          </w:rPr>
+          <w:t>5</w:t>
+        </w:r>
+      </w:fldSimple>
       <w:r>
         <w:t>. Interfaz gráfica de Inicio de Sesión</w:t>
       </w:r>
-      <w:bookmarkEnd w:id="28"/>
+      <w:bookmarkEnd w:id="29"/>
     </w:p>
     <w:p>
       <w:pPr>
@@ -9552,7 +9529,7 @@
                     <pic:cNvPicPr/>
                   </pic:nvPicPr>
                   <pic:blipFill>
-                    <a:blip r:embed="rId21"/>
+                    <a:blip r:embed="rId20"/>
                     <a:stretch>
                       <a:fillRect/>
                     </a:stretch>
@@ -9577,35 +9554,22 @@
       <w:pPr>
         <w:pStyle w:val="Descripcin"/>
       </w:pPr>
-      <w:bookmarkStart w:id="29" w:name="_Toc229696494"/>
+      <w:bookmarkStart w:id="30" w:name="_Toc229732648"/>
       <w:r>
         <w:t xml:space="preserve">Figura </w:t>
       </w:r>
-      <w:r>
-        <w:fldChar w:fldCharType="begin"/>
-      </w:r>
-      <w:r>
-        <w:instrText xml:space="preserve"> SEQ Figura \* ARABIC </w:instrText>
-      </w:r>
-      <w:r>
-        <w:fldChar w:fldCharType="separate"/>
-      </w:r>
-      <w:r>
-        <w:rPr>
-          <w:noProof/>
-        </w:rPr>
-        <w:t>6</w:t>
-      </w:r>
-      <w:r>
-        <w:rPr>
-          <w:noProof/>
-        </w:rPr>
-        <w:fldChar w:fldCharType="end"/>
-      </w:r>
+      <w:fldSimple w:instr=" SEQ Figura \* ARABIC ">
+        <w:r>
+          <w:rPr>
+            <w:noProof/>
+          </w:rPr>
+          <w:t>6</w:t>
+        </w:r>
+      </w:fldSimple>
       <w:r>
         <w:t>. Interfaz gráfica del panel de Administrador</w:t>
       </w:r>
-      <w:bookmarkEnd w:id="29"/>
+      <w:bookmarkEnd w:id="30"/>
     </w:p>
     <w:p>
       <w:pPr>
@@ -9637,7 +9601,7 @@
                     <pic:cNvPicPr/>
                   </pic:nvPicPr>
                   <pic:blipFill>
-                    <a:blip r:embed="rId22"/>
+                    <a:blip r:embed="rId21"/>
                     <a:stretch>
                       <a:fillRect/>
                     </a:stretch>
@@ -9662,35 +9626,22 @@
       <w:pPr>
         <w:pStyle w:val="Descripcin"/>
       </w:pPr>
-      <w:bookmarkStart w:id="30" w:name="_Toc229696495"/>
+      <w:bookmarkStart w:id="31" w:name="_Toc229732649"/>
       <w:r>
         <w:t xml:space="preserve">Figura </w:t>
       </w:r>
-      <w:r>
-        <w:fldChar w:fldCharType="begin"/>
-      </w:r>
-      <w:r>
-        <w:instrText xml:space="preserve"> SEQ Figura \* ARABIC </w:instrText>
-      </w:r>
-      <w:r>
-        <w:fldChar w:fldCharType="separate"/>
-      </w:r>
-      <w:r>
-        <w:rPr>
-          <w:noProof/>
-        </w:rPr>
-        <w:t>7</w:t>
-      </w:r>
-      <w:r>
-        <w:rPr>
-          <w:noProof/>
-        </w:rPr>
-        <w:fldChar w:fldCharType="end"/>
-      </w:r>
+      <w:fldSimple w:instr=" SEQ Figura \* ARABIC ">
+        <w:r>
+          <w:rPr>
+            <w:noProof/>
+          </w:rPr>
+          <w:t>7</w:t>
+        </w:r>
+      </w:fldSimple>
       <w:r>
         <w:t>. Interfaz gráfica del panel de Estudiante</w:t>
       </w:r>
-      <w:bookmarkEnd w:id="30"/>
+      <w:bookmarkEnd w:id="31"/>
     </w:p>
     <w:p>
       <w:pPr>
@@ -9716,7 +9667,7 @@
                     <pic:cNvPicPr/>
                   </pic:nvPicPr>
                   <pic:blipFill>
-                    <a:blip r:embed="rId23"/>
+                    <a:blip r:embed="rId22"/>
                     <a:stretch>
                       <a:fillRect/>
                     </a:stretch>
@@ -9741,44 +9692,32 @@
       <w:pPr>
         <w:pStyle w:val="Descripcin"/>
       </w:pPr>
-      <w:bookmarkStart w:id="31" w:name="_Toc229696496"/>
+      <w:bookmarkStart w:id="32" w:name="_Toc229732650"/>
       <w:r>
         <w:t xml:space="preserve">Figura </w:t>
       </w:r>
-      <w:r>
-        <w:fldChar w:fldCharType="begin"/>
-      </w:r>
-      <w:r>
-        <w:instrText xml:space="preserve"> SEQ Figura \* ARABIC </w:instrText>
-      </w:r>
-      <w:r>
-        <w:fldChar w:fldCharType="separate"/>
-      </w:r>
+      <w:fldSimple w:instr=" SEQ Figura \* ARABIC ">
+        <w:r>
+          <w:rPr>
+            <w:noProof/>
+          </w:rPr>
+          <w:t>8</w:t>
+        </w:r>
+      </w:fldSimple>
+      <w:r>
+        <w:t>. Interfaz gráfica del panel de Tutor de Empresa</w:t>
+      </w:r>
+      <w:bookmarkEnd w:id="32"/>
+    </w:p>
+    <w:p>
+      <w:pPr>
+        <w:keepNext/>
+      </w:pPr>
       <w:r>
         <w:rPr>
           <w:noProof/>
         </w:rPr>
-        <w:t>8</w:t>
-      </w:r>
-      <w:r>
-        <w:rPr>
-          <w:noProof/>
-        </w:rPr>
-        <w:fldChar w:fldCharType="end"/>
-      </w:r>
-      <w:r>
-        <w:t>. Interfaz gráfica del panel de Tutor de Empresa</w:t>
-      </w:r>
-      <w:bookmarkEnd w:id="31"/>
-    </w:p>
-    <w:p>
-      <w:pPr>
-        <w:keepNext/>
-      </w:pPr>
-      <w:r>
-        <w:rPr>
-          <w:noProof/>
-        </w:rPr>
+        <w:lastRenderedPageBreak/>
         <w:drawing>
           <wp:inline distT="0" distB="0" distL="0" distR="0" wp14:anchorId="2501BA9A" wp14:editId="548CB7F2">
             <wp:extent cx="4879238" cy="3295182"/>
@@ -9795,7 +9734,7 @@
                     <pic:cNvPicPr/>
                   </pic:nvPicPr>
                   <pic:blipFill>
-                    <a:blip r:embed="rId24"/>
+                    <a:blip r:embed="rId23"/>
                     <a:stretch>
                       <a:fillRect/>
                     </a:stretch>
@@ -9820,35 +9759,22 @@
       <w:pPr>
         <w:pStyle w:val="Descripcin"/>
       </w:pPr>
-      <w:bookmarkStart w:id="32" w:name="_Toc229696497"/>
+      <w:bookmarkStart w:id="33" w:name="_Toc229732651"/>
       <w:r>
         <w:t xml:space="preserve">Figura </w:t>
       </w:r>
-      <w:r>
-        <w:fldChar w:fldCharType="begin"/>
-      </w:r>
-      <w:r>
-        <w:instrText xml:space="preserve"> SEQ Figura \* ARABIC </w:instrText>
-      </w:r>
-      <w:r>
-        <w:fldChar w:fldCharType="separate"/>
-      </w:r>
-      <w:r>
-        <w:rPr>
-          <w:noProof/>
-        </w:rPr>
-        <w:t>9</w:t>
-      </w:r>
-      <w:r>
-        <w:rPr>
-          <w:noProof/>
-        </w:rPr>
-        <w:fldChar w:fldCharType="end"/>
-      </w:r>
+      <w:fldSimple w:instr=" SEQ Figura \* ARABIC ">
+        <w:r>
+          <w:rPr>
+            <w:noProof/>
+          </w:rPr>
+          <w:t>9</w:t>
+        </w:r>
+      </w:fldSimple>
       <w:r>
         <w:t>. Interfaz gráfica del panel de Profesor/Tutor</w:t>
       </w:r>
-      <w:bookmarkEnd w:id="32"/>
+      <w:bookmarkEnd w:id="33"/>
     </w:p>
     <w:p/>
     <w:p>
@@ -9859,11 +9785,11 @@
           <w:numId w:val="3"/>
         </w:numPr>
       </w:pPr>
-      <w:bookmarkStart w:id="33" w:name="_Toc229696535"/>
+      <w:bookmarkStart w:id="34" w:name="_Toc229732689"/>
       <w:r>
         <w:t>MAPA DE NAVEGABILIDAD</w:t>
       </w:r>
-      <w:bookmarkEnd w:id="33"/>
+      <w:bookmarkEnd w:id="34"/>
     </w:p>
     <w:p>
       <w:pPr>
@@ -9889,7 +9815,7 @@
                     <pic:cNvPicPr/>
                   </pic:nvPicPr>
                   <pic:blipFill>
-                    <a:blip r:embed="rId25"/>
+                    <a:blip r:embed="rId24"/>
                     <a:stretch>
                       <a:fillRect/>
                     </a:stretch>
@@ -9914,35 +9840,22 @@
       <w:pPr>
         <w:pStyle w:val="Descripcin"/>
       </w:pPr>
-      <w:bookmarkStart w:id="34" w:name="_Toc229696498"/>
+      <w:bookmarkStart w:id="35" w:name="_Toc229732652"/>
       <w:r>
         <w:t xml:space="preserve">Figura </w:t>
       </w:r>
-      <w:r>
-        <w:fldChar w:fldCharType="begin"/>
-      </w:r>
-      <w:r>
-        <w:instrText xml:space="preserve"> SEQ Figura \* ARABIC </w:instrText>
-      </w:r>
-      <w:r>
-        <w:fldChar w:fldCharType="separate"/>
-      </w:r>
-      <w:r>
-        <w:rPr>
-          <w:noProof/>
-        </w:rPr>
-        <w:t>10</w:t>
-      </w:r>
-      <w:r>
-        <w:rPr>
-          <w:noProof/>
-        </w:rPr>
-        <w:fldChar w:fldCharType="end"/>
-      </w:r>
+      <w:fldSimple w:instr=" SEQ Figura \* ARABIC ">
+        <w:r>
+          <w:rPr>
+            <w:noProof/>
+          </w:rPr>
+          <w:t>10</w:t>
+        </w:r>
+      </w:fldSimple>
       <w:r>
         <w:t>. Mapa de navegabilidad inicial</w:t>
       </w:r>
-      <w:bookmarkEnd w:id="34"/>
+      <w:bookmarkEnd w:id="35"/>
     </w:p>
     <w:p>
       <w:r>
@@ -9957,11 +9870,12 @@
           <w:numId w:val="2"/>
         </w:numPr>
       </w:pPr>
-      <w:bookmarkStart w:id="35" w:name="_Toc229696536"/>
-      <w:r>
+      <w:bookmarkStart w:id="36" w:name="_Toc229732690"/>
+      <w:r>
+        <w:lastRenderedPageBreak/>
         <w:t>PLAN DE PRUEBAS</w:t>
       </w:r>
-      <w:bookmarkEnd w:id="35"/>
+      <w:bookmarkEnd w:id="36"/>
     </w:p>
     <w:p>
       <w:pPr>
@@ -10049,6 +9963,7 @@
                 <w:b/>
                 <w:bCs/>
               </w:rPr>
+              <w:lastRenderedPageBreak/>
               <w:t>ID</w:t>
             </w:r>
           </w:p>
@@ -10668,6 +10583,7 @@
               <w:jc w:val="both"/>
             </w:pPr>
             <w:r>
+              <w:lastRenderedPageBreak/>
               <w:t>PT-07</w:t>
             </w:r>
           </w:p>
@@ -11270,7 +11186,11 @@
         <w:jc w:val="both"/>
       </w:pPr>
       <w:r>
-        <w:t>En la ejecución documentada no se registraron errores ni fallos en la batería automatizada de JUnit. Las posibles incidencias detectadas en pruebas manuales se revisarían según su severidad, diferenciando entre incidencias críticas, altas, medias y bajas, pero los casos recogidos en esta tabla quedaron validados con estado OK.</w:t>
+        <w:t xml:space="preserve">En la ejecución documentada no se registraron errores ni fallos en la batería automatizada de JUnit. Las posibles incidencias detectadas en pruebas manuales se revisarían según su severidad, diferenciando </w:t>
+      </w:r>
+      <w:r>
+        <w:lastRenderedPageBreak/>
+        <w:t>entre incidencias críticas, altas, medias y bajas, pero los casos recogidos en esta tabla quedaron validados con estado OK.</w:t>
       </w:r>
     </w:p>
     <w:p>
@@ -11306,7 +11226,7 @@
                     <pic:cNvPicPr/>
                   </pic:nvPicPr>
                   <pic:blipFill>
-                    <a:blip r:embed="rId26"/>
+                    <a:blip r:embed="rId25"/>
                     <a:stretch>
                       <a:fillRect/>
                     </a:stretch>
@@ -11331,35 +11251,22 @@
       <w:pPr>
         <w:pStyle w:val="Descripcin"/>
       </w:pPr>
-      <w:bookmarkStart w:id="36" w:name="_Toc229696499"/>
+      <w:bookmarkStart w:id="37" w:name="_Toc229732653"/>
       <w:r>
         <w:t xml:space="preserve">Figura </w:t>
       </w:r>
-      <w:r>
-        <w:fldChar w:fldCharType="begin"/>
-      </w:r>
-      <w:r>
-        <w:instrText xml:space="preserve"> SEQ Figura \* ARABIC </w:instrText>
-      </w:r>
-      <w:r>
-        <w:fldChar w:fldCharType="separate"/>
-      </w:r>
-      <w:r>
-        <w:rPr>
-          <w:noProof/>
-        </w:rPr>
-        <w:t>11</w:t>
-      </w:r>
-      <w:r>
-        <w:rPr>
-          <w:noProof/>
-        </w:rPr>
-        <w:fldChar w:fldCharType="end"/>
-      </w:r>
+      <w:fldSimple w:instr=" SEQ Figura \* ARABIC ">
+        <w:r>
+          <w:rPr>
+            <w:noProof/>
+          </w:rPr>
+          <w:t>11</w:t>
+        </w:r>
+      </w:fldSimple>
       <w:r>
         <w:t>. Ejecución de pruebas unitarias con JUnit 5 (39/39 OK)</w:t>
       </w:r>
-      <w:bookmarkEnd w:id="36"/>
+      <w:bookmarkEnd w:id="37"/>
     </w:p>
     <w:p>
       <w:pPr>
@@ -11380,18 +11287,27 @@
           <w:numId w:val="2"/>
         </w:numPr>
       </w:pPr>
-      <w:bookmarkStart w:id="37" w:name="_Toc229696537"/>
-      <w:r>
+      <w:bookmarkStart w:id="38" w:name="_Toc229732691"/>
+      <w:r>
+        <w:lastRenderedPageBreak/>
         <w:t>TECNOLOGÍAS EMPLEADAS</w:t>
       </w:r>
-      <w:bookmarkEnd w:id="37"/>
-    </w:p>
-    <w:p>
-      <w:pPr>
-        <w:jc w:val="both"/>
-      </w:pPr>
-      <w:r>
-        <w:t>En este apartado se describen las herramientas y lenguajes seleccionados para el desarrollo del aplicativo principal y de su versión móvil appFE. La aplicación de escritorio mantiene una arquitectura basada en el patrón Modelo-Vista-Controlador (MVC), mientras que la app Android emplea tecnologías propias del desarrollo móvil actual.</w:t>
+      <w:bookmarkEnd w:id="38"/>
+    </w:p>
+    <w:p>
+      <w:pPr>
+        <w:jc w:val="both"/>
+      </w:pPr>
+      <w:r>
+        <w:t xml:space="preserve">En este apartado se describen las herramientas y lenguajes seleccionados para el desarrollo del aplicativo principal y de su versión móvil appFE. La aplicación de escritorio mantiene una arquitectura basada en el patrón Modelo-Vista-Controlador (MVC), mientras que la </w:t>
+      </w:r>
+      <w:proofErr w:type="gramStart"/>
+      <w:r>
+        <w:t>app</w:t>
+      </w:r>
+      <w:proofErr w:type="gramEnd"/>
+      <w:r>
+        <w:t xml:space="preserve"> Android emplea tecnologías propias del desarrollo móvil actual.</w:t>
       </w:r>
     </w:p>
     <w:p>
@@ -11481,10 +11397,7 @@
         <w:t>WorkManager</w:t>
       </w:r>
       <w:r>
-        <w:t xml:space="preserve"> para gestionar navegación, persistencia local y record</w:t>
-      </w:r>
-      <w:r>
-        <w:t>atorios semanales.</w:t>
+        <w:t xml:space="preserve"> para gestionar navegación, persistencia local y recordatorios semanales.</w:t>
       </w:r>
     </w:p>
     <w:p>
@@ -11510,8 +11423,13 @@
       <w:r>
         <w:t>fichero </w:t>
       </w:r>
-      <w:r>
-        <w:t>application.properties.</w:t>
+      <w:proofErr w:type="gramStart"/>
+      <w:r>
+        <w:t>application.properties</w:t>
+      </w:r>
+      <w:proofErr w:type="gramEnd"/>
+      <w:r>
+        <w:t>.</w:t>
       </w:r>
     </w:p>
     <w:p>
@@ -11723,11 +11641,12 @@
           <w:numId w:val="2"/>
         </w:numPr>
       </w:pPr>
-      <w:bookmarkStart w:id="38" w:name="_Toc229696538"/>
-      <w:r>
+      <w:bookmarkStart w:id="39" w:name="_Toc229732692"/>
+      <w:r>
+        <w:lastRenderedPageBreak/>
         <w:t>PLANIFICACIÓN Y PRESUPUESTO</w:t>
       </w:r>
-      <w:bookmarkEnd w:id="38"/>
+      <w:bookmarkEnd w:id="39"/>
     </w:p>
     <w:p>
       <w:pPr>
@@ -11770,15 +11689,15 @@
           <w:szCs w:val="32"/>
         </w:rPr>
       </w:pPr>
-      <w:bookmarkStart w:id="39" w:name="_Toc210123170"/>
-      <w:bookmarkStart w:id="40" w:name="_Toc210123297"/>
-      <w:bookmarkStart w:id="41" w:name="_Toc210124628"/>
-      <w:bookmarkStart w:id="42" w:name="_Toc210125386"/>
-      <w:bookmarkStart w:id="43" w:name="_Toc227845064"/>
-      <w:bookmarkStart w:id="44" w:name="_Toc229591886"/>
-      <w:bookmarkStart w:id="45" w:name="_Toc229696464"/>
-      <w:bookmarkStart w:id="46" w:name="_Toc229696539"/>
-      <w:bookmarkEnd w:id="39"/>
+      <w:bookmarkStart w:id="40" w:name="_Toc210123170"/>
+      <w:bookmarkStart w:id="41" w:name="_Toc210123297"/>
+      <w:bookmarkStart w:id="42" w:name="_Toc210124628"/>
+      <w:bookmarkStart w:id="43" w:name="_Toc210125386"/>
+      <w:bookmarkStart w:id="44" w:name="_Toc227845064"/>
+      <w:bookmarkStart w:id="45" w:name="_Toc229591886"/>
+      <w:bookmarkStart w:id="46" w:name="_Toc229696464"/>
+      <w:bookmarkStart w:id="47" w:name="_Toc229696539"/>
+      <w:bookmarkStart w:id="48" w:name="_Toc229732693"/>
       <w:bookmarkEnd w:id="40"/>
       <w:bookmarkEnd w:id="41"/>
       <w:bookmarkEnd w:id="42"/>
@@ -11786,6 +11705,8 @@
       <w:bookmarkEnd w:id="44"/>
       <w:bookmarkEnd w:id="45"/>
       <w:bookmarkEnd w:id="46"/>
+      <w:bookmarkEnd w:id="47"/>
+      <w:bookmarkEnd w:id="48"/>
     </w:p>
     <w:p>
       <w:pPr>
@@ -11807,22 +11728,24 @@
           <w:szCs w:val="32"/>
         </w:rPr>
       </w:pPr>
-      <w:bookmarkStart w:id="47" w:name="_Toc210123171"/>
-      <w:bookmarkStart w:id="48" w:name="_Toc210123298"/>
-      <w:bookmarkStart w:id="49" w:name="_Toc210124629"/>
-      <w:bookmarkStart w:id="50" w:name="_Toc210125387"/>
-      <w:bookmarkStart w:id="51" w:name="_Toc227845065"/>
-      <w:bookmarkStart w:id="52" w:name="_Toc229591887"/>
-      <w:bookmarkStart w:id="53" w:name="_Toc229696465"/>
-      <w:bookmarkStart w:id="54" w:name="_Toc229696540"/>
-      <w:bookmarkEnd w:id="47"/>
-      <w:bookmarkEnd w:id="48"/>
+      <w:bookmarkStart w:id="49" w:name="_Toc210123171"/>
+      <w:bookmarkStart w:id="50" w:name="_Toc210123298"/>
+      <w:bookmarkStart w:id="51" w:name="_Toc210124629"/>
+      <w:bookmarkStart w:id="52" w:name="_Toc210125387"/>
+      <w:bookmarkStart w:id="53" w:name="_Toc227845065"/>
+      <w:bookmarkStart w:id="54" w:name="_Toc229591887"/>
+      <w:bookmarkStart w:id="55" w:name="_Toc229696465"/>
+      <w:bookmarkStart w:id="56" w:name="_Toc229696540"/>
+      <w:bookmarkStart w:id="57" w:name="_Toc229732694"/>
       <w:bookmarkEnd w:id="49"/>
       <w:bookmarkEnd w:id="50"/>
       <w:bookmarkEnd w:id="51"/>
       <w:bookmarkEnd w:id="52"/>
       <w:bookmarkEnd w:id="53"/>
       <w:bookmarkEnd w:id="54"/>
+      <w:bookmarkEnd w:id="55"/>
+      <w:bookmarkEnd w:id="56"/>
+      <w:bookmarkEnd w:id="57"/>
     </w:p>
     <w:p>
       <w:pPr>
@@ -11844,22 +11767,24 @@
           <w:szCs w:val="32"/>
         </w:rPr>
       </w:pPr>
-      <w:bookmarkStart w:id="55" w:name="_Toc210123172"/>
-      <w:bookmarkStart w:id="56" w:name="_Toc210123299"/>
-      <w:bookmarkStart w:id="57" w:name="_Toc210124630"/>
-      <w:bookmarkStart w:id="58" w:name="_Toc210125388"/>
-      <w:bookmarkStart w:id="59" w:name="_Toc227845066"/>
-      <w:bookmarkStart w:id="60" w:name="_Toc229591888"/>
-      <w:bookmarkStart w:id="61" w:name="_Toc229696466"/>
-      <w:bookmarkStart w:id="62" w:name="_Toc229696541"/>
-      <w:bookmarkEnd w:id="55"/>
-      <w:bookmarkEnd w:id="56"/>
-      <w:bookmarkEnd w:id="57"/>
+      <w:bookmarkStart w:id="58" w:name="_Toc210123172"/>
+      <w:bookmarkStart w:id="59" w:name="_Toc210123299"/>
+      <w:bookmarkStart w:id="60" w:name="_Toc210124630"/>
+      <w:bookmarkStart w:id="61" w:name="_Toc210125388"/>
+      <w:bookmarkStart w:id="62" w:name="_Toc227845066"/>
+      <w:bookmarkStart w:id="63" w:name="_Toc229591888"/>
+      <w:bookmarkStart w:id="64" w:name="_Toc229696466"/>
+      <w:bookmarkStart w:id="65" w:name="_Toc229696541"/>
+      <w:bookmarkStart w:id="66" w:name="_Toc229732695"/>
       <w:bookmarkEnd w:id="58"/>
       <w:bookmarkEnd w:id="59"/>
       <w:bookmarkEnd w:id="60"/>
       <w:bookmarkEnd w:id="61"/>
       <w:bookmarkEnd w:id="62"/>
+      <w:bookmarkEnd w:id="63"/>
+      <w:bookmarkEnd w:id="64"/>
+      <w:bookmarkEnd w:id="65"/>
+      <w:bookmarkEnd w:id="66"/>
     </w:p>
     <w:p>
       <w:pPr>
@@ -11869,11 +11794,11 @@
           <w:numId w:val="3"/>
         </w:numPr>
       </w:pPr>
-      <w:bookmarkStart w:id="63" w:name="_Toc229696542"/>
+      <w:bookmarkStart w:id="67" w:name="_Toc229732696"/>
       <w:r>
         <w:t>DIAGRAMA DE GANTT</w:t>
       </w:r>
-      <w:bookmarkEnd w:id="63"/>
+      <w:bookmarkEnd w:id="67"/>
     </w:p>
     <w:p>
       <w:pPr>
@@ -11899,7 +11824,7 @@
                     <pic:cNvPicPr/>
                   </pic:nvPicPr>
                   <pic:blipFill>
-                    <a:blip r:embed="rId27"/>
+                    <a:blip r:embed="rId26"/>
                     <a:stretch>
                       <a:fillRect/>
                     </a:stretch>
@@ -11924,35 +11849,22 @@
       <w:pPr>
         <w:pStyle w:val="Descripcin"/>
       </w:pPr>
-      <w:bookmarkStart w:id="64" w:name="_Toc229696500"/>
+      <w:bookmarkStart w:id="68" w:name="_Toc229732654"/>
       <w:r>
         <w:t xml:space="preserve">Figura </w:t>
       </w:r>
-      <w:r>
-        <w:fldChar w:fldCharType="begin"/>
-      </w:r>
-      <w:r>
-        <w:instrText xml:space="preserve"> SEQ Figura \* ARABIC </w:instrText>
-      </w:r>
-      <w:r>
-        <w:fldChar w:fldCharType="separate"/>
-      </w:r>
-      <w:r>
-        <w:rPr>
-          <w:noProof/>
-        </w:rPr>
-        <w:t>12</w:t>
-      </w:r>
-      <w:r>
-        <w:rPr>
-          <w:noProof/>
-        </w:rPr>
-        <w:fldChar w:fldCharType="end"/>
-      </w:r>
+      <w:fldSimple w:instr=" SEQ Figura \* ARABIC ">
+        <w:r>
+          <w:rPr>
+            <w:noProof/>
+          </w:rPr>
+          <w:t>12</w:t>
+        </w:r>
+      </w:fldSimple>
       <w:r>
         <w:t>. Diagrama de Gantt</w:t>
       </w:r>
-      <w:bookmarkEnd w:id="64"/>
+      <w:bookmarkEnd w:id="68"/>
     </w:p>
     <w:p/>
     <w:p>
@@ -11963,18 +11875,26 @@
           <w:numId w:val="3"/>
         </w:numPr>
       </w:pPr>
-      <w:bookmarkStart w:id="65" w:name="_Toc229696543"/>
+      <w:bookmarkStart w:id="69" w:name="_Toc229732697"/>
       <w:r>
         <w:t>ESTIMACIONES DE COSTES</w:t>
       </w:r>
-      <w:bookmarkEnd w:id="65"/>
-    </w:p>
-    <w:p>
-      <w:pPr>
-        <w:jc w:val="both"/>
-      </w:pPr>
-      <w:r>
-        <w:t>La presente estimación recoge el coste del desarrollo de la aplicación basándome en todo el tiempo que me ha llevado realizarla y el volumen de trabajo de la misma.</w:t>
+      <w:bookmarkEnd w:id="69"/>
+    </w:p>
+    <w:p>
+      <w:pPr>
+        <w:jc w:val="both"/>
+      </w:pPr>
+      <w:r>
+        <w:t xml:space="preserve">La presente estimación recoge el coste del desarrollo de la aplicación basándome en todo el tiempo que me ha llevado realizarla y el volumen de trabajo de </w:t>
+      </w:r>
+      <w:proofErr w:type="gramStart"/>
+      <w:r>
+        <w:t>la misma</w:t>
+      </w:r>
+      <w:proofErr w:type="gramEnd"/>
+      <w:r>
+        <w:t>.</w:t>
       </w:r>
     </w:p>
     <w:p>
@@ -12429,8 +12349,13 @@
             <w:pPr>
               <w:jc w:val="both"/>
             </w:pPr>
-            <w:r>
-              <w:t>Total de horas estimadas</w:t>
+            <w:proofErr w:type="gramStart"/>
+            <w:r>
+              <w:t>Total</w:t>
+            </w:r>
+            <w:proofErr w:type="gramEnd"/>
+            <w:r>
+              <w:t xml:space="preserve"> de horas estimadas</w:t>
             </w:r>
           </w:p>
         </w:tc>
@@ -12467,6 +12392,7 @@
         <w:jc w:val="both"/>
       </w:pPr>
       <w:r>
+        <w:lastRenderedPageBreak/>
         <w:t>Se ha establecido una tarifa de 19€ por hora, representativa de un perfil desarrollador Junior en el mercado actual.</w:t>
       </w:r>
       <w:r>
@@ -12502,11 +12428,11 @@
           <w:numId w:val="2"/>
         </w:numPr>
       </w:pPr>
-      <w:bookmarkStart w:id="66" w:name="_Toc229696544"/>
+      <w:bookmarkStart w:id="70" w:name="_Toc229732698"/>
       <w:r>
         <w:t>FUTURAS MEJORAS Y AMPLIACIONES</w:t>
       </w:r>
-      <w:bookmarkEnd w:id="66"/>
+      <w:bookmarkEnd w:id="70"/>
     </w:p>
     <w:p>
       <w:pPr>
@@ -12536,22 +12462,24 @@
           <w:szCs w:val="32"/>
         </w:rPr>
       </w:pPr>
-      <w:bookmarkStart w:id="67" w:name="_Toc210123176"/>
-      <w:bookmarkStart w:id="68" w:name="_Toc210123303"/>
-      <w:bookmarkStart w:id="69" w:name="_Toc210124634"/>
-      <w:bookmarkStart w:id="70" w:name="_Toc210125392"/>
-      <w:bookmarkStart w:id="71" w:name="_Toc227845070"/>
-      <w:bookmarkStart w:id="72" w:name="_Toc229591892"/>
-      <w:bookmarkStart w:id="73" w:name="_Toc229696470"/>
-      <w:bookmarkStart w:id="74" w:name="_Toc229696545"/>
-      <w:bookmarkEnd w:id="67"/>
-      <w:bookmarkEnd w:id="68"/>
-      <w:bookmarkEnd w:id="69"/>
-      <w:bookmarkEnd w:id="70"/>
+      <w:bookmarkStart w:id="71" w:name="_Toc210123176"/>
+      <w:bookmarkStart w:id="72" w:name="_Toc210123303"/>
+      <w:bookmarkStart w:id="73" w:name="_Toc210124634"/>
+      <w:bookmarkStart w:id="74" w:name="_Toc210125392"/>
+      <w:bookmarkStart w:id="75" w:name="_Toc227845070"/>
+      <w:bookmarkStart w:id="76" w:name="_Toc229591892"/>
+      <w:bookmarkStart w:id="77" w:name="_Toc229696470"/>
+      <w:bookmarkStart w:id="78" w:name="_Toc229696545"/>
+      <w:bookmarkStart w:id="79" w:name="_Toc229732699"/>
       <w:bookmarkEnd w:id="71"/>
       <w:bookmarkEnd w:id="72"/>
       <w:bookmarkEnd w:id="73"/>
       <w:bookmarkEnd w:id="74"/>
+      <w:bookmarkEnd w:id="75"/>
+      <w:bookmarkEnd w:id="76"/>
+      <w:bookmarkEnd w:id="77"/>
+      <w:bookmarkEnd w:id="78"/>
+      <w:bookmarkEnd w:id="79"/>
     </w:p>
     <w:p>
       <w:pPr>
@@ -12561,11 +12489,11 @@
           <w:numId w:val="3"/>
         </w:numPr>
       </w:pPr>
-      <w:bookmarkStart w:id="75" w:name="_Toc229696546"/>
+      <w:bookmarkStart w:id="80" w:name="_Toc229732700"/>
       <w:r>
         <w:t>PROPUESTAS DE MEJORA Y AMPLIACIONES</w:t>
       </w:r>
-      <w:bookmarkEnd w:id="75"/>
+      <w:bookmarkEnd w:id="80"/>
     </w:p>
     <w:p>
       <w:pPr>
@@ -12767,6 +12695,7 @@
         <w:jc w:val="both"/>
       </w:pPr>
       <w:r>
+        <w:lastRenderedPageBreak/>
         <w:t>Porcentaje de documentación completada frente a la pendiente.</w:t>
       </w:r>
     </w:p>
@@ -12915,11 +12844,11 @@
           <w:numId w:val="3"/>
         </w:numPr>
       </w:pPr>
-      <w:bookmarkStart w:id="76" w:name="_Toc229696547"/>
+      <w:bookmarkStart w:id="81" w:name="_Toc229732701"/>
       <w:r>
         <w:t>IMPACTO Y RIESGO DE LOS CAMBIOS PROPUESTOS</w:t>
       </w:r>
-      <w:bookmarkEnd w:id="76"/>
+      <w:bookmarkEnd w:id="81"/>
     </w:p>
     <w:p>
       <w:pPr>
@@ -13062,6 +12991,7 @@
           </w:tcPr>
           <w:p>
             <w:r>
+              <w:lastRenderedPageBreak/>
               <w:t>Dependencias</w:t>
             </w:r>
           </w:p>
@@ -13529,11 +13459,12 @@
           <w:numId w:val="2"/>
         </w:numPr>
       </w:pPr>
-      <w:bookmarkStart w:id="77" w:name="_Toc229696548"/>
-      <w:r>
+      <w:bookmarkStart w:id="82" w:name="_Toc229732702"/>
+      <w:r>
+        <w:lastRenderedPageBreak/>
         <w:t>RELACIÓN CON LOS MÓDULOS DEL CICLO</w:t>
       </w:r>
-      <w:bookmarkEnd w:id="77"/>
+      <w:bookmarkEnd w:id="82"/>
     </w:p>
     <w:p>
       <w:pPr>
@@ -13597,7 +13528,15 @@
         <w:t>a configuración de la conexión con la base de datos mediante el fichero</w:t>
       </w:r>
       <w:r>
-        <w:t xml:space="preserve"> application.properties.</w:t>
+        <w:t xml:space="preserve"> </w:t>
+      </w:r>
+      <w:proofErr w:type="gramStart"/>
+      <w:r>
+        <w:t>application.properties</w:t>
+      </w:r>
+      <w:proofErr w:type="gramEnd"/>
+      <w:r>
+        <w:t>.</w:t>
       </w:r>
     </w:p>
     <w:p>
@@ -13637,7 +13576,15 @@
         <w:jc w:val="both"/>
       </w:pPr>
       <w:r>
-        <w:t xml:space="preserve">Este módulo se relaciona directamente con el desarrollo de appFE, la aplicación móvil Android del proyecto. En ella se aplican los contenidos trabajados en PMDM mediante Kotlin y Jetpack Compose para construir una interfaz nativa con navegación entre pantallas de login, registro, inicio, perfil y calendario. La app permite que el estudiante consulte sus datos de formación, empresa y tutores, registre asistencia diaria, marque ausencias justificadas adjuntando documentación, indique días no lectivos y visualice los días cotizados del mes. Además, utiliza </w:t>
+        <w:t xml:space="preserve">Este módulo se relaciona directamente con el desarrollo de appFE, la aplicación móvil Android del proyecto. En ella se aplican los contenidos trabajados en PMDM mediante Kotlin y Jetpack Compose para construir una interfaz nativa con navegación entre pantallas de login, registro, inicio, perfil y calendario. La </w:t>
+      </w:r>
+      <w:proofErr w:type="gramStart"/>
+      <w:r>
+        <w:t>app</w:t>
+      </w:r>
+      <w:proofErr w:type="gramEnd"/>
+      <w:r>
+        <w:t xml:space="preserve"> permite que el estudiante consulte sus datos de formación, empresa y tutores, registre asistencia diaria, marque ausencias justificadas adjuntando documentación, indique días no lectivos y visualice los días cotizados del mes. Además, utiliza </w:t>
       </w:r>
       <w:r>
         <w:t>almacenamiento</w:t>
@@ -13700,6 +13647,7 @@
           <w:b/>
           <w:bCs/>
         </w:rPr>
+        <w:lastRenderedPageBreak/>
         <w:t>Itinerario Personal para la Empleabilidad</w:t>
       </w:r>
       <w:r>
@@ -13900,15 +13848,77 @@
           <w:numId w:val="2"/>
         </w:numPr>
       </w:pPr>
-      <w:bookmarkStart w:id="78" w:name="_Toc229696549"/>
+      <w:bookmarkStart w:id="83" w:name="_Toc229732703"/>
       <w:r>
         <w:t>CONCLUSIONES</w:t>
       </w:r>
-      <w:bookmarkEnd w:id="78"/>
-    </w:p>
-    <w:p>
-      <w:r>
-        <w:t>(…)</w:t>
+      <w:bookmarkEnd w:id="83"/>
+    </w:p>
+    <w:p>
+      <w:pPr>
+        <w:jc w:val="both"/>
+      </w:pPr>
+      <w:r>
+        <w:t>La realización de este proyecto ha permitido desarrollar una solución completa para la gestión de la Formación en Empresa, partiendo de una necesidad real del entorno educativo: centralizar la información de estudiantes, empresas, tutores, periodos formativos, asistencia, evaluaciones y documentación asociada. El resultado no se limita a una aplicación aislada, sino que integra análisis, diseño, implementación, pruebas, despliegue y documentación, por lo que representa un producto más cercano a un proyecto profesional que a una práctica independiente.</w:t>
+      </w:r>
+    </w:p>
+    <w:p>
+      <w:pPr>
+        <w:jc w:val="both"/>
+      </w:pPr>
+      <w:r>
+        <w:t>Desde el punto de vista funcional, el proyecto aporta una herramienta que ayuda a organizar procesos que normalmente pueden quedar repartidos entre hojas de cálculo, documentos sueltos o comunicaciones informales. La aplicación de escritorio permite trabajar con distintos perfiles de usuario y controlar la información según el rol de administrador, profesor, estudiante o tutor de empresa. Esto aporta trazabilidad, reduce duplicidades y facilita que cada usuario acceda únicamente a las partes del sistema que necesita para realizar su trabajo.</w:t>
+      </w:r>
+    </w:p>
+    <w:p>
+      <w:pPr>
+        <w:jc w:val="both"/>
+      </w:pPr>
+      <w:r>
+        <w:t xml:space="preserve">Uno de los aspectos más importantes del proyecto ha sido la combinación de tecnologías. La parte principal se ha construido con Java, Spring Boot, JavaFX, Maven y MariaDB, aplicando una arquitectura organizada por capas y una persistencia basada en entidades, repositorios y servicios. Además, la aplicación móvil appFE, desarrollada con Kotlin y Jetpack Compose, amplía el alcance del sistema hacia dispositivos Android y permite demostrar conocimientos de programación móvil, navegación entre pantallas, persistencia local y recordatorios. Esta combinación ha reforzado la visión de un sistema multiplataforma, con una aplicación de escritorio más completa y una </w:t>
+      </w:r>
+      <w:proofErr w:type="gramStart"/>
+      <w:r>
+        <w:t>app</w:t>
+      </w:r>
+      <w:proofErr w:type="gramEnd"/>
+      <w:r>
+        <w:t xml:space="preserve"> móvil complementaria.</w:t>
+      </w:r>
+    </w:p>
+    <w:p>
+      <w:pPr>
+        <w:jc w:val="both"/>
+      </w:pPr>
+      <w:r>
+        <w:t>En el desarrollo también se han aplicado contenidos de distintos módulos del ciclo: programación orientada a objetos, diseño de interfaces, acceso a datos, bases de datos, entornos de desarrollo, programación multimedia y dispositivos móviles</w:t>
+      </w:r>
+      <w:r>
+        <w:t xml:space="preserve"> y</w:t>
+      </w:r>
+      <w:r>
+        <w:t xml:space="preserve"> sistemas de gestión empresarial. Gracias a ello el proyecto ha servido para unir conocimientos que durante el ciclo se habían trabajado por separado, convirtiéndolos en una solución común y coherente.</w:t>
+      </w:r>
+    </w:p>
+    <w:p>
+      <w:pPr>
+        <w:jc w:val="both"/>
+      </w:pPr>
+      <w:r>
+        <w:t>El plan de pruebas ha sido otro punto relevante, ya que ha permitido comprobar el comportamiento de las funcionalidades principales y validar parte de la lógica mediante pruebas unitarias con JUnit. Esta fase ha ayudado a detectar errores, revisar casos de uso y ganar confianza en el funcionamiento final de la aplicación. Del mismo modo, la documentación técnica, el manual de usuario, la guía de estilos, el índice de figuras y el despliegue contribuyen a que el proyecto sea comprensible, instalable y mantenible.</w:t>
+      </w:r>
+    </w:p>
+    <w:p>
+      <w:pPr>
+        <w:jc w:val="both"/>
+      </w:pPr>
+      <w:r>
+        <w:t>Como valoración final, el proyecto ha aportado experiencia en la planificación y construcción de una aplicación real desde cero, en la toma de decisiones técnicas, en la resolución de problemas durante el desarrollo y en la presentación ordenada de todo el trabajo realizado. También deja una base ampliable para futuras mejoras, como la sincronización entre la aplicación móvil y la aplicación de escritorio, la incorporación de servicios web, mejoras de seguridad o nuevas funcionalidades de seguimiento. En conjunto, el proyecto demuestra la capacidad de analizar una necesidad, diseñar una solución, implementarla, probarla y documentarla de forma completa.</w:t>
+      </w:r>
+    </w:p>
+    <w:p>
+      <w:r>
+        <w:br w:type="page"/>
       </w:r>
     </w:p>
     <w:p>
@@ -13919,18 +13929,27 @@
           <w:numId w:val="2"/>
         </w:numPr>
       </w:pPr>
-      <w:bookmarkStart w:id="79" w:name="_Toc229696550"/>
-      <w:r>
+      <w:bookmarkStart w:id="84" w:name="_Toc229732704"/>
+      <w:r>
+        <w:lastRenderedPageBreak/>
         <w:t>DESPLIEGUE DE LA APLICACIÓN</w:t>
       </w:r>
-      <w:bookmarkEnd w:id="79"/>
-    </w:p>
-    <w:p>
-      <w:pPr>
-        <w:jc w:val="both"/>
-      </w:pPr>
-      <w:r>
-        <w:t>El despliegue del proyecto se plantea en dos partes diferenciadas: por un lado, la aplicación principal de escritorio para Windows, desarrollada con Java, Spring Boot, JavaFX y MariaDB; por otro, la aplicación móvil appFE para Android, desarrollada con Kotlin y Jetpack Compose. Ambos despliegues son complementarios, ya que la aplicación de escritorio concentra la gestión completa del sistema y la app móvil ofrece al estudiante una vía sencilla para consultar y registrar información básica de su formación.</w:t>
+      <w:bookmarkEnd w:id="84"/>
+    </w:p>
+    <w:p>
+      <w:pPr>
+        <w:jc w:val="both"/>
+      </w:pPr>
+      <w:r>
+        <w:t xml:space="preserve">El despliegue del proyecto se plantea en dos partes diferenciadas: por un lado, la aplicación principal de escritorio para Windows, desarrollada con Java, Spring Boot, JavaFX y MariaDB; por otro, la aplicación móvil appFE para Android, desarrollada con Kotlin y Jetpack Compose. Ambos despliegues son complementarios, ya que la aplicación de escritorio concentra la gestión completa del sistema y la </w:t>
+      </w:r>
+      <w:proofErr w:type="gramStart"/>
+      <w:r>
+        <w:t>app</w:t>
+      </w:r>
+      <w:proofErr w:type="gramEnd"/>
+      <w:r>
+        <w:t xml:space="preserve"> móvil ofrece al estudiante una vía sencilla para consultar y registrar información básica de su formación.</w:t>
       </w:r>
     </w:p>
     <w:p>
@@ -13970,18 +13989,66 @@
         <w:jc w:val="both"/>
       </w:pPr>
       <w:r>
-        <w:t>Antes de iniciar el ejecutable debe estar levantado el servicio de MariaDB/MySQL, por ejemplo desde XAMPP, y debe haberse importado el script bdfe_bruno.sql. Además, la configuración de conexión debe coincidir con la definida en application.properties: jdbc:mysql://localhost:3306/bdfe_bruno, usuario root y contraseña vacía en el entorno local usado para el proyecto. Si se usa otro equipo, usuario o contraseña, estos datos deben modificarse antes de ejecutar la aplicación.</w:t>
-      </w:r>
-    </w:p>
-    <w:p>
-      <w:pPr>
-        <w:jc w:val="both"/>
-      </w:pPr>
-      <w:r>
-        <w:t>La segunda forma, pensada para desarrollo o revisión técnica, consiste en ejecutar la aplicación desde el propio proyecto ProyectoFEBruno. Para ello se abre una terminal en la carpeta del proyecto y se utiliza el Maven Wrapper incluido. Durante el desarrollo puede lanzarse con mvnw.cmd javafx:run, y si se quiere compilar el proyecto completo puede ejecutarse mvnw.cmd clean package para generar el artefacto en la carpeta target.</w:t>
-      </w:r>
-      <w:r>
-        <w:t xml:space="preserve"> Sino se puede realizar desde el IDE deseado haciendo un run de Maven y seleccionando el goal de javafx:run.</w:t>
+        <w:t xml:space="preserve">Antes de iniciar el ejecutable debe estar levantado el servicio de MariaDB/MySQL, por </w:t>
+      </w:r>
+      <w:proofErr w:type="gramStart"/>
+      <w:r>
+        <w:t>ejemplo</w:t>
+      </w:r>
+      <w:proofErr w:type="gramEnd"/>
+      <w:r>
+        <w:t xml:space="preserve"> desde XAMPP, y debe haberse importado el script bdfe_bruno.sql. Además, la configuración de conexión debe coincidir con la definida en </w:t>
+      </w:r>
+      <w:proofErr w:type="gramStart"/>
+      <w:r>
+        <w:t>application.properties</w:t>
+      </w:r>
+      <w:proofErr w:type="gramEnd"/>
+      <w:r>
+        <w:t xml:space="preserve">: </w:t>
+      </w:r>
+      <w:proofErr w:type="gramStart"/>
+      <w:r>
+        <w:t>jdbc:mysql://localhost:3306/bdfe_bruno</w:t>
+      </w:r>
+      <w:proofErr w:type="gramEnd"/>
+      <w:r>
+        <w:t>, usuario root y contraseña vacía en el entorno local usado para el proyecto. Si se usa otro equipo, usuario o contraseña, estos datos deben modificarse antes de ejecutar la aplicación.</w:t>
+      </w:r>
+    </w:p>
+    <w:p>
+      <w:pPr>
+        <w:jc w:val="both"/>
+      </w:pPr>
+      <w:r>
+        <w:t xml:space="preserve">La segunda forma, pensada para desarrollo o revisión técnica, consiste en ejecutar la aplicación desde el propio proyecto ProyectoFEBruno. Para ello se abre una terminal en la carpeta del proyecto y se utiliza el Maven Wrapper incluido. Durante el desarrollo puede lanzarse con mvnw.cmd </w:t>
+      </w:r>
+      <w:proofErr w:type="gramStart"/>
+      <w:r>
+        <w:t>javafx:run</w:t>
+      </w:r>
+      <w:proofErr w:type="gramEnd"/>
+      <w:r>
+        <w:t xml:space="preserve">, y si se quiere compilar el proyecto completo puede ejecutarse mvnw.cmd clean package para generar el artefacto en la carpeta </w:t>
+      </w:r>
+      <w:proofErr w:type="gramStart"/>
+      <w:r>
+        <w:t>target</w:t>
+      </w:r>
+      <w:proofErr w:type="gramEnd"/>
+      <w:r>
+        <w:t>.</w:t>
+      </w:r>
+      <w:r>
+        <w:t xml:space="preserve"> Sino se puede realizar desde el IDE deseado haciendo un run de Maven y seleccionando el goal de </w:t>
+      </w:r>
+      <w:proofErr w:type="gramStart"/>
+      <w:r>
+        <w:t>javafx:run</w:t>
+      </w:r>
+      <w:proofErr w:type="gramEnd"/>
+      <w:r>
+        <w:t>.</w:t>
       </w:r>
     </w:p>
     <w:p>
@@ -14001,10 +14068,7 @@
         <w:jc w:val="both"/>
       </w:pPr>
       <w:r>
-        <w:t>La aplicación móvil appFE</w:t>
-      </w:r>
-      <w:r>
-        <w:t xml:space="preserve"> se despliega como una aplicación Android independiente. Está desarrollada en Kotlin con Jetpack Compose y se encuentra dentro de la carpeta appFE. </w:t>
+        <w:t xml:space="preserve">La aplicación móvil appFE se despliega como una aplicación Android independiente. Está desarrollada en Kotlin con Jetpack Compose y se encuentra dentro de la carpeta appFE. </w:t>
       </w:r>
     </w:p>
     <w:p>
@@ -14026,15 +14090,35 @@
         <w:jc w:val="both"/>
       </w:pPr>
       <w:r>
-        <w:t>La instalación en el dispositivo puede realizarse conectando el móvil por USB y usando Android Studio o adb install, o copiando el APK al dispositivo y permitiendo la instalación desde orígenes externos. La app tiene como minSdk la versión 26 de Android, por lo que requiere un dispositivo compatible con esa versión o superior. En Android 13 o superior también debe concederse el permiso de notificaciones para que los recordatorios funcionen correctamente.</w:t>
-      </w:r>
-    </w:p>
-    <w:p>
-      <w:pPr>
-        <w:jc w:val="both"/>
-      </w:pPr>
-      <w:r>
-        <w:t>A diferencia de la aplicación de escritorio, appFE conserva sus datos de forma local mediante DataStore. Por tanto, para el despliegue básico de la app móvil no es necesario instalar MariaDB ni configurar un servidor externo: los usuarios, la sesión activa y los registros del calendario se almacenan en el propio dispositivo. Esta decisión simplifica la instalación móvil y permite demostrar la funcionalidad Android del proyecto de manera autónoma.</w:t>
+        <w:t xml:space="preserve">La instalación en el dispositivo puede realizarse conectando el móvil por USB y usando Android Studio o adb install, o copiando el APK al dispositivo y permitiendo la instalación desde orígenes externos. La </w:t>
+      </w:r>
+      <w:proofErr w:type="gramStart"/>
+      <w:r>
+        <w:t>app</w:t>
+      </w:r>
+      <w:proofErr w:type="gramEnd"/>
+      <w:r>
+        <w:t xml:space="preserve"> tiene como minSdk la versión 26 de Android, por lo que requiere un dispositivo compatible con esa versión o superior. En Android 13 o superior también debe concederse el permiso de notificaciones para que los recordatorios funcionen correctamente.</w:t>
+      </w:r>
+    </w:p>
+    <w:p>
+      <w:pPr>
+        <w:jc w:val="both"/>
+      </w:pPr>
+      <w:r>
+        <w:t xml:space="preserve">A diferencia de la aplicación de escritorio, appFE conserva sus datos de forma local mediante DataStore. Por tanto, para el despliegue básico de la </w:t>
+      </w:r>
+      <w:proofErr w:type="gramStart"/>
+      <w:r>
+        <w:t>app</w:t>
+      </w:r>
+      <w:proofErr w:type="gramEnd"/>
+      <w:r>
+        <w:t xml:space="preserve"> móvil no es necesario instalar MariaDB ni configurar un servidor externo: los usuarios, la sesión activa y los registros del calendario se almacenan </w:t>
+      </w:r>
+      <w:r>
+        <w:lastRenderedPageBreak/>
+        <w:t>en el propio dispositivo. Esta decisión simplifica la instalación móvil y permite demostrar la funcionalidad Android del proyecto de manera autónoma.</w:t>
       </w:r>
       <w:r>
         <w:br w:type="page"/>
@@ -14048,11 +14132,12 @@
           <w:numId w:val="2"/>
         </w:numPr>
       </w:pPr>
-      <w:bookmarkStart w:id="80" w:name="_Toc229696551"/>
-      <w:r>
+      <w:bookmarkStart w:id="85" w:name="_Toc229732705"/>
+      <w:r>
+        <w:lastRenderedPageBreak/>
         <w:t>GUÍA DE ESTILOS Y MANUAL DE USUARIO</w:t>
       </w:r>
-      <w:bookmarkEnd w:id="80"/>
+      <w:bookmarkEnd w:id="85"/>
     </w:p>
     <w:p>
       <w:pPr>
@@ -14082,22 +14167,24 @@
           <w:szCs w:val="32"/>
         </w:rPr>
       </w:pPr>
-      <w:bookmarkStart w:id="81" w:name="_Toc210123187"/>
-      <w:bookmarkStart w:id="82" w:name="_Toc210123314"/>
-      <w:bookmarkStart w:id="83" w:name="_Toc210124645"/>
-      <w:bookmarkStart w:id="84" w:name="_Toc210125403"/>
-      <w:bookmarkStart w:id="85" w:name="_Toc227845081"/>
-      <w:bookmarkStart w:id="86" w:name="_Toc229591903"/>
-      <w:bookmarkStart w:id="87" w:name="_Toc229696477"/>
-      <w:bookmarkStart w:id="88" w:name="_Toc229696552"/>
-      <w:bookmarkEnd w:id="81"/>
-      <w:bookmarkEnd w:id="82"/>
-      <w:bookmarkEnd w:id="83"/>
-      <w:bookmarkEnd w:id="84"/>
-      <w:bookmarkEnd w:id="85"/>
+      <w:bookmarkStart w:id="86" w:name="_Toc210123187"/>
+      <w:bookmarkStart w:id="87" w:name="_Toc210123314"/>
+      <w:bookmarkStart w:id="88" w:name="_Toc210124645"/>
+      <w:bookmarkStart w:id="89" w:name="_Toc210125403"/>
+      <w:bookmarkStart w:id="90" w:name="_Toc227845081"/>
+      <w:bookmarkStart w:id="91" w:name="_Toc229591903"/>
+      <w:bookmarkStart w:id="92" w:name="_Toc229696477"/>
+      <w:bookmarkStart w:id="93" w:name="_Toc229696552"/>
+      <w:bookmarkStart w:id="94" w:name="_Toc229732706"/>
       <w:bookmarkEnd w:id="86"/>
       <w:bookmarkEnd w:id="87"/>
       <w:bookmarkEnd w:id="88"/>
+      <w:bookmarkEnd w:id="89"/>
+      <w:bookmarkEnd w:id="90"/>
+      <w:bookmarkEnd w:id="91"/>
+      <w:bookmarkEnd w:id="92"/>
+      <w:bookmarkEnd w:id="93"/>
+      <w:bookmarkEnd w:id="94"/>
     </w:p>
     <w:p>
       <w:pPr>
@@ -14107,11 +14194,11 @@
           <w:numId w:val="3"/>
         </w:numPr>
       </w:pPr>
-      <w:bookmarkStart w:id="89" w:name="_Toc229696553"/>
+      <w:bookmarkStart w:id="95" w:name="_Toc229732707"/>
       <w:r>
         <w:t>GUÍA DE ESTILOS</w:t>
       </w:r>
-      <w:bookmarkEnd w:id="89"/>
+      <w:bookmarkEnd w:id="95"/>
     </w:p>
     <w:p>
       <w:pPr>
@@ -14282,11 +14369,11 @@
         <w:pStyle w:val="Ttulo3"/>
         <w:ind w:firstLine="360"/>
       </w:pPr>
-      <w:bookmarkStart w:id="90" w:name="_Toc229696554"/>
+      <w:bookmarkStart w:id="96" w:name="_Toc229732708"/>
       <w:r>
         <w:t>10.1.1 PALETA DE COLORES</w:t>
       </w:r>
-      <w:bookmarkEnd w:id="90"/>
+      <w:bookmarkEnd w:id="96"/>
     </w:p>
     <w:p>
       <w:pPr>
@@ -14852,13 +14939,14 @@
         <w:pStyle w:val="Ttulo3"/>
       </w:pPr>
       <w:r>
+        <w:lastRenderedPageBreak/>
         <w:t xml:space="preserve">       </w:t>
       </w:r>
-      <w:bookmarkStart w:id="91" w:name="_Toc229696555"/>
+      <w:bookmarkStart w:id="97" w:name="_Toc229732709"/>
       <w:r>
         <w:t>10.1.2 TIPOGRAFÍA</w:t>
       </w:r>
-      <w:bookmarkEnd w:id="91"/>
+      <w:bookmarkEnd w:id="97"/>
     </w:p>
     <w:p>
       <w:pPr>
@@ -14883,11 +14971,11 @@
         <w:pStyle w:val="Ttulo3"/>
         <w:ind w:firstLine="360"/>
       </w:pPr>
-      <w:bookmarkStart w:id="92" w:name="_Toc229696556"/>
+      <w:bookmarkStart w:id="98" w:name="_Toc229732710"/>
       <w:r>
         <w:t>10.1.3 COMPONENTES VISUALES</w:t>
       </w:r>
-      <w:bookmarkEnd w:id="92"/>
+      <w:bookmarkEnd w:id="98"/>
     </w:p>
     <w:p>
       <w:pPr>
@@ -14906,7 +14994,15 @@
         <w:jc w:val="both"/>
       </w:pPr>
       <w:r>
-        <w:t>Botones (.button): fondo azul #3498db, texto blanco, esquinas redondeadas (5 px), padding 10×20 px y cursor de mano. Variantes:</w:t>
+        <w:t xml:space="preserve">Botones </w:t>
+      </w:r>
+      <w:proofErr w:type="gramStart"/>
+      <w:r>
+        <w:t>(.button</w:t>
+      </w:r>
+      <w:proofErr w:type="gramEnd"/>
+      <w:r>
+        <w:t>): fondo azul #3498db, texto blanco, esquinas redondeadas (5 px), padding 10×20 px y cursor de mano. Variantes:</w:t>
       </w:r>
     </w:p>
     <w:p>
@@ -14917,8 +15013,13 @@
         </w:numPr>
         <w:jc w:val="both"/>
       </w:pPr>
-      <w:r>
-        <w:t>.button-success (verde) para guardar.</w:t>
+      <w:proofErr w:type="gramStart"/>
+      <w:r>
+        <w:t>.button</w:t>
+      </w:r>
+      <w:proofErr w:type="gramEnd"/>
+      <w:r>
+        <w:t>-success (verde) para guardar.</w:t>
       </w:r>
     </w:p>
     <w:p>
@@ -14929,8 +15030,13 @@
         </w:numPr>
         <w:jc w:val="both"/>
       </w:pPr>
-      <w:r>
-        <w:t>.button-danger (rojo) para eliminar.</w:t>
+      <w:proofErr w:type="gramStart"/>
+      <w:r>
+        <w:t>.button</w:t>
+      </w:r>
+      <w:proofErr w:type="gramEnd"/>
+      <w:r>
+        <w:t>-danger (rojo) para eliminar.</w:t>
       </w:r>
     </w:p>
     <w:p>
@@ -14941,8 +15047,21 @@
         </w:numPr>
         <w:jc w:val="both"/>
       </w:pPr>
-      <w:r>
-        <w:t>.button-warning (naranja) para advertencias.</w:t>
+      <w:proofErr w:type="gramStart"/>
+      <w:r>
+        <w:t>.button</w:t>
+      </w:r>
+      <w:proofErr w:type="gramEnd"/>
+      <w:r>
+        <w:t>-</w:t>
+      </w:r>
+      <w:proofErr w:type="gramStart"/>
+      <w:r>
+        <w:t>warning</w:t>
+      </w:r>
+      <w:proofErr w:type="gramEnd"/>
+      <w:r>
+        <w:t> (naranja) para advertencias.</w:t>
       </w:r>
     </w:p>
     <w:p>
@@ -14953,8 +15072,13 @@
         </w:numPr>
         <w:jc w:val="both"/>
       </w:pPr>
-      <w:r>
-        <w:t>.button-logout</w:t>
+      <w:proofErr w:type="gramStart"/>
+      <w:r>
+        <w:t>.button</w:t>
+      </w:r>
+      <w:proofErr w:type="gramEnd"/>
+      <w:r>
+        <w:t>-logout</w:t>
       </w:r>
       <w:r>
         <w:t> (rojo) específicamente para cerrar sesión.</w:t>
@@ -14969,7 +15093,23 @@
         <w:jc w:val="both"/>
       </w:pPr>
       <w:r>
-        <w:t>Campos de formulario (.text-field, .password-field, .text-area, .combo-box): fondo blanco, borde gris (#bdc3c7) que se vuelve azul al recibir el foco, junto con un suave </w:t>
+        <w:t>Campos de formulario (.text-field</w:t>
+      </w:r>
+      <w:proofErr w:type="gramStart"/>
+      <w:r>
+        <w:t>, .password</w:t>
+      </w:r>
+      <w:proofErr w:type="gramEnd"/>
+      <w:r>
+        <w:t>-field, .text-area</w:t>
+      </w:r>
+      <w:proofErr w:type="gramStart"/>
+      <w:r>
+        <w:t>, .combo</w:t>
+      </w:r>
+      <w:proofErr w:type="gramEnd"/>
+      <w:r>
+        <w:t>-box): fondo blanco, borde gris (#bdc3c7) que se vuelve azul al recibir el foco, junto con un suave </w:t>
       </w:r>
       <w:r>
         <w:rPr>
@@ -14991,10 +15131,18 @@
         <w:jc w:val="both"/>
       </w:pPr>
       <w:r>
-        <w:t>Tablas (</w:t>
-      </w:r>
-      <w:r>
-        <w:t>.table-view</w:t>
+        <w:t xml:space="preserve">Tablas </w:t>
+      </w:r>
+      <w:proofErr w:type="gramStart"/>
+      <w:r>
+        <w:t>(</w:t>
+      </w:r>
+      <w:r>
+        <w:t>.table</w:t>
+      </w:r>
+      <w:proofErr w:type="gramEnd"/>
+      <w:r>
+        <w:t>-view</w:t>
       </w:r>
       <w:r>
         <w:t>): cabecera oscura (#2c3e50) con texto blanco en negrita; filas alternas con fondo gris claro (#f8f9fa) para mejorar la lectura; selección destacada en azul.</w:t>
@@ -15009,7 +15157,15 @@
         <w:jc w:val="both"/>
       </w:pPr>
       <w:r>
-        <w:t>Tarjetas de menú (.menu-card): fondo blanco, esquinas redondeadas (15 px), sombra suave y un efecto de </w:t>
+        <w:t xml:space="preserve">Tarjetas de menú </w:t>
+      </w:r>
+      <w:proofErr w:type="gramStart"/>
+      <w:r>
+        <w:t>(.menu</w:t>
+      </w:r>
+      <w:proofErr w:type="gramEnd"/>
+      <w:r>
+        <w:t>-card): fondo blanco, esquinas redondeadas (15 px), sombra suave y un efecto de </w:t>
       </w:r>
       <w:r>
         <w:rPr>
@@ -15031,7 +15187,15 @@
         <w:jc w:val="both"/>
       </w:pPr>
       <w:r>
-        <w:t>Cabeceras (.header-panel): degradado azul horizontal #3498db → #2980b9 con sombra inferior, sobre el que se sitúan el logotipo del centro, el título de la pantalla y la información del usuario.</w:t>
+        <w:t xml:space="preserve">Cabeceras </w:t>
+      </w:r>
+      <w:proofErr w:type="gramStart"/>
+      <w:r>
+        <w:t>(.header</w:t>
+      </w:r>
+      <w:proofErr w:type="gramEnd"/>
+      <w:r>
+        <w:t>-panel): degradado azul horizontal #3498db → #2980b9 con sombra inferior, sobre el que se sitúan el logotipo del centro, el título de la pantalla y la información del usuario.</w:t>
       </w:r>
     </w:p>
     <w:p>
@@ -15043,7 +15207,15 @@
         <w:jc w:val="both"/>
       </w:pPr>
       <w:r>
-        <w:t>Barra de menús (.menu-bar): fondo azul oscuro #2c3e50, texto blanco; los menús contextuales utilizan fondo blanco con sombra y resaltan en azul el elemento sobre el que se pasa el ratón.</w:t>
+        <w:t xml:space="preserve">Barra de menús </w:t>
+      </w:r>
+      <w:proofErr w:type="gramStart"/>
+      <w:r>
+        <w:t>(.menu</w:t>
+      </w:r>
+      <w:proofErr w:type="gramEnd"/>
+      <w:r>
+        <w:t>-bar): fondo azul oscuro #2c3e50, texto blanco; los menús contextuales utilizan fondo blanco con sombra y resaltan en azul el elemento sobre el que se pasa el ratón.</w:t>
       </w:r>
     </w:p>
     <w:p>
@@ -15055,7 +15227,15 @@
         <w:jc w:val="both"/>
       </w:pPr>
       <w:r>
-        <w:t>Pie de página (.footer-panel): fondo gris muy claro #ecf0f1 con borde superior, texto en gris medio.</w:t>
+        <w:t xml:space="preserve">Pie de página </w:t>
+      </w:r>
+      <w:proofErr w:type="gramStart"/>
+      <w:r>
+        <w:t>(.footer</w:t>
+      </w:r>
+      <w:proofErr w:type="gramEnd"/>
+      <w:r>
+        <w:t>-panel): fondo gris muy claro #ecf0f1 con borde superior, texto en gris medio.</w:t>
       </w:r>
     </w:p>
     <w:p>
@@ -15063,11 +15243,11 @@
         <w:pStyle w:val="Ttulo3"/>
         <w:ind w:firstLine="360"/>
       </w:pPr>
-      <w:bookmarkStart w:id="93" w:name="_Toc229696557"/>
+      <w:bookmarkStart w:id="99" w:name="_Toc229732711"/>
       <w:r>
         <w:t>10.1.4 ICONOGRAFÍA E IMÁGENES</w:t>
       </w:r>
-      <w:bookmarkEnd w:id="93"/>
+      <w:bookmarkEnd w:id="99"/>
     </w:p>
     <w:p>
       <w:pPr>
@@ -15086,7 +15266,15 @@
         <w:t xml:space="preserve"> </w:t>
       </w:r>
       <w:r>
-        <w:t>Los iconos circulares decorativos (.icon-placeholder) se construyen mediante CSS (sin ficheros adicionales) para mantener el peso de la aplicación reducido.</w:t>
+        <w:t xml:space="preserve">Los iconos circulares decorativos </w:t>
+      </w:r>
+      <w:proofErr w:type="gramStart"/>
+      <w:r>
+        <w:t>(.icon</w:t>
+      </w:r>
+      <w:proofErr w:type="gramEnd"/>
+      <w:r>
+        <w:t>-placeholder) se construyen mediante CSS (sin ficheros adicionales) para mantener el peso de la aplicación reducido.</w:t>
       </w:r>
     </w:p>
     <w:p>
@@ -15110,6 +15298,7 @@
         <w:jc w:val="both"/>
       </w:pPr>
       <w:r>
+        <w:lastRenderedPageBreak/>
         <w:t>Iconos utilizados:</w:t>
       </w:r>
     </w:p>
@@ -15312,11 +15501,11 @@
         <w:pStyle w:val="Ttulo3"/>
         <w:ind w:firstLine="360"/>
       </w:pPr>
-      <w:bookmarkStart w:id="94" w:name="_Toc229696558"/>
+      <w:bookmarkStart w:id="100" w:name="_Toc229732712"/>
       <w:r>
         <w:t>10.1.5 DISPOSICIÓN Y COMPORTAMIENTO DE LAS VENTANAS</w:t>
       </w:r>
-      <w:bookmarkEnd w:id="94"/>
+      <w:bookmarkEnd w:id="100"/>
     </w:p>
     <w:p>
       <w:pPr>
@@ -15401,7 +15590,7 @@
         <w:pStyle w:val="Ttulo3"/>
         <w:ind w:firstLine="360"/>
       </w:pPr>
-      <w:bookmarkStart w:id="95" w:name="_Toc229696559"/>
+      <w:bookmarkStart w:id="101" w:name="_Toc229732713"/>
       <w:r>
         <w:t>10.1.</w:t>
       </w:r>
@@ -15411,7 +15600,7 @@
       <w:r>
         <w:t xml:space="preserve"> PRINCIPIOS DE DISEÑO</w:t>
       </w:r>
-      <w:bookmarkEnd w:id="95"/>
+      <w:bookmarkEnd w:id="101"/>
     </w:p>
     <w:p>
       <w:pPr>
@@ -15547,6 +15736,7 @@
           <w:b/>
           <w:bCs/>
         </w:rPr>
+        <w:lastRenderedPageBreak/>
         <w:t>Mantenibilidad:</w:t>
       </w:r>
       <w:r>
@@ -15564,11 +15754,11 @@
         <w:pStyle w:val="Ttulo3"/>
         <w:ind w:firstLine="360"/>
       </w:pPr>
-      <w:bookmarkStart w:id="96" w:name="_Toc229696560"/>
+      <w:bookmarkStart w:id="102" w:name="_Toc229732714"/>
       <w:r>
         <w:t>10.1.7 INTERFACES</w:t>
       </w:r>
-      <w:bookmarkEnd w:id="96"/>
+      <w:bookmarkEnd w:id="102"/>
     </w:p>
     <w:p>
       <w:r>
@@ -15628,7 +15818,7 @@
                     <pic:cNvPicPr/>
                   </pic:nvPicPr>
                   <pic:blipFill>
-                    <a:blip r:embed="rId28"/>
+                    <a:blip r:embed="rId27"/>
                     <a:stretch>
                       <a:fillRect/>
                     </a:stretch>
@@ -15653,35 +15843,22 @@
       <w:pPr>
         <w:pStyle w:val="Descripcin"/>
       </w:pPr>
-      <w:bookmarkStart w:id="97" w:name="_Toc229696501"/>
+      <w:bookmarkStart w:id="103" w:name="_Toc229732655"/>
       <w:r>
         <w:t xml:space="preserve">Figura </w:t>
       </w:r>
-      <w:r>
-        <w:fldChar w:fldCharType="begin"/>
-      </w:r>
-      <w:r>
-        <w:instrText xml:space="preserve"> SEQ Figura \* ARABIC </w:instrText>
-      </w:r>
-      <w:r>
-        <w:fldChar w:fldCharType="separate"/>
-      </w:r>
-      <w:r>
-        <w:rPr>
-          <w:noProof/>
-        </w:rPr>
-        <w:t>13</w:t>
-      </w:r>
-      <w:r>
-        <w:rPr>
-          <w:noProof/>
-        </w:rPr>
-        <w:fldChar w:fldCharType="end"/>
-      </w:r>
+      <w:fldSimple w:instr=" SEQ Figura \* ARABIC ">
+        <w:r>
+          <w:rPr>
+            <w:noProof/>
+          </w:rPr>
+          <w:t>13</w:t>
+        </w:r>
+      </w:fldSimple>
       <w:r>
         <w:t>. Pantalla de carga de la aplicación</w:t>
       </w:r>
-      <w:bookmarkEnd w:id="97"/>
+      <w:bookmarkEnd w:id="103"/>
     </w:p>
     <w:p>
       <w:r>
@@ -15697,6 +15874,7 @@
           <w:b/>
           <w:bCs/>
         </w:rPr>
+        <w:lastRenderedPageBreak/>
         <w:t>Login</w:t>
       </w:r>
       <w:r>
@@ -15734,7 +15912,7 @@
                     <pic:cNvPicPr/>
                   </pic:nvPicPr>
                   <pic:blipFill>
-                    <a:blip r:embed="rId29"/>
+                    <a:blip r:embed="rId28"/>
                     <a:stretch>
                       <a:fillRect/>
                     </a:stretch>
@@ -15759,35 +15937,22 @@
       <w:pPr>
         <w:pStyle w:val="Descripcin"/>
       </w:pPr>
-      <w:bookmarkStart w:id="98" w:name="_Toc229696502"/>
+      <w:bookmarkStart w:id="104" w:name="_Toc229732656"/>
       <w:r>
         <w:t xml:space="preserve">Figura </w:t>
       </w:r>
-      <w:r>
-        <w:fldChar w:fldCharType="begin"/>
-      </w:r>
-      <w:r>
-        <w:instrText xml:space="preserve"> SEQ Figura \* ARABIC </w:instrText>
-      </w:r>
-      <w:r>
-        <w:fldChar w:fldCharType="separate"/>
-      </w:r>
-      <w:r>
-        <w:rPr>
-          <w:noProof/>
-        </w:rPr>
-        <w:t>14</w:t>
-      </w:r>
-      <w:r>
-        <w:rPr>
-          <w:noProof/>
-        </w:rPr>
-        <w:fldChar w:fldCharType="end"/>
-      </w:r>
+      <w:fldSimple w:instr=" SEQ Figura \* ARABIC ">
+        <w:r>
+          <w:rPr>
+            <w:noProof/>
+          </w:rPr>
+          <w:t>14</w:t>
+        </w:r>
+      </w:fldSimple>
       <w:r>
         <w:t>. Pantalla de inicio de sesión</w:t>
       </w:r>
-      <w:bookmarkEnd w:id="98"/>
+      <w:bookmarkEnd w:id="104"/>
     </w:p>
     <w:p>
       <w:pPr>
@@ -15830,6 +15995,7 @@
         <w:rPr>
           <w:noProof/>
         </w:rPr>
+        <w:lastRenderedPageBreak/>
         <w:drawing>
           <wp:inline distT="0" distB="0" distL="0" distR="0" wp14:anchorId="78AFF438" wp14:editId="4E786B93">
             <wp:extent cx="6120130" cy="3323590"/>
@@ -15843,6 +16009,99 @@
                 <pic:pic xmlns:pic="http://schemas.openxmlformats.org/drawingml/2006/picture">
                   <pic:nvPicPr>
                     <pic:cNvPr id="892716988" name=""/>
+                    <pic:cNvPicPr/>
+                  </pic:nvPicPr>
+                  <pic:blipFill>
+                    <a:blip r:embed="rId29"/>
+                    <a:stretch>
+                      <a:fillRect/>
+                    </a:stretch>
+                  </pic:blipFill>
+                  <pic:spPr>
+                    <a:xfrm>
+                      <a:off x="0" y="0"/>
+                      <a:ext cx="6120130" cy="3323590"/>
+                    </a:xfrm>
+                    <a:prstGeom prst="rect">
+                      <a:avLst/>
+                    </a:prstGeom>
+                  </pic:spPr>
+                </pic:pic>
+              </a:graphicData>
+            </a:graphic>
+          </wp:inline>
+        </w:drawing>
+      </w:r>
+    </w:p>
+    <w:p>
+      <w:pPr>
+        <w:pStyle w:val="Descripcin"/>
+      </w:pPr>
+      <w:bookmarkStart w:id="105" w:name="_Toc229732657"/>
+      <w:r>
+        <w:t xml:space="preserve">Figura </w:t>
+      </w:r>
+      <w:fldSimple w:instr=" SEQ Figura \* ARABIC ">
+        <w:r>
+          <w:rPr>
+            <w:noProof/>
+          </w:rPr>
+          <w:t>15</w:t>
+        </w:r>
+      </w:fldSimple>
+      <w:r>
+        <w:t>. Panel de administrador</w:t>
+      </w:r>
+      <w:bookmarkEnd w:id="105"/>
+    </w:p>
+    <w:p>
+      <w:pPr>
+        <w:jc w:val="both"/>
+      </w:pPr>
+    </w:p>
+    <w:p>
+      <w:pPr>
+        <w:jc w:val="both"/>
+      </w:pPr>
+      <w:r>
+        <w:rPr>
+          <w:b/>
+          <w:bCs/>
+        </w:rPr>
+        <w:t>MenúProfesor</w:t>
+      </w:r>
+      <w:r>
+        <w:br/>
+        <w:t>Esta interfaz usa un BorderPane como contenedor base. La zona superior contiene el menú de navegación y la información del usuario. En el centro se organiza el contenido mediante un VBox con título, subtítulo y un GridPane de tarjetas funcionales. Cada tarjeta representa una sección del sistema mediante icono, texto principal y descripción. En la parte inferior aparece un pie de página integrado</w:t>
+      </w:r>
+      <w:r>
+        <w:t xml:space="preserve"> del componente ya creado</w:t>
+      </w:r>
+      <w:r>
+        <w:t>.</w:t>
+      </w:r>
+    </w:p>
+    <w:p>
+      <w:pPr>
+        <w:jc w:val="both"/>
+      </w:pPr>
+      <w:r>
+        <w:rPr>
+          <w:noProof/>
+        </w:rPr>
+        <w:drawing>
+          <wp:inline distT="0" distB="0" distL="0" distR="0" wp14:anchorId="106BDD94" wp14:editId="3B7AE177">
+            <wp:extent cx="6120130" cy="3323590"/>
+            <wp:effectExtent l="0" t="0" r="0" b="0"/>
+            <wp:docPr id="1903986388" name="Imagen 1"/>
+            <wp:cNvGraphicFramePr>
+              <a:graphicFrameLocks xmlns:a="http://schemas.openxmlformats.org/drawingml/2006/main" noChangeAspect="1"/>
+            </wp:cNvGraphicFramePr>
+            <a:graphic xmlns:a="http://schemas.openxmlformats.org/drawingml/2006/main">
+              <a:graphicData uri="http://schemas.openxmlformats.org/drawingml/2006/picture">
+                <pic:pic xmlns:pic="http://schemas.openxmlformats.org/drawingml/2006/picture">
+                  <pic:nvPicPr>
+                    <pic:cNvPr id="1903986388" name=""/>
                     <pic:cNvPicPr/>
                   </pic:nvPicPr>
                   <pic:blipFill>
@@ -15871,40 +16130,22 @@
       <w:pPr>
         <w:pStyle w:val="Descripcin"/>
       </w:pPr>
-      <w:bookmarkStart w:id="99" w:name="_Toc229696503"/>
+      <w:bookmarkStart w:id="106" w:name="_Toc229732658"/>
       <w:r>
         <w:t xml:space="preserve">Figura </w:t>
       </w:r>
-      <w:r>
-        <w:fldChar w:fldCharType="begin"/>
-      </w:r>
-      <w:r>
-        <w:instrText xml:space="preserve"> SEQ Figura \* ARABIC </w:instrText>
-      </w:r>
-      <w:r>
-        <w:fldChar w:fldCharType="separate"/>
-      </w:r>
-      <w:r>
-        <w:rPr>
-          <w:noProof/>
-        </w:rPr>
-        <w:t>15</w:t>
-      </w:r>
-      <w:r>
-        <w:rPr>
-          <w:noProof/>
-        </w:rPr>
-        <w:fldChar w:fldCharType="end"/>
-      </w:r>
-      <w:r>
-        <w:t>. Panel de administrador</w:t>
-      </w:r>
-      <w:bookmarkEnd w:id="99"/>
-    </w:p>
-    <w:p>
-      <w:pPr>
-        <w:jc w:val="both"/>
-      </w:pPr>
+      <w:fldSimple w:instr=" SEQ Figura \* ARABIC ">
+        <w:r>
+          <w:rPr>
+            <w:noProof/>
+          </w:rPr>
+          <w:t>16</w:t>
+        </w:r>
+      </w:fldSimple>
+      <w:r>
+        <w:t>. Panel de profesor</w:t>
+      </w:r>
+      <w:bookmarkEnd w:id="106"/>
     </w:p>
     <w:p>
       <w:pPr>
@@ -15915,112 +16156,7 @@
           <w:b/>
           <w:bCs/>
         </w:rPr>
-        <w:t>MenúProfesor</w:t>
-      </w:r>
-      <w:r>
-        <w:br/>
-        <w:t>Esta interfaz usa un BorderPane como contenedor base. La zona superior contiene el menú de navegación y la información del usuario. En el centro se organiza el contenido mediante un VBox con título, subtítulo y un GridPane de tarjetas funcionales. Cada tarjeta representa una sección del sistema mediante icono, texto principal y descripción. En la parte inferior aparece un pie de página integrado</w:t>
-      </w:r>
-      <w:r>
-        <w:t xml:space="preserve"> del componente ya creado</w:t>
-      </w:r>
-      <w:r>
-        <w:t>.</w:t>
-      </w:r>
-    </w:p>
-    <w:p>
-      <w:pPr>
-        <w:jc w:val="both"/>
-      </w:pPr>
-      <w:r>
-        <w:rPr>
-          <w:noProof/>
-        </w:rPr>
-        <w:drawing>
-          <wp:inline distT="0" distB="0" distL="0" distR="0" wp14:anchorId="106BDD94" wp14:editId="3B7AE177">
-            <wp:extent cx="6120130" cy="3323590"/>
-            <wp:effectExtent l="0" t="0" r="0" b="0"/>
-            <wp:docPr id="1903986388" name="Imagen 1"/>
-            <wp:cNvGraphicFramePr>
-              <a:graphicFrameLocks xmlns:a="http://schemas.openxmlformats.org/drawingml/2006/main" noChangeAspect="1"/>
-            </wp:cNvGraphicFramePr>
-            <a:graphic xmlns:a="http://schemas.openxmlformats.org/drawingml/2006/main">
-              <a:graphicData uri="http://schemas.openxmlformats.org/drawingml/2006/picture">
-                <pic:pic xmlns:pic="http://schemas.openxmlformats.org/drawingml/2006/picture">
-                  <pic:nvPicPr>
-                    <pic:cNvPr id="1903986388" name=""/>
-                    <pic:cNvPicPr/>
-                  </pic:nvPicPr>
-                  <pic:blipFill>
-                    <a:blip r:embed="rId31"/>
-                    <a:stretch>
-                      <a:fillRect/>
-                    </a:stretch>
-                  </pic:blipFill>
-                  <pic:spPr>
-                    <a:xfrm>
-                      <a:off x="0" y="0"/>
-                      <a:ext cx="6120130" cy="3323590"/>
-                    </a:xfrm>
-                    <a:prstGeom prst="rect">
-                      <a:avLst/>
-                    </a:prstGeom>
-                  </pic:spPr>
-                </pic:pic>
-              </a:graphicData>
-            </a:graphic>
-          </wp:inline>
-        </w:drawing>
-      </w:r>
-    </w:p>
-    <w:p>
-      <w:pPr>
-        <w:pStyle w:val="Descripcin"/>
-      </w:pPr>
-      <w:bookmarkStart w:id="100" w:name="_Toc229696504"/>
-      <w:r>
-        <w:t xml:space="preserve">Figura </w:t>
-      </w:r>
-      <w:r>
-        <w:fldChar w:fldCharType="begin"/>
-      </w:r>
-      <w:r>
-        <w:instrText xml:space="preserve"> SEQ Figura \* ARABIC </w:instrText>
-      </w:r>
-      <w:r>
-        <w:fldChar w:fldCharType="separate"/>
-      </w:r>
-      <w:r>
-        <w:rPr>
-          <w:noProof/>
-        </w:rPr>
-        <w:t>16</w:t>
-      </w:r>
-      <w:r>
-        <w:rPr>
-          <w:noProof/>
-        </w:rPr>
-        <w:fldChar w:fldCharType="end"/>
-      </w:r>
-      <w:r>
-        <w:t>. Panel de profesor</w:t>
-      </w:r>
-      <w:bookmarkEnd w:id="100"/>
-    </w:p>
-    <w:p>
-      <w:r>
-        <w:br w:type="page"/>
-      </w:r>
-    </w:p>
-    <w:p>
-      <w:pPr>
-        <w:jc w:val="both"/>
-      </w:pPr>
-      <w:r>
-        <w:rPr>
-          <w:b/>
-          <w:bCs/>
-        </w:rPr>
+        <w:lastRenderedPageBreak/>
         <w:t>MenúEstudiante</w:t>
       </w:r>
       <w:r>
@@ -16052,7 +16188,7 @@
                     <pic:cNvPicPr/>
                   </pic:nvPicPr>
                   <pic:blipFill>
-                    <a:blip r:embed="rId32"/>
+                    <a:blip r:embed="rId31"/>
                     <a:stretch>
                       <a:fillRect/>
                     </a:stretch>
@@ -16077,35 +16213,22 @@
       <w:pPr>
         <w:pStyle w:val="Descripcin"/>
       </w:pPr>
-      <w:bookmarkStart w:id="101" w:name="_Toc229696505"/>
+      <w:bookmarkStart w:id="107" w:name="_Toc229732659"/>
       <w:r>
         <w:t xml:space="preserve">Figura </w:t>
       </w:r>
-      <w:r>
-        <w:fldChar w:fldCharType="begin"/>
-      </w:r>
-      <w:r>
-        <w:instrText xml:space="preserve"> SEQ Figura \* ARABIC </w:instrText>
-      </w:r>
-      <w:r>
-        <w:fldChar w:fldCharType="separate"/>
-      </w:r>
-      <w:r>
-        <w:rPr>
-          <w:noProof/>
-        </w:rPr>
-        <w:t>17</w:t>
-      </w:r>
-      <w:r>
-        <w:rPr>
-          <w:noProof/>
-        </w:rPr>
-        <w:fldChar w:fldCharType="end"/>
-      </w:r>
+      <w:fldSimple w:instr=" SEQ Figura \* ARABIC ">
+        <w:r>
+          <w:rPr>
+            <w:noProof/>
+          </w:rPr>
+          <w:t>17</w:t>
+        </w:r>
+      </w:fldSimple>
       <w:r>
         <w:t>. Panel de estudiante</w:t>
       </w:r>
-      <w:bookmarkEnd w:id="101"/>
+      <w:bookmarkEnd w:id="107"/>
     </w:p>
     <w:p>
       <w:pPr>
@@ -16131,6 +16254,7 @@
         <w:rPr>
           <w:noProof/>
         </w:rPr>
+        <w:lastRenderedPageBreak/>
         <w:drawing>
           <wp:inline distT="0" distB="0" distL="0" distR="0" wp14:anchorId="3D15723A" wp14:editId="2AA1670B">
             <wp:extent cx="6120130" cy="3331210"/>
@@ -16147,7 +16271,7 @@
                     <pic:cNvPicPr/>
                   </pic:nvPicPr>
                   <pic:blipFill>
-                    <a:blip r:embed="rId33"/>
+                    <a:blip r:embed="rId32"/>
                     <a:stretch>
                       <a:fillRect/>
                     </a:stretch>
@@ -16172,35 +16296,22 @@
       <w:pPr>
         <w:pStyle w:val="Descripcin"/>
       </w:pPr>
-      <w:bookmarkStart w:id="102" w:name="_Toc229696506"/>
+      <w:bookmarkStart w:id="108" w:name="_Toc229732660"/>
       <w:r>
         <w:t xml:space="preserve">Figura </w:t>
       </w:r>
-      <w:r>
-        <w:fldChar w:fldCharType="begin"/>
-      </w:r>
-      <w:r>
-        <w:instrText xml:space="preserve"> SEQ Figura \* ARABIC </w:instrText>
-      </w:r>
-      <w:r>
-        <w:fldChar w:fldCharType="separate"/>
-      </w:r>
-      <w:r>
-        <w:rPr>
-          <w:noProof/>
-        </w:rPr>
-        <w:t>18</w:t>
-      </w:r>
-      <w:r>
-        <w:rPr>
-          <w:noProof/>
-        </w:rPr>
-        <w:fldChar w:fldCharType="end"/>
-      </w:r>
+      <w:fldSimple w:instr=" SEQ Figura \* ARABIC ">
+        <w:r>
+          <w:rPr>
+            <w:noProof/>
+          </w:rPr>
+          <w:t>18</w:t>
+        </w:r>
+      </w:fldSimple>
       <w:r>
         <w:t>. Panel de tutor de empresa</w:t>
       </w:r>
-      <w:bookmarkEnd w:id="102"/>
+      <w:bookmarkEnd w:id="108"/>
     </w:p>
     <w:p>
       <w:pPr>
@@ -16242,7 +16353,7 @@
                     <pic:cNvPicPr/>
                   </pic:nvPicPr>
                   <pic:blipFill>
-                    <a:blip r:embed="rId34"/>
+                    <a:blip r:embed="rId33"/>
                     <a:stretch>
                       <a:fillRect/>
                     </a:stretch>
@@ -16267,35 +16378,22 @@
       <w:pPr>
         <w:pStyle w:val="Descripcin"/>
       </w:pPr>
-      <w:bookmarkStart w:id="103" w:name="_Toc229696507"/>
+      <w:bookmarkStart w:id="109" w:name="_Toc229732661"/>
       <w:r>
         <w:t xml:space="preserve">Figura </w:t>
       </w:r>
-      <w:r>
-        <w:fldChar w:fldCharType="begin"/>
-      </w:r>
-      <w:r>
-        <w:instrText xml:space="preserve"> SEQ Figura \* ARABIC </w:instrText>
-      </w:r>
-      <w:r>
-        <w:fldChar w:fldCharType="separate"/>
-      </w:r>
-      <w:r>
-        <w:rPr>
-          <w:noProof/>
-        </w:rPr>
-        <w:t>19</w:t>
-      </w:r>
-      <w:r>
-        <w:rPr>
-          <w:noProof/>
-        </w:rPr>
-        <w:fldChar w:fldCharType="end"/>
-      </w:r>
+      <w:fldSimple w:instr=" SEQ Figura \* ARABIC ">
+        <w:r>
+          <w:rPr>
+            <w:noProof/>
+          </w:rPr>
+          <w:t>19</w:t>
+        </w:r>
+      </w:fldSimple>
       <w:r>
         <w:t>. Gestión de usuarios</w:t>
       </w:r>
-      <w:bookmarkEnd w:id="103"/>
+      <w:bookmarkEnd w:id="109"/>
     </w:p>
     <w:p>
       <w:pPr>
@@ -16310,7 +16408,11 @@
       </w:r>
       <w:r>
         <w:br/>
-        <w:t>La vista de empresas está construida con un BorderPane. La parte superior contiene el menú y la cabecera común. En la zona izquierda se encuentra el formulario de edición o creación de empresa, organizado con VBox y campos de texto. El centro contiene un TableView donde se listan las empresas registradas. En la parte inferior se añade el pie de página común</w:t>
+        <w:t xml:space="preserve">La vista de empresas está construida con un BorderPane. La parte superior contiene el menú y la </w:t>
+      </w:r>
+      <w:r>
+        <w:lastRenderedPageBreak/>
+        <w:t>cabecera común. En la zona izquierda se encuentra el formulario de edición o creación de empresa, organizado con VBox y campos de texto. El centro contiene un TableView donde se listan las empresas registradas. En la parte inferior se añade el pie de página común</w:t>
       </w:r>
       <w:r>
         <w:t>.</w:t>
@@ -16340,7 +16442,7 @@
                     <pic:cNvPicPr/>
                   </pic:nvPicPr>
                   <pic:blipFill>
-                    <a:blip r:embed="rId35"/>
+                    <a:blip r:embed="rId34"/>
                     <a:stretch>
                       <a:fillRect/>
                     </a:stretch>
@@ -16365,35 +16467,22 @@
       <w:pPr>
         <w:pStyle w:val="Descripcin"/>
       </w:pPr>
-      <w:bookmarkStart w:id="104" w:name="_Toc229696508"/>
+      <w:bookmarkStart w:id="110" w:name="_Toc229732662"/>
       <w:r>
         <w:t xml:space="preserve">Figura </w:t>
       </w:r>
-      <w:r>
-        <w:fldChar w:fldCharType="begin"/>
-      </w:r>
-      <w:r>
-        <w:instrText xml:space="preserve"> SEQ Figura \* ARABIC </w:instrText>
-      </w:r>
-      <w:r>
-        <w:fldChar w:fldCharType="separate"/>
-      </w:r>
-      <w:r>
-        <w:rPr>
-          <w:noProof/>
-        </w:rPr>
-        <w:t>20</w:t>
-      </w:r>
-      <w:r>
-        <w:rPr>
-          <w:noProof/>
-        </w:rPr>
-        <w:fldChar w:fldCharType="end"/>
-      </w:r>
+      <w:fldSimple w:instr=" SEQ Figura \* ARABIC ">
+        <w:r>
+          <w:rPr>
+            <w:noProof/>
+          </w:rPr>
+          <w:t>20</w:t>
+        </w:r>
+      </w:fldSimple>
       <w:r>
         <w:t>. Gestión de empresas</w:t>
       </w:r>
-      <w:bookmarkEnd w:id="104"/>
+      <w:bookmarkEnd w:id="110"/>
     </w:p>
     <w:p>
       <w:pPr>
@@ -16435,7 +16524,7 @@
                     <pic:cNvPicPr/>
                   </pic:nvPicPr>
                   <pic:blipFill>
-                    <a:blip r:embed="rId36"/>
+                    <a:blip r:embed="rId35"/>
                     <a:stretch>
                       <a:fillRect/>
                     </a:stretch>
@@ -16460,35 +16549,22 @@
       <w:pPr>
         <w:pStyle w:val="Descripcin"/>
       </w:pPr>
-      <w:bookmarkStart w:id="105" w:name="_Toc229696509"/>
+      <w:bookmarkStart w:id="111" w:name="_Toc229732663"/>
       <w:r>
         <w:t xml:space="preserve">Figura </w:t>
       </w:r>
-      <w:r>
-        <w:fldChar w:fldCharType="begin"/>
-      </w:r>
-      <w:r>
-        <w:instrText xml:space="preserve"> SEQ Figura \* ARABIC </w:instrText>
-      </w:r>
-      <w:r>
-        <w:fldChar w:fldCharType="separate"/>
-      </w:r>
-      <w:r>
-        <w:rPr>
-          <w:noProof/>
-        </w:rPr>
-        <w:t>21</w:t>
-      </w:r>
-      <w:r>
-        <w:rPr>
-          <w:noProof/>
-        </w:rPr>
-        <w:fldChar w:fldCharType="end"/>
-      </w:r>
+      <w:fldSimple w:instr=" SEQ Figura \* ARABIC ">
+        <w:r>
+          <w:rPr>
+            <w:noProof/>
+          </w:rPr>
+          <w:t>21</w:t>
+        </w:r>
+      </w:fldSimple>
       <w:r>
         <w:t>. Gestión de formación en empresa</w:t>
       </w:r>
-      <w:bookmarkEnd w:id="105"/>
+      <w:bookmarkEnd w:id="111"/>
     </w:p>
     <w:p>
       <w:pPr>
@@ -16535,7 +16611,7 @@
                     <pic:cNvPicPr/>
                   </pic:nvPicPr>
                   <pic:blipFill>
-                    <a:blip r:embed="rId37"/>
+                    <a:blip r:embed="rId36"/>
                     <a:stretch>
                       <a:fillRect/>
                     </a:stretch>
@@ -16560,35 +16636,22 @@
       <w:pPr>
         <w:pStyle w:val="Descripcin"/>
       </w:pPr>
-      <w:bookmarkStart w:id="106" w:name="_Toc229696510"/>
+      <w:bookmarkStart w:id="112" w:name="_Toc229732664"/>
       <w:r>
         <w:t xml:space="preserve">Figura </w:t>
       </w:r>
-      <w:r>
-        <w:fldChar w:fldCharType="begin"/>
-      </w:r>
-      <w:r>
-        <w:instrText xml:space="preserve"> SEQ Figura \* ARABIC </w:instrText>
-      </w:r>
-      <w:r>
-        <w:fldChar w:fldCharType="separate"/>
-      </w:r>
-      <w:r>
-        <w:rPr>
-          <w:noProof/>
-        </w:rPr>
-        <w:t>22</w:t>
-      </w:r>
-      <w:r>
-        <w:rPr>
-          <w:noProof/>
-        </w:rPr>
-        <w:fldChar w:fldCharType="end"/>
-      </w:r>
+      <w:fldSimple w:instr=" SEQ Figura \* ARABIC ">
+        <w:r>
+          <w:rPr>
+            <w:noProof/>
+          </w:rPr>
+          <w:t>22</w:t>
+        </w:r>
+      </w:fldSimple>
       <w:r>
         <w:t>. Vista de asignaciones</w:t>
       </w:r>
-      <w:bookmarkEnd w:id="106"/>
+      <w:bookmarkEnd w:id="112"/>
     </w:p>
     <w:p>
       <w:pPr>
@@ -16614,6 +16677,7 @@
         <w:rPr>
           <w:noProof/>
         </w:rPr>
+        <w:lastRenderedPageBreak/>
         <w:drawing>
           <wp:inline distT="0" distB="0" distL="0" distR="0" wp14:anchorId="5449CE22" wp14:editId="51C2C3FE">
             <wp:extent cx="6120130" cy="3322320"/>
@@ -16630,7 +16694,7 @@
                     <pic:cNvPicPr/>
                   </pic:nvPicPr>
                   <pic:blipFill>
-                    <a:blip r:embed="rId38"/>
+                    <a:blip r:embed="rId37"/>
                     <a:stretch>
                       <a:fillRect/>
                     </a:stretch>
@@ -16655,35 +16719,22 @@
       <w:pPr>
         <w:pStyle w:val="Descripcin"/>
       </w:pPr>
-      <w:bookmarkStart w:id="107" w:name="_Toc229696511"/>
+      <w:bookmarkStart w:id="113" w:name="_Toc229732665"/>
       <w:r>
         <w:t xml:space="preserve">Figura </w:t>
       </w:r>
-      <w:r>
-        <w:fldChar w:fldCharType="begin"/>
-      </w:r>
-      <w:r>
-        <w:instrText xml:space="preserve"> SEQ Figura \* ARABIC </w:instrText>
-      </w:r>
-      <w:r>
-        <w:fldChar w:fldCharType="separate"/>
-      </w:r>
-      <w:r>
-        <w:rPr>
-          <w:noProof/>
-        </w:rPr>
-        <w:t>23</w:t>
-      </w:r>
-      <w:r>
-        <w:rPr>
-          <w:noProof/>
-        </w:rPr>
-        <w:fldChar w:fldCharType="end"/>
-      </w:r>
+      <w:fldSimple w:instr=" SEQ Figura \* ARABIC ">
+        <w:r>
+          <w:rPr>
+            <w:noProof/>
+          </w:rPr>
+          <w:t>23</w:t>
+        </w:r>
+      </w:fldSimple>
       <w:r>
         <w:t>. Vista de evaluaciones</w:t>
       </w:r>
-      <w:bookmarkEnd w:id="107"/>
+      <w:bookmarkEnd w:id="113"/>
     </w:p>
     <w:p>
       <w:pPr>
@@ -16724,6 +16775,7 @@
         <w:rPr>
           <w:noProof/>
         </w:rPr>
+        <w:lastRenderedPageBreak/>
         <w:drawing>
           <wp:inline distT="0" distB="0" distL="0" distR="0" wp14:anchorId="6BC373C2" wp14:editId="3FB6473F">
             <wp:extent cx="6120130" cy="3320415"/>
@@ -16740,7 +16792,7 @@
                     <pic:cNvPicPr/>
                   </pic:nvPicPr>
                   <pic:blipFill>
-                    <a:blip r:embed="rId39"/>
+                    <a:blip r:embed="rId38"/>
                     <a:stretch>
                       <a:fillRect/>
                     </a:stretch>
@@ -16765,35 +16817,22 @@
       <w:pPr>
         <w:pStyle w:val="Descripcin"/>
       </w:pPr>
-      <w:bookmarkStart w:id="108" w:name="_Toc229696512"/>
+      <w:bookmarkStart w:id="114" w:name="_Toc229732666"/>
       <w:r>
         <w:t xml:space="preserve">Figura </w:t>
       </w:r>
-      <w:r>
-        <w:fldChar w:fldCharType="begin"/>
-      </w:r>
-      <w:r>
-        <w:instrText xml:space="preserve"> SEQ Figura \* ARABIC </w:instrText>
-      </w:r>
-      <w:r>
-        <w:fldChar w:fldCharType="separate"/>
-      </w:r>
-      <w:r>
-        <w:rPr>
-          <w:noProof/>
-        </w:rPr>
-        <w:t>24</w:t>
-      </w:r>
-      <w:r>
-        <w:rPr>
-          <w:noProof/>
-        </w:rPr>
-        <w:fldChar w:fldCharType="end"/>
-      </w:r>
+      <w:fldSimple w:instr=" SEQ Figura \* ARABIC ">
+        <w:r>
+          <w:rPr>
+            <w:noProof/>
+          </w:rPr>
+          <w:t>24</w:t>
+        </w:r>
+      </w:fldSimple>
       <w:r>
         <w:t>. Vista de asistencia</w:t>
       </w:r>
-      <w:bookmarkEnd w:id="108"/>
+      <w:bookmarkEnd w:id="114"/>
     </w:p>
     <w:p>
       <w:pPr>
@@ -16840,7 +16879,7 @@
                     <pic:cNvPicPr/>
                   </pic:nvPicPr>
                   <pic:blipFill>
-                    <a:blip r:embed="rId40"/>
+                    <a:blip r:embed="rId39"/>
                     <a:stretch>
                       <a:fillRect/>
                     </a:stretch>
@@ -16865,35 +16904,22 @@
       <w:pPr>
         <w:pStyle w:val="Descripcin"/>
       </w:pPr>
-      <w:bookmarkStart w:id="109" w:name="_Toc229696513"/>
+      <w:bookmarkStart w:id="115" w:name="_Toc229732667"/>
       <w:r>
         <w:t xml:space="preserve">Figura </w:t>
       </w:r>
-      <w:r>
-        <w:fldChar w:fldCharType="begin"/>
-      </w:r>
-      <w:r>
-        <w:instrText xml:space="preserve"> SEQ Figura \* ARABIC </w:instrText>
-      </w:r>
-      <w:r>
-        <w:fldChar w:fldCharType="separate"/>
-      </w:r>
-      <w:r>
-        <w:rPr>
-          <w:noProof/>
-        </w:rPr>
-        <w:t>25</w:t>
-      </w:r>
-      <w:r>
-        <w:rPr>
-          <w:noProof/>
-        </w:rPr>
-        <w:fldChar w:fldCharType="end"/>
-      </w:r>
+      <w:fldSimple w:instr=" SEQ Figura \* ARABIC ">
+        <w:r>
+          <w:rPr>
+            <w:noProof/>
+          </w:rPr>
+          <w:t>25</w:t>
+        </w:r>
+      </w:fldSimple>
       <w:r>
         <w:t>. Vista de documentos</w:t>
       </w:r>
-      <w:bookmarkEnd w:id="109"/>
+      <w:bookmarkEnd w:id="115"/>
     </w:p>
     <w:p>
       <w:pPr>
@@ -16909,6 +16935,7 @@
           <w:b/>
           <w:bCs/>
         </w:rPr>
+        <w:lastRenderedPageBreak/>
         <w:t>Tutores</w:t>
       </w:r>
       <w:r>
@@ -16940,7 +16967,7 @@
                     <pic:cNvPicPr/>
                   </pic:nvPicPr>
                   <pic:blipFill>
-                    <a:blip r:embed="rId41"/>
+                    <a:blip r:embed="rId40"/>
                     <a:stretch>
                       <a:fillRect/>
                     </a:stretch>
@@ -16965,35 +16992,22 @@
       <w:pPr>
         <w:pStyle w:val="Descripcin"/>
       </w:pPr>
-      <w:bookmarkStart w:id="110" w:name="_Toc229696514"/>
+      <w:bookmarkStart w:id="116" w:name="_Toc229732668"/>
       <w:r>
         <w:t xml:space="preserve">Figura </w:t>
       </w:r>
-      <w:r>
-        <w:fldChar w:fldCharType="begin"/>
-      </w:r>
-      <w:r>
-        <w:instrText xml:space="preserve"> SEQ Figura \* ARABIC </w:instrText>
-      </w:r>
-      <w:r>
-        <w:fldChar w:fldCharType="separate"/>
-      </w:r>
-      <w:r>
-        <w:rPr>
-          <w:noProof/>
-        </w:rPr>
-        <w:t>26</w:t>
-      </w:r>
-      <w:r>
-        <w:rPr>
-          <w:noProof/>
-        </w:rPr>
-        <w:fldChar w:fldCharType="end"/>
-      </w:r>
+      <w:fldSimple w:instr=" SEQ Figura \* ARABIC ">
+        <w:r>
+          <w:rPr>
+            <w:noProof/>
+          </w:rPr>
+          <w:t>26</w:t>
+        </w:r>
+      </w:fldSimple>
       <w:r>
         <w:t>. Vista de tutores</w:t>
       </w:r>
-      <w:bookmarkEnd w:id="110"/>
+      <w:bookmarkEnd w:id="116"/>
     </w:p>
     <w:p>
       <w:pPr>
@@ -17005,11 +17019,11 @@
         <w:pStyle w:val="Ttulo3"/>
         <w:ind w:firstLine="360"/>
       </w:pPr>
-      <w:bookmarkStart w:id="111" w:name="_Toc229696561"/>
+      <w:bookmarkStart w:id="117" w:name="_Toc229732715"/>
       <w:r>
         <w:t>10.1.8 COMPONENTE</w:t>
       </w:r>
-      <w:bookmarkEnd w:id="111"/>
+      <w:bookmarkEnd w:id="117"/>
     </w:p>
     <w:p>
       <w:pPr>
@@ -17046,7 +17060,7 @@
                     <pic:cNvPicPr/>
                   </pic:nvPicPr>
                   <pic:blipFill>
-                    <a:blip r:embed="rId42"/>
+                    <a:blip r:embed="rId41"/>
                     <a:stretch>
                       <a:fillRect/>
                     </a:stretch>
@@ -17077,44 +17091,32 @@
       <w:pPr>
         <w:pStyle w:val="Descripcin"/>
       </w:pPr>
-      <w:bookmarkStart w:id="112" w:name="_Toc229696515"/>
+      <w:bookmarkStart w:id="118" w:name="_Toc229732669"/>
       <w:r>
         <w:t xml:space="preserve">Figura </w:t>
       </w:r>
-      <w:r>
-        <w:fldChar w:fldCharType="begin"/>
-      </w:r>
-      <w:r>
-        <w:instrText xml:space="preserve"> SEQ Figura \* ARABIC </w:instrText>
-      </w:r>
-      <w:r>
-        <w:fldChar w:fldCharType="separate"/>
-      </w:r>
+      <w:fldSimple w:instr=" SEQ Figura \* ARABIC ">
+        <w:r>
+          <w:rPr>
+            <w:noProof/>
+          </w:rPr>
+          <w:t>27</w:t>
+        </w:r>
+      </w:fldSimple>
+      <w:r>
+        <w:t>. Archivo de la librería componentes-ui</w:t>
+      </w:r>
+      <w:bookmarkEnd w:id="118"/>
+    </w:p>
+    <w:p>
+      <w:pPr>
+        <w:jc w:val="both"/>
+      </w:pPr>
       <w:r>
         <w:rPr>
           <w:noProof/>
         </w:rPr>
-        <w:t>27</w:t>
-      </w:r>
-      <w:r>
-        <w:rPr>
-          <w:noProof/>
-        </w:rPr>
-        <w:fldChar w:fldCharType="end"/>
-      </w:r>
-      <w:r>
-        <w:t>. Archivo de la librería componentes-ui</w:t>
-      </w:r>
-      <w:bookmarkEnd w:id="112"/>
-    </w:p>
-    <w:p>
-      <w:pPr>
-        <w:jc w:val="both"/>
-      </w:pPr>
-      <w:r>
-        <w:rPr>
-          <w:noProof/>
-        </w:rPr>
+        <w:lastRenderedPageBreak/>
         <w:drawing>
           <wp:inline distT="0" distB="0" distL="0" distR="0" wp14:anchorId="28A5D58E" wp14:editId="0EFCED63">
             <wp:extent cx="6120130" cy="1104900"/>
@@ -17131,7 +17133,7 @@
                     <pic:cNvPicPr/>
                   </pic:nvPicPr>
                   <pic:blipFill>
-                    <a:blip r:embed="rId43"/>
+                    <a:blip r:embed="rId42"/>
                     <a:stretch>
                       <a:fillRect/>
                     </a:stretch>
@@ -17156,42 +17158,37 @@
       <w:pPr>
         <w:pStyle w:val="Descripcin"/>
       </w:pPr>
-      <w:bookmarkStart w:id="113" w:name="_Toc229696516"/>
+      <w:bookmarkStart w:id="119" w:name="_Toc229732670"/>
       <w:r>
         <w:t xml:space="preserve">Figura </w:t>
       </w:r>
-      <w:r>
-        <w:fldChar w:fldCharType="begin"/>
-      </w:r>
-      <w:r>
-        <w:instrText xml:space="preserve"> SEQ Figura \* ARABIC </w:instrText>
-      </w:r>
-      <w:r>
-        <w:fldChar w:fldCharType="separate"/>
-      </w:r>
-      <w:r>
-        <w:rPr>
-          <w:noProof/>
-        </w:rPr>
-        <w:t>28</w:t>
-      </w:r>
-      <w:r>
-        <w:rPr>
-          <w:noProof/>
-        </w:rPr>
-        <w:fldChar w:fldCharType="end"/>
-      </w:r>
+      <w:fldSimple w:instr=" SEQ Figura \* ARABIC ">
+        <w:r>
+          <w:rPr>
+            <w:noProof/>
+          </w:rPr>
+          <w:t>28</w:t>
+        </w:r>
+      </w:fldSimple>
       <w:r>
         <w:t>. Dependencia Maven de la librería componentes-ui</w:t>
       </w:r>
-      <w:bookmarkEnd w:id="113"/>
-    </w:p>
-    <w:p>
-      <w:pPr>
-        <w:jc w:val="both"/>
-      </w:pPr>
-      <w:r>
-        <w:t>Los componentes del JAR se integran en las vistas de la aplicación mediante la etiqueta fx:include. Esta etiqueta permite insertar un archivo FXML dentro de otro, por lo que la pantalla principal puede incorporar directamente la cabecera y el pie definidos en la librería.</w:t>
+      <w:bookmarkEnd w:id="119"/>
+    </w:p>
+    <w:p>
+      <w:pPr>
+        <w:jc w:val="both"/>
+      </w:pPr>
+      <w:r>
+        <w:t xml:space="preserve">Los componentes del JAR se integran en las vistas de la aplicación mediante la etiqueta </w:t>
+      </w:r>
+      <w:proofErr w:type="gramStart"/>
+      <w:r>
+        <w:t>fx:include</w:t>
+      </w:r>
+      <w:proofErr w:type="gramEnd"/>
+      <w:r>
+        <w:t>. Esta etiqueta permite insertar un archivo FXML dentro de otro, por lo que la pantalla principal puede incorporar directamente la cabecera y el pie definidos en la librería.</w:t>
       </w:r>
     </w:p>
     <w:p/>
@@ -17203,11 +17200,11 @@
           <w:numId w:val="3"/>
         </w:numPr>
       </w:pPr>
-      <w:bookmarkStart w:id="114" w:name="_Toc229696562"/>
+      <w:bookmarkStart w:id="120" w:name="_Toc229732716"/>
       <w:r>
         <w:t>MANUAL DE USUARIO</w:t>
       </w:r>
-      <w:bookmarkEnd w:id="114"/>
+      <w:bookmarkEnd w:id="120"/>
     </w:p>
     <w:p>
       <w:pPr>
@@ -17265,7 +17262,7 @@
                     <pic:cNvPicPr/>
                   </pic:nvPicPr>
                   <pic:blipFill>
-                    <a:blip r:embed="rId44"/>
+                    <a:blip r:embed="rId43"/>
                     <a:stretch>
                       <a:fillRect/>
                     </a:stretch>
@@ -17290,44 +17287,32 @@
       <w:pPr>
         <w:pStyle w:val="Descripcin"/>
       </w:pPr>
-      <w:bookmarkStart w:id="115" w:name="_Toc229696517"/>
+      <w:bookmarkStart w:id="121" w:name="_Toc229732671"/>
       <w:r>
         <w:t xml:space="preserve">Figura </w:t>
       </w:r>
-      <w:r>
-        <w:fldChar w:fldCharType="begin"/>
-      </w:r>
-      <w:r>
-        <w:instrText xml:space="preserve"> SEQ Figura \* ARABIC </w:instrText>
-      </w:r>
-      <w:r>
-        <w:fldChar w:fldCharType="separate"/>
-      </w:r>
+      <w:fldSimple w:instr=" SEQ Figura \* ARABIC ">
+        <w:r>
+          <w:rPr>
+            <w:noProof/>
+          </w:rPr>
+          <w:t>29</w:t>
+        </w:r>
+      </w:fldSimple>
+      <w:r>
+        <w:t>. Acceso a la ayuda desde el menú</w:t>
+      </w:r>
+      <w:bookmarkEnd w:id="121"/>
+    </w:p>
+    <w:p>
+      <w:pPr>
+        <w:jc w:val="both"/>
+      </w:pPr>
       <w:r>
         <w:rPr>
           <w:noProof/>
         </w:rPr>
-        <w:t>29</w:t>
-      </w:r>
-      <w:r>
-        <w:rPr>
-          <w:noProof/>
-        </w:rPr>
-        <w:fldChar w:fldCharType="end"/>
-      </w:r>
-      <w:r>
-        <w:t>. Acceso a la ayuda desde el menú</w:t>
-      </w:r>
-      <w:bookmarkEnd w:id="115"/>
-    </w:p>
-    <w:p>
-      <w:pPr>
-        <w:jc w:val="both"/>
-      </w:pPr>
-      <w:r>
-        <w:rPr>
-          <w:noProof/>
-        </w:rPr>
+        <w:lastRenderedPageBreak/>
         <w:drawing>
           <wp:inline distT="0" distB="0" distL="0" distR="0" wp14:anchorId="43274E01" wp14:editId="04D27286">
             <wp:extent cx="6120130" cy="5454015"/>
@@ -17344,7 +17329,7 @@
                     <pic:cNvPicPr/>
                   </pic:nvPicPr>
                   <pic:blipFill>
-                    <a:blip r:embed="rId45"/>
+                    <a:blip r:embed="rId44"/>
                     <a:stretch>
                       <a:fillRect/>
                     </a:stretch>
@@ -17369,35 +17354,22 @@
       <w:pPr>
         <w:pStyle w:val="Descripcin"/>
       </w:pPr>
-      <w:bookmarkStart w:id="116" w:name="_Toc229696518"/>
+      <w:bookmarkStart w:id="122" w:name="_Toc229732672"/>
       <w:r>
         <w:t xml:space="preserve">Figura </w:t>
       </w:r>
-      <w:r>
-        <w:fldChar w:fldCharType="begin"/>
-      </w:r>
-      <w:r>
-        <w:instrText xml:space="preserve"> SEQ Figura \* ARABIC </w:instrText>
-      </w:r>
-      <w:r>
-        <w:fldChar w:fldCharType="separate"/>
-      </w:r>
-      <w:r>
-        <w:rPr>
-          <w:noProof/>
-        </w:rPr>
-        <w:t>30</w:t>
-      </w:r>
-      <w:r>
-        <w:rPr>
-          <w:noProof/>
-        </w:rPr>
-        <w:fldChar w:fldCharType="end"/>
-      </w:r>
+      <w:fldSimple w:instr=" SEQ Figura \* ARABIC ">
+        <w:r>
+          <w:rPr>
+            <w:noProof/>
+          </w:rPr>
+          <w:t>30</w:t>
+        </w:r>
+      </w:fldSimple>
       <w:r>
         <w:t>. Ventana principal de ayuda</w:t>
       </w:r>
-      <w:bookmarkEnd w:id="116"/>
+      <w:bookmarkEnd w:id="122"/>
     </w:p>
     <w:p>
       <w:r>
@@ -17412,11 +17384,22 @@
           <w:numId w:val="2"/>
         </w:numPr>
       </w:pPr>
-      <w:bookmarkStart w:id="117" w:name="_Toc229696563"/>
-      <w:r>
+      <w:bookmarkStart w:id="123" w:name="_Toc229732717"/>
+      <w:r>
+        <w:lastRenderedPageBreak/>
         <w:t>WEBGRAFÍA Y FUENTES DE INFORMACIÓN</w:t>
       </w:r>
-      <w:bookmarkEnd w:id="117"/>
+      <w:bookmarkEnd w:id="123"/>
+    </w:p>
+    <w:p>
+      <w:hyperlink r:id="rId45" w:history="1">
+        <w:r>
+          <w:rPr>
+            <w:rStyle w:val="Hipervnculo"/>
+          </w:rPr>
+          <w:t>https://programmerclick.com/article/85921978/</w:t>
+        </w:r>
+      </w:hyperlink>
     </w:p>
     <w:p>
       <w:hyperlink r:id="rId46" w:history="1">
@@ -17424,7 +17407,7 @@
           <w:rPr>
             <w:rStyle w:val="Hipervnculo"/>
           </w:rPr>
-          <w:t>https://programmerclick.com/article/85921978/</w:t>
+          <w:t>https://www.geeksforgeeks.org/advance-java/spring/</w:t>
         </w:r>
       </w:hyperlink>
     </w:p>
@@ -17434,7 +17417,7 @@
           <w:rPr>
             <w:rStyle w:val="Hipervnculo"/>
           </w:rPr>
-          <w:t>https://www.geeksforgeeks.org/advance-java/spring/</w:t>
+          <w:t>https://openjfx.io/openjfx-docs/</w:t>
         </w:r>
       </w:hyperlink>
     </w:p>
@@ -17444,32 +17427,22 @@
           <w:rPr>
             <w:rStyle w:val="Hipervnculo"/>
           </w:rPr>
-          <w:t>https://openjfx.io/openjfx-docs/</w:t>
+          <w:t>https://www.chuidiang.org/java/herramientas/javahelp/ejemplo-javahelp.php</w:t>
         </w:r>
       </w:hyperlink>
     </w:p>
     <w:p>
-      <w:hyperlink r:id="rId49" w:history="1">
+      <w:hyperlink r:id="rId49" w:anchor="writing-tests" w:history="1">
         <w:r>
           <w:rPr>
             <w:rStyle w:val="Hipervnculo"/>
           </w:rPr>
-          <w:t>https://www.chuidiang.org/java/herramientas/javahelp/ejemplo-javahelp.php</w:t>
+          <w:t>https://junit.org/junit5/docs/current/user-guide/#writing-tests</w:t>
         </w:r>
       </w:hyperlink>
     </w:p>
     <w:p>
-      <w:hyperlink r:id="rId50" w:anchor="writing-tests" w:history="1">
-        <w:r>
-          <w:rPr>
-            <w:rStyle w:val="Hipervnculo"/>
-          </w:rPr>
-          <w:t>https://junit.org/junit5/docs/current/user-guide/#writing-tests</w:t>
-        </w:r>
-      </w:hyperlink>
-    </w:p>
-    <w:p>
-      <w:hyperlink r:id="rId51" w:history="1">
+      <w:hyperlink r:id="rId50" w:history="1">
         <w:r>
           <w:rPr>
             <w:rStyle w:val="Hipervnculo"/>
@@ -17480,7 +17453,7 @@
     </w:p>
     <w:p/>
     <w:sectPr>
-      <w:footerReference w:type="default" r:id="rId52"/>
+      <w:footerReference w:type="default" r:id="rId51"/>
       <w:pgSz w:w="11906" w:h="16838"/>
       <w:pgMar w:top="1134" w:right="1134" w:bottom="1418" w:left="1134" w:header="709" w:footer="709" w:gutter="0"/>
       <w:pgNumType w:start="1"/>
@@ -21965,13 +21938,18 @@
 </file>
 
 <file path=customXml/item1.xml><?xml version="1.0" encoding="utf-8"?>
+<?mso-contentType ?>
+<FormTemplates xmlns="http://schemas.microsoft.com/sharepoint/v3/contenttype/forms">
+  <Display>DocumentLibraryForm</Display>
+  <Edit>DocumentLibraryForm</Edit>
+  <New>DocumentLibraryForm</New>
+</FormTemplates>
+</file>
+
+<file path=customXml/item2.xml><?xml version="1.0" encoding="utf-8"?>
 <p:properties xmlns:p="http://schemas.microsoft.com/office/2006/metadata/properties" xmlns:xsi="http://www.w3.org/2001/XMLSchema-instance" xmlns:pc="http://schemas.microsoft.com/office/infopath/2007/PartnerControls">
   <documentManagement/>
 </p:properties>
-</file>
-
-<file path=customXml/item2.xml><?xml version="1.0" encoding="utf-8"?>
-<b:Sources xmlns:b="http://schemas.openxmlformats.org/officeDocument/2006/bibliography" xmlns="http://schemas.openxmlformats.org/officeDocument/2006/bibliography" SelectedStyle="\APASixthEditionOfficeOnline.xsl" StyleName="APA" Version="6"/>
 </file>
 
 <file path=customXml/item3.xml><?xml version="1.0" encoding="utf-8"?>
@@ -22113,27 +22091,22 @@
 </file>
 
 <file path=customXml/item4.xml><?xml version="1.0" encoding="utf-8"?>
-<?mso-contentType ?>
-<FormTemplates xmlns="http://schemas.microsoft.com/sharepoint/v3/contenttype/forms">
-  <Display>DocumentLibraryForm</Display>
-  <Edit>DocumentLibraryForm</Edit>
-  <New>DocumentLibraryForm</New>
-</FormTemplates>
+<b:Sources xmlns:b="http://schemas.openxmlformats.org/officeDocument/2006/bibliography" xmlns="http://schemas.openxmlformats.org/officeDocument/2006/bibliography" SelectedStyle="\APASixthEditionOfficeOnline.xsl" StyleName="APA" Version="6"/>
 </file>
 
 <file path=customXml/itemProps1.xml><?xml version="1.0" encoding="utf-8"?>
-<ds:datastoreItem xmlns:ds="http://schemas.openxmlformats.org/officeDocument/2006/customXml" ds:itemID="{7F0B1298-25D5-45B9-909D-DD837044A49E}">
+<ds:datastoreItem xmlns:ds="http://schemas.openxmlformats.org/officeDocument/2006/customXml" ds:itemID="{480B8420-1B48-4D23-8D6E-64373AC5070B}">
   <ds:schemaRefs>
-    <ds:schemaRef ds:uri="http://schemas.microsoft.com/office/2006/metadata/properties"/>
-    <ds:schemaRef ds:uri="http://schemas.microsoft.com/office/infopath/2007/PartnerControls"/>
+    <ds:schemaRef ds:uri="http://schemas.microsoft.com/sharepoint/v3/contenttype/forms"/>
   </ds:schemaRefs>
 </ds:datastoreItem>
 </file>
 
 <file path=customXml/itemProps2.xml><?xml version="1.0" encoding="utf-8"?>
-<ds:datastoreItem xmlns:ds="http://schemas.openxmlformats.org/officeDocument/2006/customXml" ds:itemID="{453714F8-FBC3-4DCC-8DCB-89BB58DCF76F}">
+<ds:datastoreItem xmlns:ds="http://schemas.openxmlformats.org/officeDocument/2006/customXml" ds:itemID="{7F0B1298-25D5-45B9-909D-DD837044A49E}">
   <ds:schemaRefs>
-    <ds:schemaRef ds:uri="http://schemas.openxmlformats.org/officeDocument/2006/bibliography"/>
+    <ds:schemaRef ds:uri="http://schemas.microsoft.com/office/2006/metadata/properties"/>
+    <ds:schemaRef ds:uri="http://schemas.microsoft.com/office/infopath/2007/PartnerControls"/>
   </ds:schemaRefs>
 </ds:datastoreItem>
 </file>
@@ -22157,9 +22130,9 @@
 </file>
 
 <file path=customXml/itemProps4.xml><?xml version="1.0" encoding="utf-8"?>
-<ds:datastoreItem xmlns:ds="http://schemas.openxmlformats.org/officeDocument/2006/customXml" ds:itemID="{480B8420-1B48-4D23-8D6E-64373AC5070B}">
+<ds:datastoreItem xmlns:ds="http://schemas.openxmlformats.org/officeDocument/2006/customXml" ds:itemID="{453714F8-FBC3-4DCC-8DCB-89BB58DCF76F}">
   <ds:schemaRefs>
-    <ds:schemaRef ds:uri="http://schemas.microsoft.com/sharepoint/v3/contenttype/forms"/>
+    <ds:schemaRef ds:uri="http://schemas.openxmlformats.org/officeDocument/2006/bibliography"/>
   </ds:schemaRefs>
 </ds:datastoreItem>
 </file>
</xml_diff>